<commit_message>
vault backup: 2026-02-04 21:01:50
</commit_message>
<xml_diff>
--- a/03_UNIVERSITY/03_AGF2/05_GLOBAL_HEALTH/Braxmeier.Andreas_AGF_WiSe25_26_Global_Health_Ausarbeitung_Widerstand_in_CHS.docx
+++ b/03_UNIVERSITY/03_AGF2/05_GLOBAL_HEALTH/Braxmeier.Andreas_AGF_WiSe25_26_Global_Health_Ausarbeitung_Widerstand_in_CHS.docx
@@ -242,7 +242,25 @@
           <w:sz w:val="36"/>
           <w:szCs w:val="36"/>
         </w:rPr>
-        <w:t>Eine Analyse des „Lack of Fit“ zwischen Systemlogik und Lebenswelt am Beispiel der Moskitonetz-Intervention in Uganda</w:t>
+        <w:t xml:space="preserve">Eine Analyse des „Lack </w:t>
+      </w:r>
+      <w:proofErr w:type="spellStart"/>
+      <w:r>
+        <w:rPr>
+          <w:rFonts w:ascii="Arial" w:eastAsia="Arial" w:hAnsi="Arial" w:cs="Arial"/>
+          <w:sz w:val="36"/>
+          <w:szCs w:val="36"/>
+        </w:rPr>
+        <w:t>of</w:t>
+      </w:r>
+      <w:proofErr w:type="spellEnd"/>
+      <w:r>
+        <w:rPr>
+          <w:rFonts w:ascii="Arial" w:eastAsia="Arial" w:hAnsi="Arial" w:cs="Arial"/>
+          <w:sz w:val="36"/>
+          <w:szCs w:val="36"/>
+        </w:rPr>
+        <w:t xml:space="preserve"> Fit“ zwischen Systemlogik und Lebenswelt am Beispiel der Moskitonetz-Intervention in Uganda</w:t>
       </w:r>
     </w:p>
     <w:p>
@@ -433,7 +451,7 @@
           <w:r>
             <w:fldChar w:fldCharType="separate"/>
           </w:r>
-          <w:hyperlink w:anchor="_Toc221111851" w:history="1">
+          <w:hyperlink w:anchor="_Toc221120187" w:history="1">
             <w:r>
               <w:rPr>
                 <w:rStyle w:val="Hyperlink"/>
@@ -460,7 +478,7 @@
                 <w:noProof/>
                 <w:webHidden/>
               </w:rPr>
-              <w:instrText xml:space="preserve"> PAGEREF _Toc221111851 \h </w:instrText>
+              <w:instrText xml:space="preserve"> PAGEREF _Toc221120187 \h </w:instrText>
             </w:r>
             <w:r>
               <w:rPr>
@@ -505,7 +523,7 @@
               <w14:ligatures w14:val="standardContextual"/>
             </w:rPr>
           </w:pPr>
-          <w:hyperlink w:anchor="_Toc221111852" w:history="1">
+          <w:hyperlink w:anchor="_Toc221120188" w:history="1">
             <w:r>
               <w:rPr>
                 <w:rStyle w:val="Hyperlink"/>
@@ -532,7 +550,7 @@
                 <w:noProof/>
                 <w:webHidden/>
               </w:rPr>
-              <w:instrText xml:space="preserve"> PAGEREF _Toc221111852 \h </w:instrText>
+              <w:instrText xml:space="preserve"> PAGEREF _Toc221120188 \h </w:instrText>
             </w:r>
             <w:r>
               <w:rPr>
@@ -577,11 +595,10 @@
               <w14:ligatures w14:val="standardContextual"/>
             </w:rPr>
           </w:pPr>
-          <w:hyperlink w:anchor="_Toc221111853" w:history="1">
+          <w:hyperlink w:anchor="_Toc221120189" w:history="1">
             <w:r>
               <w:rPr>
                 <w:rStyle w:val="Hyperlink"/>
-                <w:rFonts w:ascii="Arial" w:hAnsi="Arial" w:cs="Arial"/>
                 <w:noProof/>
               </w:rPr>
               <w:t>1.2 Forschungsfrage und Zielsetzung der Arbeit</w:t>
@@ -605,7 +622,7 @@
                 <w:noProof/>
                 <w:webHidden/>
               </w:rPr>
-              <w:instrText xml:space="preserve"> PAGEREF _Toc221111853 \h </w:instrText>
+              <w:instrText xml:space="preserve"> PAGEREF _Toc221120189 \h </w:instrText>
             </w:r>
             <w:r>
               <w:rPr>
@@ -650,7 +667,7 @@
               <w14:ligatures w14:val="standardContextual"/>
             </w:rPr>
           </w:pPr>
-          <w:hyperlink w:anchor="_Toc221111854" w:history="1">
+          <w:hyperlink w:anchor="_Toc221120190" w:history="1">
             <w:r>
               <w:rPr>
                 <w:rStyle w:val="Hyperlink"/>
@@ -677,7 +694,7 @@
                 <w:noProof/>
                 <w:webHidden/>
               </w:rPr>
-              <w:instrText xml:space="preserve"> PAGEREF _Toc221111854 \h </w:instrText>
+              <w:instrText xml:space="preserve"> PAGEREF _Toc221120190 \h </w:instrText>
             </w:r>
             <w:r>
               <w:rPr>
@@ -723,7 +740,7 @@
               <w14:ligatures w14:val="standardContextual"/>
             </w:rPr>
           </w:pPr>
-          <w:hyperlink w:anchor="_Toc221111855" w:history="1">
+          <w:hyperlink w:anchor="_Toc221120191" w:history="1">
             <w:r>
               <w:rPr>
                 <w:rStyle w:val="Hyperlink"/>
@@ -750,7 +767,7 @@
                 <w:noProof/>
                 <w:webHidden/>
               </w:rPr>
-              <w:instrText xml:space="preserve"> PAGEREF _Toc221111855 \h </w:instrText>
+              <w:instrText xml:space="preserve"> PAGEREF _Toc221120191 \h </w:instrText>
             </w:r>
             <w:r>
               <w:rPr>
@@ -795,7 +812,7 @@
               <w14:ligatures w14:val="standardContextual"/>
             </w:rPr>
           </w:pPr>
-          <w:hyperlink w:anchor="_Toc221111856" w:history="1">
+          <w:hyperlink w:anchor="_Toc221120192" w:history="1">
             <w:r>
               <w:rPr>
                 <w:rStyle w:val="Hyperlink"/>
@@ -822,7 +839,7 @@
                 <w:noProof/>
                 <w:webHidden/>
               </w:rPr>
-              <w:instrText xml:space="preserve"> PAGEREF _Toc221111856 \h </w:instrText>
+              <w:instrText xml:space="preserve"> PAGEREF _Toc221120192 \h </w:instrText>
             </w:r>
             <w:r>
               <w:rPr>
@@ -867,7 +884,7 @@
               <w14:ligatures w14:val="standardContextual"/>
             </w:rPr>
           </w:pPr>
-          <w:hyperlink w:anchor="_Toc221111857" w:history="1">
+          <w:hyperlink w:anchor="_Toc221120193" w:history="1">
             <w:r>
               <w:rPr>
                 <w:rStyle w:val="Hyperlink"/>
@@ -894,7 +911,7 @@
                 <w:noProof/>
                 <w:webHidden/>
               </w:rPr>
-              <w:instrText xml:space="preserve"> PAGEREF _Toc221111857 \h </w:instrText>
+              <w:instrText xml:space="preserve"> PAGEREF _Toc221120193 \h </w:instrText>
             </w:r>
             <w:r>
               <w:rPr>
@@ -939,7 +956,7 @@
               <w14:ligatures w14:val="standardContextual"/>
             </w:rPr>
           </w:pPr>
-          <w:hyperlink w:anchor="_Toc221111858" w:history="1">
+          <w:hyperlink w:anchor="_Toc221120194" w:history="1">
             <w:r>
               <w:rPr>
                 <w:rStyle w:val="Hyperlink"/>
@@ -966,7 +983,7 @@
                 <w:noProof/>
                 <w:webHidden/>
               </w:rPr>
-              <w:instrText xml:space="preserve"> PAGEREF _Toc221111858 \h </w:instrText>
+              <w:instrText xml:space="preserve"> PAGEREF _Toc221120194 \h </w:instrText>
             </w:r>
             <w:r>
               <w:rPr>
@@ -1012,11 +1029,12 @@
               <w14:ligatures w14:val="standardContextual"/>
             </w:rPr>
           </w:pPr>
-          <w:hyperlink w:anchor="_Toc221111859" w:history="1">
+          <w:hyperlink w:anchor="_Toc221120195" w:history="1">
             <w:r>
               <w:rPr>
                 <w:rStyle w:val="Hyperlink"/>
                 <w:noProof/>
+                <w:lang w:val="en-US"/>
               </w:rPr>
               <w:t>3. Machtasymmetrien in CHS</w:t>
             </w:r>
@@ -1039,7 +1057,7 @@
                 <w:noProof/>
                 <w:webHidden/>
               </w:rPr>
-              <w:instrText xml:space="preserve"> PAGEREF _Toc221111859 \h </w:instrText>
+              <w:instrText xml:space="preserve"> PAGEREF _Toc221120195 \h </w:instrText>
             </w:r>
             <w:r>
               <w:rPr>
@@ -1084,11 +1102,12 @@
               <w14:ligatures w14:val="standardContextual"/>
             </w:rPr>
           </w:pPr>
-          <w:hyperlink w:anchor="_Toc221111860" w:history="1">
+          <w:hyperlink w:anchor="_Toc221120196" w:history="1">
             <w:r>
               <w:rPr>
                 <w:rStyle w:val="Hyperlink"/>
                 <w:noProof/>
+                <w:lang w:val="en-US"/>
               </w:rPr>
               <w:t>3.1 Agents of Care vs. Agents of the State</w:t>
             </w:r>
@@ -1111,7 +1130,7 @@
                 <w:noProof/>
                 <w:webHidden/>
               </w:rPr>
-              <w:instrText xml:space="preserve"> PAGEREF _Toc221111860 \h </w:instrText>
+              <w:instrText xml:space="preserve"> PAGEREF _Toc221120196 \h </w:instrText>
             </w:r>
             <w:r>
               <w:rPr>
@@ -1156,7 +1175,7 @@
               <w14:ligatures w14:val="standardContextual"/>
             </w:rPr>
           </w:pPr>
-          <w:hyperlink w:anchor="_Toc221111861" w:history="1">
+          <w:hyperlink w:anchor="_Toc221120197" w:history="1">
             <w:r>
               <w:rPr>
                 <w:rStyle w:val="Hyperlink"/>
@@ -1183,7 +1202,7 @@
                 <w:noProof/>
                 <w:webHidden/>
               </w:rPr>
-              <w:instrText xml:space="preserve"> PAGEREF _Toc221111861 \h </w:instrText>
+              <w:instrText xml:space="preserve"> PAGEREF _Toc221120197 \h </w:instrText>
             </w:r>
             <w:r>
               <w:rPr>
@@ -1228,7 +1247,7 @@
               <w14:ligatures w14:val="standardContextual"/>
             </w:rPr>
           </w:pPr>
-          <w:hyperlink w:anchor="_Toc221111862" w:history="1">
+          <w:hyperlink w:anchor="_Toc221120198" w:history="1">
             <w:r>
               <w:rPr>
                 <w:rStyle w:val="Hyperlink"/>
@@ -1255,7 +1274,7 @@
                 <w:noProof/>
                 <w:webHidden/>
               </w:rPr>
-              <w:instrText xml:space="preserve"> PAGEREF _Toc221111862 \h </w:instrText>
+              <w:instrText xml:space="preserve"> PAGEREF _Toc221120198 \h </w:instrText>
             </w:r>
             <w:r>
               <w:rPr>
@@ -1301,7 +1320,7 @@
               <w14:ligatures w14:val="standardContextual"/>
             </w:rPr>
           </w:pPr>
-          <w:hyperlink w:anchor="_Toc221111863" w:history="1">
+          <w:hyperlink w:anchor="_Toc221120199" w:history="1">
             <w:r>
               <w:rPr>
                 <w:rStyle w:val="Hyperlink"/>
@@ -1328,7 +1347,7 @@
                 <w:noProof/>
                 <w:webHidden/>
               </w:rPr>
-              <w:instrText xml:space="preserve"> PAGEREF _Toc221111863 \h </w:instrText>
+              <w:instrText xml:space="preserve"> PAGEREF _Toc221120199 \h </w:instrText>
             </w:r>
             <w:r>
               <w:rPr>
@@ -1373,7 +1392,7 @@
               <w14:ligatures w14:val="standardContextual"/>
             </w:rPr>
           </w:pPr>
-          <w:hyperlink w:anchor="_Toc221111864" w:history="1">
+          <w:hyperlink w:anchor="_Toc221120200" w:history="1">
             <w:r>
               <w:rPr>
                 <w:rStyle w:val="Hyperlink"/>
@@ -1400,7 +1419,7 @@
                 <w:noProof/>
                 <w:webHidden/>
               </w:rPr>
-              <w:instrText xml:space="preserve"> PAGEREF _Toc221111864 \h </w:instrText>
+              <w:instrText xml:space="preserve"> PAGEREF _Toc221120200 \h </w:instrText>
             </w:r>
             <w:r>
               <w:rPr>
@@ -1445,7 +1464,7 @@
               <w14:ligatures w14:val="standardContextual"/>
             </w:rPr>
           </w:pPr>
-          <w:hyperlink w:anchor="_Toc221111865" w:history="1">
+          <w:hyperlink w:anchor="_Toc221120201" w:history="1">
             <w:r>
               <w:rPr>
                 <w:rStyle w:val="Hyperlink"/>
@@ -1472,7 +1491,7 @@
                 <w:noProof/>
                 <w:webHidden/>
               </w:rPr>
-              <w:instrText xml:space="preserve"> PAGEREF _Toc221111865 \h </w:instrText>
+              <w:instrText xml:space="preserve"> PAGEREF _Toc221120201 \h </w:instrText>
             </w:r>
             <w:r>
               <w:rPr>
@@ -1517,11 +1536,10 @@
               <w14:ligatures w14:val="standardContextual"/>
             </w:rPr>
           </w:pPr>
-          <w:hyperlink w:anchor="_Toc221111866" w:history="1">
+          <w:hyperlink w:anchor="_Toc221120202" w:history="1">
             <w:r>
               <w:rPr>
                 <w:rStyle w:val="Hyperlink"/>
-                <w:rFonts w:ascii="Arial" w:hAnsi="Arial" w:cs="Arial"/>
                 <w:noProof/>
               </w:rPr>
               <w:t>4.3 Statistische Evidenz (Mahmoodi et al. 2023)</w:t>
@@ -1545,7 +1563,7 @@
                 <w:noProof/>
                 <w:webHidden/>
               </w:rPr>
-              <w:instrText xml:space="preserve"> PAGEREF _Toc221111866 \h </w:instrText>
+              <w:instrText xml:space="preserve"> PAGEREF _Toc221120202 \h </w:instrText>
             </w:r>
             <w:r>
               <w:rPr>
@@ -1591,7 +1609,7 @@
               <w14:ligatures w14:val="standardContextual"/>
             </w:rPr>
           </w:pPr>
-          <w:hyperlink w:anchor="_Toc221111867" w:history="1">
+          <w:hyperlink w:anchor="_Toc221120203" w:history="1">
             <w:r>
               <w:rPr>
                 <w:rStyle w:val="Hyperlink"/>
@@ -1618,7 +1636,7 @@
                 <w:noProof/>
                 <w:webHidden/>
               </w:rPr>
-              <w:instrText xml:space="preserve"> PAGEREF _Toc221111867 \h </w:instrText>
+              <w:instrText xml:space="preserve"> PAGEREF _Toc221120203 \h </w:instrText>
             </w:r>
             <w:r>
               <w:rPr>
@@ -1663,7 +1681,7 @@
               <w14:ligatures w14:val="standardContextual"/>
             </w:rPr>
           </w:pPr>
-          <w:hyperlink w:anchor="_Toc221111868" w:history="1">
+          <w:hyperlink w:anchor="_Toc221120204" w:history="1">
             <w:r>
               <w:rPr>
                 <w:rStyle w:val="Hyperlink"/>
@@ -1690,7 +1708,7 @@
                 <w:noProof/>
                 <w:webHidden/>
               </w:rPr>
-              <w:instrText xml:space="preserve"> PAGEREF _Toc221111868 \h </w:instrText>
+              <w:instrText xml:space="preserve"> PAGEREF _Toc221120204 \h </w:instrText>
             </w:r>
             <w:r>
               <w:rPr>
@@ -1735,11 +1753,10 @@
               <w14:ligatures w14:val="standardContextual"/>
             </w:rPr>
           </w:pPr>
-          <w:hyperlink w:anchor="_Toc221111869" w:history="1">
+          <w:hyperlink w:anchor="_Toc221120205" w:history="1">
             <w:r>
               <w:rPr>
                 <w:rStyle w:val="Hyperlink"/>
-                <w:rFonts w:ascii="Arial" w:hAnsi="Arial" w:cs="Arial"/>
                 <w:noProof/>
               </w:rPr>
               <w:t>5.2 Der „Lack of Fit“: Taktische Repolitisierung von Ressourcen</w:t>
@@ -1763,7 +1780,7 @@
                 <w:noProof/>
                 <w:webHidden/>
               </w:rPr>
-              <w:instrText xml:space="preserve"> PAGEREF _Toc221111869 \h </w:instrText>
+              <w:instrText xml:space="preserve"> PAGEREF _Toc221120205 \h </w:instrText>
             </w:r>
             <w:r>
               <w:rPr>
@@ -1809,7 +1826,7 @@
               <w14:ligatures w14:val="standardContextual"/>
             </w:rPr>
           </w:pPr>
-          <w:hyperlink w:anchor="_Toc221111870" w:history="1">
+          <w:hyperlink w:anchor="_Toc221120206" w:history="1">
             <w:r>
               <w:rPr>
                 <w:rStyle w:val="Hyperlink"/>
@@ -1836,7 +1853,7 @@
                 <w:noProof/>
                 <w:webHidden/>
               </w:rPr>
-              <w:instrText xml:space="preserve"> PAGEREF _Toc221111870 \h </w:instrText>
+              <w:instrText xml:space="preserve"> PAGEREF _Toc221120206 \h </w:instrText>
             </w:r>
             <w:r>
               <w:rPr>
@@ -1881,7 +1898,7 @@
               <w14:ligatures w14:val="standardContextual"/>
             </w:rPr>
           </w:pPr>
-          <w:hyperlink w:anchor="_Toc221111871" w:history="1">
+          <w:hyperlink w:anchor="_Toc221120207" w:history="1">
             <w:r>
               <w:rPr>
                 <w:rStyle w:val="Hyperlink"/>
@@ -1908,7 +1925,7 @@
                 <w:noProof/>
                 <w:webHidden/>
               </w:rPr>
-              <w:instrText xml:space="preserve"> PAGEREF _Toc221111871 \h </w:instrText>
+              <w:instrText xml:space="preserve"> PAGEREF _Toc221120207 \h </w:instrText>
             </w:r>
             <w:r>
               <w:rPr>
@@ -1953,7 +1970,7 @@
               <w14:ligatures w14:val="standardContextual"/>
             </w:rPr>
           </w:pPr>
-          <w:hyperlink w:anchor="_Toc221111872" w:history="1">
+          <w:hyperlink w:anchor="_Toc221120208" w:history="1">
             <w:r>
               <w:rPr>
                 <w:rStyle w:val="Hyperlink"/>
@@ -1980,7 +1997,7 @@
                 <w:noProof/>
                 <w:webHidden/>
               </w:rPr>
-              <w:instrText xml:space="preserve"> PAGEREF _Toc221111872 \h </w:instrText>
+              <w:instrText xml:space="preserve"> PAGEREF _Toc221120208 \h </w:instrText>
             </w:r>
             <w:r>
               <w:rPr>
@@ -2026,7 +2043,7 @@
               <w14:ligatures w14:val="standardContextual"/>
             </w:rPr>
           </w:pPr>
-          <w:hyperlink w:anchor="_Toc221111873" w:history="1">
+          <w:hyperlink w:anchor="_Toc221120209" w:history="1">
             <w:r>
               <w:rPr>
                 <w:rStyle w:val="Hyperlink"/>
@@ -2053,7 +2070,7 @@
                 <w:noProof/>
                 <w:webHidden/>
               </w:rPr>
-              <w:instrText xml:space="preserve"> PAGEREF _Toc221111873 \h </w:instrText>
+              <w:instrText xml:space="preserve"> PAGEREF _Toc221120209 \h </w:instrText>
             </w:r>
             <w:r>
               <w:rPr>
@@ -2099,7 +2116,7 @@
               <w14:ligatures w14:val="standardContextual"/>
             </w:rPr>
           </w:pPr>
-          <w:hyperlink w:anchor="_Toc221111874" w:history="1">
+          <w:hyperlink w:anchor="_Toc221120210" w:history="1">
             <w:r>
               <w:rPr>
                 <w:rStyle w:val="Hyperlink"/>
@@ -2126,7 +2143,7 @@
                 <w:noProof/>
                 <w:webHidden/>
               </w:rPr>
-              <w:instrText xml:space="preserve"> PAGEREF _Toc221111874 \h </w:instrText>
+              <w:instrText xml:space="preserve"> PAGEREF _Toc221120210 \h </w:instrText>
             </w:r>
             <w:r>
               <w:rPr>
@@ -2171,7 +2188,7 @@
               <w14:ligatures w14:val="standardContextual"/>
             </w:rPr>
           </w:pPr>
-          <w:hyperlink w:anchor="_Toc221111875" w:history="1">
+          <w:hyperlink w:anchor="_Toc221120211" w:history="1">
             <w:r>
               <w:rPr>
                 <w:rStyle w:val="Hyperlink"/>
@@ -2198,7 +2215,7 @@
                 <w:noProof/>
                 <w:webHidden/>
               </w:rPr>
-              <w:instrText xml:space="preserve"> PAGEREF _Toc221111875 \h </w:instrText>
+              <w:instrText xml:space="preserve"> PAGEREF _Toc221120211 \h </w:instrText>
             </w:r>
             <w:r>
               <w:rPr>
@@ -2243,7 +2260,7 @@
               <w14:ligatures w14:val="standardContextual"/>
             </w:rPr>
           </w:pPr>
-          <w:hyperlink w:anchor="_Toc221111876" w:history="1">
+          <w:hyperlink w:anchor="_Toc221120212" w:history="1">
             <w:r>
               <w:rPr>
                 <w:rStyle w:val="Hyperlink"/>
@@ -2270,7 +2287,7 @@
                 <w:noProof/>
                 <w:webHidden/>
               </w:rPr>
-              <w:instrText xml:space="preserve"> PAGEREF _Toc221111876 \h </w:instrText>
+              <w:instrText xml:space="preserve"> PAGEREF _Toc221120212 \h </w:instrText>
             </w:r>
             <w:r>
               <w:rPr>
@@ -2316,7 +2333,7 @@
               <w14:ligatures w14:val="standardContextual"/>
             </w:rPr>
           </w:pPr>
-          <w:hyperlink w:anchor="_Toc221111877" w:history="1">
+          <w:hyperlink w:anchor="_Toc221120213" w:history="1">
             <w:r>
               <w:rPr>
                 <w:rStyle w:val="Hyperlink"/>
@@ -2343,7 +2360,7 @@
                 <w:noProof/>
                 <w:webHidden/>
               </w:rPr>
-              <w:instrText xml:space="preserve"> PAGEREF _Toc221111877 \h </w:instrText>
+              <w:instrText xml:space="preserve"> PAGEREF _Toc221120213 \h </w:instrText>
             </w:r>
             <w:r>
               <w:rPr>
@@ -2405,7 +2422,7 @@
       <w:pPr>
         <w:pStyle w:val="berschrift1"/>
       </w:pPr>
-      <w:bookmarkStart w:id="1" w:name="_Toc221111851"/>
+      <w:bookmarkStart w:id="1" w:name="_Toc221120187"/>
       <w:r>
         <w:lastRenderedPageBreak/>
         <w:t xml:space="preserve">1. </w:t>
@@ -2421,7 +2438,7 @@
         <w:spacing w:line="480" w:lineRule="auto"/>
       </w:pPr>
       <w:bookmarkStart w:id="2" w:name="X318c07f075fb1c24cd28df8f396b664d1c04bfa"/>
-      <w:bookmarkStart w:id="3" w:name="_Toc221111852"/>
+      <w:bookmarkStart w:id="3" w:name="_Toc221120188"/>
       <w:r>
         <w:t>1.1 Problemstellung und Relevanz im Global Health Diskurs</w:t>
       </w:r>
@@ -2442,47 +2459,31 @@
           <w:rFonts w:ascii="Arial" w:hAnsi="Arial" w:cs="Arial"/>
           <w:lang w:val="de-DE"/>
         </w:rPr>
-        <w:t>Die globale Gesundheitsarchitektur des 21. Jahrhunderts offenbart eine fundamentale Diskrepanz, welche die Effektivität internationaler Interventionen zunehmend infrage stellt. Während die biomedizinische Forschung hocheffektive Lösungen wie Vakzine oder präventive Technologien (z.B. ITNs) bereitstellt, versanden diese Programme oft auf der „letzten Meile“ der Implementierung. Dieses „Implementation Gap“ wird im klassischen Public-Health-Diskurs häufig einseitig als Problem der Zielpopulation gerahmt. Unter dem Label der „Non-Compliance“ wird Gemeinschaften unterstellt, sie seien unzureichend informiert oder handelten aufgrund kultureller Voreingenommenheit irrational.</w:t>
-      </w:r>
-    </w:p>
-    <w:p>
-      <w:pPr>
-        <w:pStyle w:val="Textkrper"/>
-        <w:spacing w:line="480" w:lineRule="auto"/>
-        <w:jc w:val="both"/>
+        <w:t>Die</w:t>
+      </w:r>
+      <w:r>
         <w:rPr>
           <w:rFonts w:ascii="Arial" w:hAnsi="Arial" w:cs="Arial"/>
           <w:lang w:val="de-DE"/>
         </w:rPr>
-      </w:pPr>
+        <w:t xml:space="preserve"> </w:t>
+      </w:r>
       <w:r>
         <w:rPr>
           <w:rFonts w:ascii="Arial" w:hAnsi="Arial" w:cs="Arial"/>
           <w:lang w:val="de-DE"/>
         </w:rPr>
-        <w:t>Diese paternalistische Sichtweise entlastet zwar die Programmentwickler, verkennt jedoch die strukturellen Machtasymmetrien und sozioökonomischen Realitäten, in denen Widerstand entsteht. Werden Gesundheitsprogramme lediglich als logistische Operationen begriffen, bleiben die soziopolitischen Ursachen von Ablehnung unsichtbar. Angesichts massiver Investitionen in globale Gesundheitsfonds ist das Verständnis dieser Widerstandsphänomene eine Voraussetzung für die ethische Legitimation von Community Health Systems (CHS).</w:t>
+        <w:t>globale Gesundheitsarchitektur des 21. Jahrhunderts steht vor einem Paradoxon: Während die biomedizinische Forschung hocheffiziente Technologien wie Vakzine oder insektizid-imprägnierte Netze (ITNs) bereitstellt, scheitern diese Interventionen signifikant oft auf der „letzten Meile“. Dieses „Implementation Gap“ wird im dominanten Diskurs häufig als Defizit der Zielpopulation gerahmt. Unter dem Label der „Non-Compliance“ wird Gemeinschaften Irrationalität oder mangelnde Aufklärung attestiert – eine paternalistische Perspektive, die strukturelle Machtasymmetrien verschleiert. Wenn Gesundheitsprogramme lediglich als logistische Operationen begriffen werden, bleiben die soziopolitischen Ursachen von Ablehnung unsichtbar. Angesichts der massiven Investitionen globaler Gesundheitsfonds ist die Analyse dieser Widerstandsphänomene keine akademische Fingerübung, sondern eine ethische und ökonomische Notwendigkeit für die Legitimation von Community Health Systems (CHS).</w:t>
       </w:r>
     </w:p>
     <w:p>
       <w:pPr>
         <w:pStyle w:val="berschrift2"/>
-        <w:spacing w:line="480" w:lineRule="auto"/>
-        <w:jc w:val="both"/>
-        <w:rPr>
-          <w:rFonts w:ascii="Arial" w:hAnsi="Arial" w:cs="Arial"/>
-          <w:sz w:val="24"/>
-          <w:szCs w:val="24"/>
-        </w:rPr>
       </w:pPr>
       <w:bookmarkStart w:id="4" w:name="X7e20ed232028829b4d2349899891127431a23e5"/>
-      <w:bookmarkStart w:id="5" w:name="_Toc221111853"/>
+      <w:bookmarkStart w:id="5" w:name="_Toc221120189"/>
       <w:bookmarkEnd w:id="2"/>
       <w:r>
-        <w:rPr>
-          <w:rFonts w:ascii="Arial" w:hAnsi="Arial" w:cs="Arial"/>
-          <w:sz w:val="24"/>
-          <w:szCs w:val="24"/>
-        </w:rPr>
         <w:t>1.2 Forschungsfrage und Zielsetzung der Arbeit</w:t>
       </w:r>
       <w:bookmarkEnd w:id="5"/>
@@ -2491,7 +2492,6 @@
       <w:pPr>
         <w:pStyle w:val="FirstParagraph"/>
         <w:spacing w:line="480" w:lineRule="auto"/>
-        <w:jc w:val="both"/>
         <w:rPr>
           <w:rFonts w:ascii="Arial" w:hAnsi="Arial" w:cs="Arial"/>
           <w:lang w:val="de-DE"/>
@@ -2502,22 +2502,29 @@
           <w:rFonts w:ascii="Arial" w:hAnsi="Arial" w:cs="Arial"/>
           <w:lang w:val="de-DE"/>
         </w:rPr>
-        <w:t xml:space="preserve">Die vorliegende Arbeit bricht mit der defizitorientierten Perspektive und postuliert, dass Widerstand gegen gesundheitliche Maßnahmen ein hochrationales Feedback-Signal darstellt. Dieses weist auf einen „Lack of Fit“ zwischen der </w:t>
-      </w:r>
+        <w:t xml:space="preserve">Diese Arbeit bricht mit der defizitorientierten Lesart und postuliert Widerstand als rationales Feedback-Signal. Er verweist auf einen fundamentalen „Lack </w:t>
+      </w:r>
+      <w:proofErr w:type="spellStart"/>
       <w:r>
         <w:rPr>
           <w:rFonts w:ascii="Arial" w:hAnsi="Arial" w:cs="Arial"/>
           <w:lang w:val="de-DE"/>
         </w:rPr>
-        <w:lastRenderedPageBreak/>
-        <w:t>technokratischen Systemlogik der Geber und der Lebensweltlogik der Empfänger hin. Im Zentrum steht die Forschungsfrage:</w:t>
+        <w:t>of</w:t>
+      </w:r>
+      <w:proofErr w:type="spellEnd"/>
+      <w:r>
+        <w:rPr>
+          <w:rFonts w:ascii="Arial" w:hAnsi="Arial" w:cs="Arial"/>
+          <w:lang w:val="de-DE"/>
+        </w:rPr>
+        <w:t xml:space="preserve"> Fit“ zwischen der technokratischen Systemlogik internationaler Geber und der ökonomischen Lebensweltlogik der Empfänger.</w:t>
       </w:r>
     </w:p>
     <w:p>
       <w:pPr>
-        <w:pStyle w:val="Textkrper"/>
+        <w:pStyle w:val="FirstParagraph"/>
         <w:spacing w:line="480" w:lineRule="auto"/>
-        <w:jc w:val="both"/>
         <w:rPr>
           <w:rFonts w:ascii="Arial" w:hAnsi="Arial" w:cs="Arial"/>
           <w:lang w:val="de-DE"/>
@@ -2526,16 +2533,52 @@
       <w:r>
         <w:rPr>
           <w:rFonts w:ascii="Arial" w:hAnsi="Arial" w:cs="Arial"/>
-          <w:b/>
-          <w:bCs/>
           <w:lang w:val="de-DE"/>
         </w:rPr>
-        <w:t>Inwiefern lässt sich der Widerstand gegen ITN-Distributionen in Uganda durch die Theorie der Biomacht nach Michel Foucault dekonstruieren, und welche diagnostischen Signale liefert dieser für eine Neugestaltung partizipativer Systeme?</w:t>
+        <w:t>Leitend ist die Forschungsfrage:</w:t>
       </w:r>
     </w:p>
     <w:p>
       <w:pPr>
-        <w:pStyle w:val="Textkrper"/>
+        <w:pStyle w:val="FirstParagraph"/>
+        <w:spacing w:line="480" w:lineRule="auto"/>
+        <w:rPr>
+          <w:rFonts w:ascii="Arial" w:hAnsi="Arial" w:cs="Arial"/>
+          <w:b/>
+          <w:lang w:val="de-DE"/>
+        </w:rPr>
+      </w:pPr>
+      <w:r>
+        <w:rPr>
+          <w:rFonts w:ascii="Arial" w:hAnsi="Arial" w:cs="Arial"/>
+          <w:b/>
+          <w:lang w:val="de-DE"/>
+        </w:rPr>
+        <w:lastRenderedPageBreak/>
+        <w:t xml:space="preserve">Inwiefern lässt sich der Widerstand gegen ITN-Distributionen in Uganda mittels Foucaults Theorie der </w:t>
+      </w:r>
+      <w:proofErr w:type="spellStart"/>
+      <w:r>
+        <w:rPr>
+          <w:rFonts w:ascii="Arial" w:hAnsi="Arial" w:cs="Arial"/>
+          <w:b/>
+          <w:lang w:val="de-DE"/>
+        </w:rPr>
+        <w:t>Biomacht</w:t>
+      </w:r>
+      <w:proofErr w:type="spellEnd"/>
+      <w:r>
+        <w:rPr>
+          <w:rFonts w:ascii="Arial" w:hAnsi="Arial" w:cs="Arial"/>
+          <w:b/>
+          <w:lang w:val="de-DE"/>
+        </w:rPr>
+        <w:t xml:space="preserve"> als rationale Handlung dekonstruieren, und welche diagnostischen Signale liefert dieser für die Neugestaltung partizipativer Systeme?</w:t>
+      </w:r>
+    </w:p>
+    <w:p>
+      <w:pPr>
+        <w:pStyle w:val="FirstParagraph"/>
         <w:spacing w:line="480" w:lineRule="auto"/>
         <w:jc w:val="both"/>
         <w:rPr>
@@ -2548,7 +2591,30 @@
           <w:rFonts w:ascii="Arial" w:hAnsi="Arial" w:cs="Arial"/>
           <w:lang w:val="de-DE"/>
         </w:rPr>
-        <w:t>Ziel ist es, Widerstand zu entpathologisieren und aufzuzeigen, dass etwa die Zweckentfremdung von Moskitonetzten Ausdruck einer kalkulierten Agency unter prekären Bedingungen ist. Partizipation wird dabei nicht als Akzeptanzbeschaffung, sondern als epistemische Notwendigkeit verstanden.</w:t>
+        <w:t xml:space="preserve">Ziel ist die </w:t>
+      </w:r>
+      <w:proofErr w:type="spellStart"/>
+      <w:r>
+        <w:rPr>
+          <w:rFonts w:ascii="Arial" w:hAnsi="Arial" w:cs="Arial"/>
+          <w:lang w:val="de-DE"/>
+        </w:rPr>
+        <w:t>Entpathologisierung</w:t>
+      </w:r>
+      <w:proofErr w:type="spellEnd"/>
+      <w:r>
+        <w:rPr>
+          <w:rFonts w:ascii="Arial" w:hAnsi="Arial" w:cs="Arial"/>
+          <w:lang w:val="de-DE"/>
+        </w:rPr>
+        <w:t xml:space="preserve"> von Widerstand: Die Zweckentfremdung von Moskitonetzen wird hier nicht als Fehler, sondern als Ausdruck kalkulierter Agency unter prekären Bedingungen lesbar gemacht. Partizipation wandelt sich damit vom Buzzword zur epistemischen Voraussetzung für Interventionen</w:t>
+      </w:r>
+      <w:r>
+        <w:rPr>
+          <w:rFonts w:ascii="Arial" w:hAnsi="Arial" w:cs="Arial"/>
+          <w:lang w:val="de-DE"/>
+        </w:rPr>
+        <w:t>.</w:t>
       </w:r>
     </w:p>
     <w:p>
@@ -2556,7 +2622,7 @@
         <w:pStyle w:val="berschrift2"/>
       </w:pPr>
       <w:bookmarkStart w:id="6" w:name="methodisches-vorgehen"/>
-      <w:bookmarkStart w:id="7" w:name="_Toc221111854"/>
+      <w:bookmarkStart w:id="7" w:name="_Toc221120190"/>
       <w:bookmarkEnd w:id="4"/>
       <w:r>
         <w:t>1.3 Methodisches Vorgehen</w:t>
@@ -2567,7 +2633,6 @@
       <w:pPr>
         <w:pStyle w:val="FirstParagraph"/>
         <w:spacing w:line="480" w:lineRule="auto"/>
-        <w:jc w:val="both"/>
         <w:rPr>
           <w:rFonts w:ascii="Arial" w:hAnsi="Arial" w:cs="Arial"/>
           <w:lang w:val="de-DE"/>
@@ -2578,23 +2643,150 @@
           <w:rFonts w:ascii="Arial" w:hAnsi="Arial" w:cs="Arial"/>
           <w:lang w:val="de-DE"/>
         </w:rPr>
-        <w:t>Die Beantwortung erfolgt mittels einer qualitativen Literaturanalyse. Hierbei werden soziologische Grundlagentexte (Foucault, Habermas, Perron) mit aktueller empirischer Evidenz der Global Health Forschung trianguliert. Das Vorgehen verbindet theoretische Machtkritik mit der Analyse quantitativer Barrierenmodelle und deren Validierung an der Fallstudie Uganda.</w:t>
+        <w:t xml:space="preserve">Die </w:t>
+      </w:r>
+      <w:r>
+        <w:rPr>
+          <w:rFonts w:ascii="Arial" w:hAnsi="Arial" w:cs="Arial"/>
+          <w:lang w:val="de-DE"/>
+        </w:rPr>
+        <w:t>Untersuchung folgt dem Ansatz einer systematischen qualitativen Literaturanalyse. Der Forschungsprozess trianguliert soziologische Basistheorien (Foucaults Machtanalytik, Habermas’ System/Lebenswelt, Goffmans Institutionentheorie) mit aktueller empirischer Evidenz der Global Health Forschung (2015–2025).</w:t>
       </w:r>
     </w:p>
     <w:p>
       <w:pPr>
+        <w:pStyle w:val="FirstParagraph"/>
         <w:spacing w:line="480" w:lineRule="auto"/>
         <w:rPr>
           <w:rFonts w:ascii="Arial" w:hAnsi="Arial" w:cs="Arial"/>
+          <w:lang w:val="de-DE"/>
         </w:rPr>
       </w:pPr>
       <w:r>
         <w:rPr>
           <w:rFonts w:ascii="Arial" w:hAnsi="Arial" w:cs="Arial"/>
-        </w:rPr>
-        <w:pict w14:anchorId="32435532">
-          <v:rect id="_x0000_i1025" style="width:0;height:1.5pt" o:hralign="center" o:hrstd="t" o:hr="t"/>
-        </w:pict>
+          <w:lang w:val="de-DE"/>
+        </w:rPr>
+        <w:t>Die Selektion der Quellen erfolgte nach drei Kriterien:</w:t>
+      </w:r>
+    </w:p>
+    <w:p>
+      <w:pPr>
+        <w:pStyle w:val="FirstParagraph"/>
+        <w:numPr>
+          <w:ilvl w:val="0"/>
+          <w:numId w:val="4"/>
+        </w:numPr>
+        <w:spacing w:line="480" w:lineRule="auto"/>
+        <w:rPr>
+          <w:rFonts w:ascii="Arial" w:hAnsi="Arial" w:cs="Arial"/>
+          <w:lang w:val="de-DE"/>
+        </w:rPr>
+      </w:pPr>
+      <w:r>
+        <w:rPr>
+          <w:rFonts w:ascii="Arial" w:hAnsi="Arial" w:cs="Arial"/>
+          <w:lang w:val="de-DE"/>
+        </w:rPr>
+        <w:t>T</w:t>
+      </w:r>
+      <w:r>
+        <w:rPr>
+          <w:rFonts w:ascii="Arial" w:hAnsi="Arial" w:cs="Arial"/>
+          <w:lang w:val="de-DE"/>
+        </w:rPr>
+        <w:t>heoretische Passung: Eignung zur Analyse von Machtasymmetrien in Gesundheitsinterventionen.</w:t>
+      </w:r>
+    </w:p>
+    <w:p>
+      <w:pPr>
+        <w:pStyle w:val="FirstParagraph"/>
+        <w:numPr>
+          <w:ilvl w:val="0"/>
+          <w:numId w:val="4"/>
+        </w:numPr>
+        <w:spacing w:line="480" w:lineRule="auto"/>
+        <w:rPr>
+          <w:rFonts w:ascii="Arial" w:hAnsi="Arial" w:cs="Arial"/>
+          <w:lang w:val="de-DE"/>
+        </w:rPr>
+      </w:pPr>
+      <w:r>
+        <w:rPr>
+          <w:rFonts w:ascii="Arial" w:hAnsi="Arial" w:cs="Arial"/>
+          <w:lang w:val="de-DE"/>
+        </w:rPr>
+        <w:t>Empirische Relevanz: Fokus auf Subsahara-Afrika und Vektorkontrollprogramme (ITN).</w:t>
+      </w:r>
+    </w:p>
+    <w:p>
+      <w:pPr>
+        <w:pStyle w:val="FirstParagraph"/>
+        <w:numPr>
+          <w:ilvl w:val="0"/>
+          <w:numId w:val="4"/>
+        </w:numPr>
+        <w:spacing w:line="480" w:lineRule="auto"/>
+        <w:rPr>
+          <w:rFonts w:ascii="Arial" w:hAnsi="Arial" w:cs="Arial"/>
+          <w:lang w:val="de-DE"/>
+        </w:rPr>
+      </w:pPr>
+      <w:r>
+        <w:rPr>
+          <w:rFonts w:ascii="Arial" w:hAnsi="Arial" w:cs="Arial"/>
+          <w:lang w:val="de-DE"/>
+        </w:rPr>
+        <w:t xml:space="preserve">Diagnostische Validität: Studien, die quantitative </w:t>
+      </w:r>
+      <w:proofErr w:type="spellStart"/>
+      <w:r>
+        <w:rPr>
+          <w:rFonts w:ascii="Arial" w:hAnsi="Arial" w:cs="Arial"/>
+          <w:lang w:val="de-DE"/>
+        </w:rPr>
+        <w:t>Barrierenmodelle</w:t>
+      </w:r>
+      <w:proofErr w:type="spellEnd"/>
+      <w:r>
+        <w:rPr>
+          <w:rFonts w:ascii="Arial" w:hAnsi="Arial" w:cs="Arial"/>
+          <w:lang w:val="de-DE"/>
+        </w:rPr>
+        <w:t xml:space="preserve"> mit qualitativen Erklärungsansätzen verknüpfen.</w:t>
+      </w:r>
+    </w:p>
+    <w:p>
+      <w:pPr>
+        <w:pStyle w:val="FirstParagraph"/>
+        <w:spacing w:line="480" w:lineRule="auto"/>
+        <w:jc w:val="both"/>
+        <w:rPr>
+          <w:rFonts w:ascii="Arial" w:hAnsi="Arial" w:cs="Arial"/>
+          <w:lang w:val="de-DE"/>
+        </w:rPr>
+      </w:pPr>
+      <w:r>
+        <w:rPr>
+          <w:rFonts w:ascii="Arial" w:hAnsi="Arial" w:cs="Arial"/>
+          <w:lang w:val="de-DE"/>
+        </w:rPr>
+        <w:lastRenderedPageBreak/>
+        <w:t>Das Vorgehen verbindet dabei deduktive Theoriearbeit mit einer induktiven Validierung am Fallbeispiel Uganda, um abstrakte Machtkritik in konkrete Handlungsempfehlungen zu übersetzen</w:t>
+      </w:r>
+      <w:r>
+        <w:rPr>
+          <w:rFonts w:ascii="Arial" w:hAnsi="Arial" w:cs="Arial"/>
+          <w:lang w:val="de-DE"/>
+        </w:rPr>
+        <w:t>.</w:t>
+      </w:r>
+      <w:r>
+        <w:rPr>
+          <w:rFonts w:ascii="Arial" w:hAnsi="Arial" w:cs="Arial"/>
+          <w:lang w:val="de-DE"/>
+        </w:rPr>
+        <w:br w:type="page"/>
       </w:r>
     </w:p>
     <w:p>
@@ -2602,10 +2794,11 @@
         <w:pStyle w:val="berschrift1"/>
       </w:pPr>
       <w:bookmarkStart w:id="8" w:name="theoretischer-rahmen"/>
-      <w:bookmarkStart w:id="9" w:name="_Toc221111855"/>
+      <w:bookmarkStart w:id="9" w:name="_Toc221120191"/>
       <w:bookmarkEnd w:id="0"/>
       <w:bookmarkEnd w:id="6"/>
       <w:r>
+        <w:lastRenderedPageBreak/>
         <w:t>2. Theoretischer Rahmen</w:t>
       </w:r>
       <w:bookmarkEnd w:id="9"/>
@@ -2615,7 +2808,7 @@
         <w:pStyle w:val="berschrift2"/>
       </w:pPr>
       <w:bookmarkStart w:id="10" w:name="Xfbf96715365a2758d9c897d09bdcb396309ca18"/>
-      <w:bookmarkStart w:id="11" w:name="_Toc221111856"/>
+      <w:bookmarkStart w:id="11" w:name="_Toc221120192"/>
       <w:r>
         <w:t>2.1 Community Health Systems (CHS) im Global Health Kontext</w:t>
       </w:r>
@@ -2636,15 +2829,21 @@
           <w:rFonts w:ascii="Arial" w:hAnsi="Arial" w:cs="Arial"/>
           <w:lang w:val="de-DE"/>
         </w:rPr>
-        <w:t xml:space="preserve">CHS fungieren als hybride Strukturen an der Schnittstelle zwischen formellen Systemen und lokaler Bevölkerung. Zentrale Akteure sind die Community Health Workers (CHWs). Während die offizielle Rhetorik auf „Empowerment“ setzt, zeigt die Praxis oft eine instrumentelle Logik: Die Gemeinschaft wird zum Objekt einer </w:t>
+        <w:t xml:space="preserve">CHS operieren als hybride Schnittstellen zwischen formalen Gesundheitssystemen und lokalen Gemeinschaften. Während politische Rhetorik das „Empowerment“ betont, folgt die Praxis oft einer instrumentellen Logik: Community Health Workers (CHWs) werden als kostengünstige Verlängerung des staatlichen Arms eingesetzt, um globale Indikatoren (z.B. Malaria-Inzidenz) zu optimieren (Kane et al. 2016). Dieses funktionale Ungleichgewicht bildet den strukturellen Nährboden für </w:t>
       </w:r>
       <w:r>
         <w:rPr>
           <w:rFonts w:ascii="Arial" w:hAnsi="Arial" w:cs="Arial"/>
           <w:lang w:val="de-DE"/>
         </w:rPr>
-        <w:lastRenderedPageBreak/>
-        <w:t>Intervention degradiert, deren Erfolg an globalen Zielen wie Impfquoten gemessen wird (Kane et al. 2016). Dieses strukturelle Ungleichgewicht bildet den Nährboden für Widerstand.</w:t>
+        <w:t>Konflikte</w:t>
+      </w:r>
+      <w:r>
+        <w:rPr>
+          <w:rFonts w:ascii="Arial" w:hAnsi="Arial" w:cs="Arial"/>
+          <w:lang w:val="de-DE"/>
+        </w:rPr>
+        <w:t>.</w:t>
       </w:r>
     </w:p>
     <w:p>
@@ -2652,7 +2851,7 @@
         <w:pStyle w:val="berschrift2"/>
       </w:pPr>
       <w:bookmarkStart w:id="12" w:name="Xbca904e7d562fd3ac162bf6194d606793e35247"/>
-      <w:bookmarkStart w:id="13" w:name="_Toc221111857"/>
+      <w:bookmarkStart w:id="13" w:name="_Toc221120193"/>
       <w:bookmarkEnd w:id="10"/>
       <w:r>
         <w:t>2.2 Biopolitik und Machttechnologien nach Foucault</w:t>
@@ -2673,13 +2872,71 @@
           <w:rFonts w:ascii="Arial" w:hAnsi="Arial" w:cs="Arial"/>
           <w:lang w:val="de-DE"/>
         </w:rPr>
-        <w:t xml:space="preserve">Nach Michel Foucault ist Gesundheit ein Feld der „Biomacht“ (Bio-power), die Leben verwaltet und optimiert. </w:t>
-      </w:r>
+        <w:t>Nach Michel Foucault ist Gesundheit ein Feld der „</w:t>
+      </w:r>
+      <w:proofErr w:type="spellStart"/>
       <w:r>
         <w:rPr>
           <w:rFonts w:ascii="Arial" w:hAnsi="Arial" w:cs="Arial"/>
-        </w:rPr>
-        <w:t>Perron et al. (2005) differenzieren zwei Achsen:</w:t>
+          <w:lang w:val="de-DE"/>
+        </w:rPr>
+        <w:t>Biomacht</w:t>
+      </w:r>
+      <w:proofErr w:type="spellEnd"/>
+      <w:r>
+        <w:rPr>
+          <w:rFonts w:ascii="Arial" w:hAnsi="Arial" w:cs="Arial"/>
+          <w:lang w:val="de-DE"/>
+        </w:rPr>
+        <w:t xml:space="preserve">“ (Bio-power), die Leben verwaltet und optimiert. </w:t>
+      </w:r>
+      <w:r>
+        <w:rPr>
+          <w:rFonts w:ascii="Arial" w:hAnsi="Arial" w:cs="Arial"/>
+        </w:rPr>
+        <w:t xml:space="preserve">Perron et al. (2005) </w:t>
+      </w:r>
+      <w:proofErr w:type="spellStart"/>
+      <w:r>
+        <w:rPr>
+          <w:rFonts w:ascii="Arial" w:hAnsi="Arial" w:cs="Arial"/>
+        </w:rPr>
+        <w:t>differenzieren</w:t>
+      </w:r>
+      <w:proofErr w:type="spellEnd"/>
+      <w:r>
+        <w:rPr>
+          <w:rFonts w:ascii="Arial" w:hAnsi="Arial" w:cs="Arial"/>
+        </w:rPr>
+        <w:t xml:space="preserve"> </w:t>
+      </w:r>
+      <w:proofErr w:type="spellStart"/>
+      <w:r>
+        <w:rPr>
+          <w:rFonts w:ascii="Arial" w:hAnsi="Arial" w:cs="Arial"/>
+        </w:rPr>
+        <w:t>zwei</w:t>
+      </w:r>
+      <w:proofErr w:type="spellEnd"/>
+      <w:r>
+        <w:rPr>
+          <w:rFonts w:ascii="Arial" w:hAnsi="Arial" w:cs="Arial"/>
+        </w:rPr>
+        <w:t xml:space="preserve"> </w:t>
+      </w:r>
+      <w:proofErr w:type="spellStart"/>
+      <w:r>
+        <w:rPr>
+          <w:rFonts w:ascii="Arial" w:hAnsi="Arial" w:cs="Arial"/>
+        </w:rPr>
+        <w:t>Achsen</w:t>
+      </w:r>
+      <w:proofErr w:type="spellEnd"/>
+      <w:r>
+        <w:rPr>
+          <w:rFonts w:ascii="Arial" w:hAnsi="Arial" w:cs="Arial"/>
+        </w:rPr>
+        <w:t>:</w:t>
       </w:r>
     </w:p>
     <w:p>
@@ -2696,6 +2953,7 @@
           <w:lang w:val="de-DE"/>
         </w:rPr>
       </w:pPr>
+      <w:proofErr w:type="spellStart"/>
       <w:r>
         <w:rPr>
           <w:rFonts w:ascii="Arial" w:hAnsi="Arial" w:cs="Arial"/>
@@ -2703,14 +2961,56 @@
           <w:bCs/>
           <w:lang w:val="de-DE"/>
         </w:rPr>
-        <w:t>Anatomo-Politik:</w:t>
+        <w:t>Anatomo</w:t>
+      </w:r>
+      <w:proofErr w:type="spellEnd"/>
+      <w:r>
+        <w:rPr>
+          <w:rFonts w:ascii="Arial" w:hAnsi="Arial" w:cs="Arial"/>
+          <w:b/>
+          <w:bCs/>
+          <w:lang w:val="de-DE"/>
+        </w:rPr>
+        <w:t>-Politik:</w:t>
       </w:r>
       <w:r>
         <w:rPr>
           <w:rFonts w:ascii="Arial" w:hAnsi="Arial" w:cs="Arial"/>
           <w:lang w:val="de-DE"/>
         </w:rPr>
-        <w:t xml:space="preserve"> Die Disziplinierung des individuellen Körpers (docile bodies) durch Überwachung und Normierung.</w:t>
+        <w:t xml:space="preserve"> Die Disziplinierung des individuellen Körpers (</w:t>
+      </w:r>
+      <w:proofErr w:type="spellStart"/>
+      <w:r>
+        <w:rPr>
+          <w:rFonts w:ascii="Arial" w:hAnsi="Arial" w:cs="Arial"/>
+          <w:lang w:val="de-DE"/>
+        </w:rPr>
+        <w:t>docile</w:t>
+      </w:r>
+      <w:proofErr w:type="spellEnd"/>
+      <w:r>
+        <w:rPr>
+          <w:rFonts w:ascii="Arial" w:hAnsi="Arial" w:cs="Arial"/>
+          <w:lang w:val="de-DE"/>
+        </w:rPr>
+        <w:t xml:space="preserve"> </w:t>
+      </w:r>
+      <w:proofErr w:type="spellStart"/>
+      <w:r>
+        <w:rPr>
+          <w:rFonts w:ascii="Arial" w:hAnsi="Arial" w:cs="Arial"/>
+          <w:lang w:val="de-DE"/>
+        </w:rPr>
+        <w:t>bodies</w:t>
+      </w:r>
+      <w:proofErr w:type="spellEnd"/>
+      <w:r>
+        <w:rPr>
+          <w:rFonts w:ascii="Arial" w:hAnsi="Arial" w:cs="Arial"/>
+          <w:lang w:val="de-DE"/>
+        </w:rPr>
+        <w:t>) durch Überwachung und Normierung.</w:t>
       </w:r>
     </w:p>
     <w:p>
@@ -2757,7 +3057,7 @@
         <w:pStyle w:val="berschrift2"/>
       </w:pPr>
       <w:bookmarkStart w:id="14" w:name="X6bde636ece0f40fadf8e542c9dbe7878d082b1f"/>
-      <w:bookmarkStart w:id="15" w:name="_Toc221111858"/>
+      <w:bookmarkStart w:id="15" w:name="_Toc221120194"/>
       <w:bookmarkEnd w:id="12"/>
       <w:r>
         <w:t>2.3 Das Konzept der Lebensweltlogik und Reaktanz</w:t>
@@ -2766,9 +3066,8 @@
     </w:p>
     <w:p>
       <w:pPr>
-        <w:pStyle w:val="FirstParagraph"/>
+        <w:pStyle w:val="Textkrper"/>
         <w:spacing w:line="480" w:lineRule="auto"/>
-        <w:jc w:val="both"/>
         <w:rPr>
           <w:rFonts w:ascii="Arial" w:hAnsi="Arial" w:cs="Arial"/>
           <w:lang w:val="de-DE"/>
@@ -2779,40 +3078,18 @@
           <w:rFonts w:ascii="Arial" w:hAnsi="Arial" w:cs="Arial"/>
           <w:lang w:val="de-DE"/>
         </w:rPr>
-        <w:t xml:space="preserve">Ergänzend bietet Jürgen Habermas’ Unterscheidung zwischen „System“ und „Lebenswelt“ einen Analyseramen. Das </w:t>
-      </w:r>
-      <w:r>
-        <w:rPr>
-          <w:rFonts w:ascii="Arial" w:hAnsi="Arial" w:cs="Arial"/>
-          <w:b/>
-          <w:bCs/>
-          <w:lang w:val="de-DE"/>
-        </w:rPr>
-        <w:t>System</w:t>
-      </w:r>
-      <w:r>
+        <w:t>Habermas’ Dichotomie von „System“ und „Lebenswelt“ schärft den Blick für die Kollision zweier Rationalitäten. Das *System* (Geber, Staat) agiert zweckrational nach Effizienz und Protokollen. Die *Lebenswelt* (Dorf, Familie) operiert nach der Logik sozialer Beziehungen und akuter Existenzsicherung.</w:t>
+      </w:r>
+    </w:p>
+    <w:p>
+      <w:pPr>
+        <w:pStyle w:val="Textkrper"/>
+        <w:spacing w:line="480" w:lineRule="auto"/>
         <w:rPr>
           <w:rFonts w:ascii="Arial" w:hAnsi="Arial" w:cs="Arial"/>
           <w:lang w:val="de-DE"/>
         </w:rPr>
-        <w:t xml:space="preserve"> operiert zweckrational nach Effizienz und Protokollen. Die </w:t>
-      </w:r>
-      <w:r>
-        <w:rPr>
-          <w:rFonts w:ascii="Arial" w:hAnsi="Arial" w:cs="Arial"/>
-          <w:b/>
-          <w:bCs/>
-          <w:lang w:val="de-DE"/>
-        </w:rPr>
-        <w:t>Lebenswelt</w:t>
-      </w:r>
-      <w:r>
-        <w:rPr>
-          <w:rFonts w:ascii="Arial" w:hAnsi="Arial" w:cs="Arial"/>
-          <w:lang w:val="de-DE"/>
-        </w:rPr>
-        <w:t xml:space="preserve"> ist der Ort des intuitiven Erfahrungswissens und sozialer Netzwerke.</w:t>
-      </w:r>
+      </w:pPr>
     </w:p>
     <w:p>
       <w:pPr>
@@ -2827,49 +3104,81 @@
       <w:r>
         <w:rPr>
           <w:rFonts w:ascii="Arial" w:hAnsi="Arial" w:cs="Arial"/>
-          <w:b/>
-          <w:bCs/>
           <w:lang w:val="de-DE"/>
         </w:rPr>
-        <w:t>Tabelle 1: Gegenüberstellung der Logiken (nach Habermas)</w:t>
+        <w:t xml:space="preserve">**Tabelle 1: Divergierende Rationalitäten (adaptiert nach </w:t>
+      </w:r>
+      <w:proofErr w:type="gramStart"/>
+      <w:r>
+        <w:rPr>
+          <w:rFonts w:ascii="Arial" w:hAnsi="Arial" w:cs="Arial"/>
+          <w:lang w:val="de-DE"/>
+        </w:rPr>
+        <w:t>Habermas)*</w:t>
+      </w:r>
+      <w:proofErr w:type="gramEnd"/>
+      <w:r>
+        <w:rPr>
+          <w:rFonts w:ascii="Arial" w:hAnsi="Arial" w:cs="Arial"/>
+          <w:lang w:val="de-DE"/>
+        </w:rPr>
+        <w:t>*</w:t>
       </w:r>
     </w:p>
     <w:tbl>
       <w:tblPr>
-        <w:tblStyle w:val="Table"/>
         <w:tblW w:w="0" w:type="auto"/>
-        <w:tblLook w:val="0020" w:firstRow="1" w:lastRow="0" w:firstColumn="0" w:lastColumn="0" w:noHBand="0" w:noVBand="0"/>
+        <w:tblCellSpacing w:w="15" w:type="dxa"/>
+        <w:tblBorders>
+          <w:top w:val="single" w:sz="4" w:space="0" w:color="auto"/>
+          <w:left w:val="single" w:sz="4" w:space="0" w:color="auto"/>
+          <w:bottom w:val="single" w:sz="4" w:space="0" w:color="auto"/>
+          <w:right w:val="single" w:sz="4" w:space="0" w:color="auto"/>
+          <w:insideH w:val="single" w:sz="4" w:space="0" w:color="auto"/>
+          <w:insideV w:val="single" w:sz="4" w:space="0" w:color="auto"/>
+        </w:tblBorders>
+        <w:tblCellMar>
+          <w:top w:w="15" w:type="dxa"/>
+          <w:left w:w="15" w:type="dxa"/>
+          <w:bottom w:w="15" w:type="dxa"/>
+          <w:right w:w="15" w:type="dxa"/>
+        </w:tblCellMar>
+        <w:tblLook w:val="04A0" w:firstRow="1" w:lastRow="0" w:firstColumn="1" w:lastColumn="0" w:noHBand="0" w:noVBand="1"/>
       </w:tblPr>
       <w:tblGrid>
-        <w:gridCol w:w="1896"/>
-        <w:gridCol w:w="3250"/>
-        <w:gridCol w:w="3358"/>
+        <w:gridCol w:w="1476"/>
+        <w:gridCol w:w="2020"/>
+        <w:gridCol w:w="1448"/>
+        <w:gridCol w:w="1741"/>
+        <w:gridCol w:w="1809"/>
       </w:tblGrid>
       <w:tr>
         <w:trPr>
-          <w:cnfStyle w:val="100000000000" w:firstRow="1" w:lastRow="0" w:firstColumn="0" w:lastColumn="0" w:oddVBand="0" w:evenVBand="0" w:oddHBand="0" w:evenHBand="0" w:firstRowFirstColumn="0" w:firstRowLastColumn="0" w:lastRowFirstColumn="0" w:lastRowLastColumn="0"/>
           <w:tblHeader/>
+          <w:tblCellSpacing w:w="15" w:type="dxa"/>
         </w:trPr>
         <w:tc>
           <w:tcPr>
             <w:tcW w:w="0" w:type="auto"/>
+            <w:vAlign w:val="center"/>
+            <w:hideMark/>
           </w:tcPr>
           <w:p>
             <w:pPr>
-              <w:pStyle w:val="Compact"/>
+              <w:pStyle w:val="Textkrper"/>
               <w:spacing w:line="480" w:lineRule="auto"/>
               <w:jc w:val="both"/>
               <w:rPr>
                 <w:rFonts w:ascii="Arial" w:hAnsi="Arial" w:cs="Arial"/>
-                <w:sz w:val="24"/>
-                <w:szCs w:val="24"/>
+                <w:lang w:val="de-DE"/>
               </w:rPr>
             </w:pPr>
             <w:r>
               <w:rPr>
                 <w:rFonts w:ascii="Arial" w:hAnsi="Arial" w:cs="Arial"/>
-                <w:sz w:val="24"/>
-                <w:szCs w:val="24"/>
+                <w:b/>
+                <w:bCs/>
+                <w:lang w:val="de-DE"/>
               </w:rPr>
               <w:t>Kategorie</w:t>
             </w:r>
@@ -2878,68 +3187,44 @@
         <w:tc>
           <w:tcPr>
             <w:tcW w:w="0" w:type="auto"/>
+            <w:vAlign w:val="center"/>
+            <w:hideMark/>
           </w:tcPr>
           <w:p>
             <w:pPr>
-              <w:pStyle w:val="Compact"/>
+              <w:pStyle w:val="Textkrper"/>
               <w:spacing w:line="480" w:lineRule="auto"/>
               <w:jc w:val="both"/>
               <w:rPr>
                 <w:rFonts w:ascii="Arial" w:hAnsi="Arial" w:cs="Arial"/>
-                <w:sz w:val="24"/>
-                <w:szCs w:val="24"/>
+                <w:lang w:val="de-DE"/>
               </w:rPr>
             </w:pPr>
             <w:r>
               <w:rPr>
                 <w:rFonts w:ascii="Arial" w:hAnsi="Arial" w:cs="Arial"/>
-                <w:sz w:val="24"/>
-                <w:szCs w:val="24"/>
-              </w:rPr>
-              <w:t>System-Logik (Top-Down)</w:t>
+                <w:b/>
+                <w:bCs/>
+                <w:lang w:val="de-DE"/>
+              </w:rPr>
+              <w:t>Primäres Ziel</w:t>
             </w:r>
           </w:p>
         </w:tc>
         <w:tc>
           <w:tcPr>
             <w:tcW w:w="0" w:type="auto"/>
+            <w:vAlign w:val="center"/>
+            <w:hideMark/>
           </w:tcPr>
           <w:p>
             <w:pPr>
-              <w:pStyle w:val="Compact"/>
+              <w:pStyle w:val="Textkrper"/>
               <w:spacing w:line="480" w:lineRule="auto"/>
               <w:jc w:val="both"/>
               <w:rPr>
                 <w:rFonts w:ascii="Arial" w:hAnsi="Arial" w:cs="Arial"/>
-                <w:sz w:val="24"/>
-                <w:szCs w:val="24"/>
-              </w:rPr>
-            </w:pPr>
-            <w:r>
-              <w:rPr>
-                <w:rFonts w:ascii="Arial" w:hAnsi="Arial" w:cs="Arial"/>
-                <w:sz w:val="24"/>
-                <w:szCs w:val="24"/>
-              </w:rPr>
-              <w:t>Lebenswelt-Logik (Bottom-Up)</w:t>
-            </w:r>
-          </w:p>
-        </w:tc>
-      </w:tr>
-      <w:tr>
-        <w:tc>
-          <w:tcPr>
-            <w:tcW w:w="0" w:type="auto"/>
-          </w:tcPr>
-          <w:p>
-            <w:pPr>
-              <w:pStyle w:val="Compact"/>
-              <w:spacing w:line="480" w:lineRule="auto"/>
-              <w:jc w:val="both"/>
-              <w:rPr>
-                <w:rFonts w:ascii="Arial" w:hAnsi="Arial" w:cs="Arial"/>
-                <w:sz w:val="24"/>
-                <w:szCs w:val="24"/>
+                <w:lang w:val="de-DE"/>
               </w:rPr>
             </w:pPr>
             <w:r>
@@ -2947,78 +3232,85 @@
                 <w:rFonts w:ascii="Arial" w:hAnsi="Arial" w:cs="Arial"/>
                 <w:b/>
                 <w:bCs/>
-                <w:sz w:val="24"/>
-                <w:szCs w:val="24"/>
-              </w:rPr>
-              <w:t>Primäres Ziel</w:t>
+                <w:lang w:val="de-DE"/>
+              </w:rPr>
+              <w:t>Zeithorizont</w:t>
             </w:r>
           </w:p>
         </w:tc>
         <w:tc>
           <w:tcPr>
             <w:tcW w:w="0" w:type="auto"/>
+            <w:vAlign w:val="center"/>
+            <w:hideMark/>
           </w:tcPr>
           <w:p>
             <w:pPr>
-              <w:pStyle w:val="Compact"/>
+              <w:pStyle w:val="Textkrper"/>
               <w:spacing w:line="480" w:lineRule="auto"/>
               <w:jc w:val="both"/>
               <w:rPr>
                 <w:rFonts w:ascii="Arial" w:hAnsi="Arial" w:cs="Arial"/>
-                <w:sz w:val="24"/>
-                <w:szCs w:val="24"/>
+                <w:lang w:val="de-DE"/>
               </w:rPr>
             </w:pPr>
             <w:r>
               <w:rPr>
                 <w:rFonts w:ascii="Arial" w:hAnsi="Arial" w:cs="Arial"/>
-                <w:sz w:val="24"/>
-                <w:szCs w:val="24"/>
-              </w:rPr>
-              <w:t>Statistische Risikominimierung</w:t>
+                <w:b/>
+                <w:bCs/>
+                <w:lang w:val="de-DE"/>
+              </w:rPr>
+              <w:t>Wissenstyp</w:t>
             </w:r>
           </w:p>
         </w:tc>
         <w:tc>
           <w:tcPr>
             <w:tcW w:w="0" w:type="auto"/>
+            <w:vAlign w:val="center"/>
+            <w:hideMark/>
           </w:tcPr>
           <w:p>
             <w:pPr>
-              <w:pStyle w:val="Compact"/>
+              <w:pStyle w:val="Textkrper"/>
               <w:spacing w:line="480" w:lineRule="auto"/>
               <w:jc w:val="both"/>
               <w:rPr>
                 <w:rFonts w:ascii="Arial" w:hAnsi="Arial" w:cs="Arial"/>
-                <w:sz w:val="24"/>
-                <w:szCs w:val="24"/>
+                <w:lang w:val="de-DE"/>
               </w:rPr>
             </w:pPr>
             <w:r>
               <w:rPr>
                 <w:rFonts w:ascii="Arial" w:hAnsi="Arial" w:cs="Arial"/>
-                <w:sz w:val="24"/>
-                <w:szCs w:val="24"/>
-              </w:rPr>
-              <w:t>Akute Existenzsicherung</w:t>
+                <w:b/>
+                <w:bCs/>
+                <w:lang w:val="de-DE"/>
+              </w:rPr>
+              <w:t>Wahrnehmung</w:t>
             </w:r>
           </w:p>
         </w:tc>
       </w:tr>
       <w:tr>
+        <w:trPr>
+          <w:tblCellSpacing w:w="15" w:type="dxa"/>
+        </w:trPr>
         <w:tc>
           <w:tcPr>
             <w:tcW w:w="0" w:type="auto"/>
+            <w:vAlign w:val="center"/>
+            <w:hideMark/>
           </w:tcPr>
           <w:p>
             <w:pPr>
-              <w:pStyle w:val="Compact"/>
+              <w:pStyle w:val="Textkrper"/>
               <w:spacing w:line="480" w:lineRule="auto"/>
               <w:jc w:val="both"/>
               <w:rPr>
                 <w:rFonts w:ascii="Arial" w:hAnsi="Arial" w:cs="Arial"/>
-                <w:sz w:val="24"/>
-                <w:szCs w:val="24"/>
+                <w:lang w:val="de-DE"/>
               </w:rPr>
             </w:pPr>
             <w:r>
@@ -3026,113 +3318,82 @@
                 <w:rFonts w:ascii="Arial" w:hAnsi="Arial" w:cs="Arial"/>
                 <w:b/>
                 <w:bCs/>
-                <w:sz w:val="24"/>
-                <w:szCs w:val="24"/>
-              </w:rPr>
-              <w:lastRenderedPageBreak/>
-              <w:t>Zeithorizont</w:t>
+                <w:lang w:val="de-DE"/>
+              </w:rPr>
+              <w:t>System-Logik (Top-Down)</w:t>
             </w:r>
           </w:p>
         </w:tc>
         <w:tc>
           <w:tcPr>
             <w:tcW w:w="0" w:type="auto"/>
+            <w:vAlign w:val="center"/>
+            <w:hideMark/>
           </w:tcPr>
           <w:p>
             <w:pPr>
-              <w:pStyle w:val="Compact"/>
+              <w:pStyle w:val="Textkrper"/>
               <w:spacing w:line="480" w:lineRule="auto"/>
               <w:jc w:val="both"/>
               <w:rPr>
                 <w:rFonts w:ascii="Arial" w:hAnsi="Arial" w:cs="Arial"/>
-                <w:sz w:val="24"/>
-                <w:szCs w:val="24"/>
+                <w:lang w:val="de-DE"/>
               </w:rPr>
             </w:pPr>
             <w:r>
               <w:rPr>
                 <w:rFonts w:ascii="Arial" w:hAnsi="Arial" w:cs="Arial"/>
-                <w:sz w:val="24"/>
-                <w:szCs w:val="24"/>
-              </w:rPr>
-              <w:t>Zukunft (Prävention)</w:t>
+                <w:lang w:val="de-DE"/>
+              </w:rPr>
+              <w:t>Statistische Risikoreduktion (Malaria)</w:t>
             </w:r>
           </w:p>
         </w:tc>
         <w:tc>
           <w:tcPr>
             <w:tcW w:w="0" w:type="auto"/>
+            <w:vAlign w:val="center"/>
+            <w:hideMark/>
           </w:tcPr>
           <w:p>
             <w:pPr>
-              <w:pStyle w:val="Compact"/>
+              <w:pStyle w:val="Textkrper"/>
               <w:spacing w:line="480" w:lineRule="auto"/>
               <w:jc w:val="both"/>
               <w:rPr>
                 <w:rFonts w:ascii="Arial" w:hAnsi="Arial" w:cs="Arial"/>
-                <w:sz w:val="24"/>
-                <w:szCs w:val="24"/>
+                <w:lang w:val="de-DE"/>
               </w:rPr>
             </w:pPr>
             <w:r>
               <w:rPr>
                 <w:rFonts w:ascii="Arial" w:hAnsi="Arial" w:cs="Arial"/>
-                <w:sz w:val="24"/>
-                <w:szCs w:val="24"/>
-              </w:rPr>
-              <w:t>Gegenwart (Überleben heute)</w:t>
-            </w:r>
-          </w:p>
-        </w:tc>
-      </w:tr>
-      <w:tr>
-        <w:tc>
-          <w:tcPr>
-            <w:tcW w:w="0" w:type="auto"/>
-          </w:tcPr>
-          <w:p>
-            <w:pPr>
-              <w:pStyle w:val="Compact"/>
-              <w:spacing w:line="480" w:lineRule="auto"/>
-              <w:jc w:val="both"/>
-              <w:rPr>
-                <w:rFonts w:ascii="Arial" w:hAnsi="Arial" w:cs="Arial"/>
-                <w:sz w:val="24"/>
-                <w:szCs w:val="24"/>
-              </w:rPr>
-            </w:pPr>
-            <w:r>
-              <w:rPr>
-                <w:rFonts w:ascii="Arial" w:hAnsi="Arial" w:cs="Arial"/>
-                <w:b/>
-                <w:bCs/>
-                <w:sz w:val="24"/>
-                <w:szCs w:val="24"/>
-              </w:rPr>
-              <w:t>Wissenstyp</w:t>
+                <w:lang w:val="de-DE"/>
+              </w:rPr>
+              <w:t>Zukunft (Prävention)</w:t>
             </w:r>
           </w:p>
         </w:tc>
         <w:tc>
           <w:tcPr>
             <w:tcW w:w="0" w:type="auto"/>
+            <w:vAlign w:val="center"/>
+            <w:hideMark/>
           </w:tcPr>
           <w:p>
             <w:pPr>
-              <w:pStyle w:val="Compact"/>
+              <w:pStyle w:val="Textkrper"/>
               <w:spacing w:line="480" w:lineRule="auto"/>
               <w:jc w:val="both"/>
               <w:rPr>
                 <w:rFonts w:ascii="Arial" w:hAnsi="Arial" w:cs="Arial"/>
-                <w:sz w:val="24"/>
-                <w:szCs w:val="24"/>
+                <w:lang w:val="de-DE"/>
               </w:rPr>
             </w:pPr>
             <w:r>
               <w:rPr>
                 <w:rFonts w:ascii="Arial" w:hAnsi="Arial" w:cs="Arial"/>
-                <w:sz w:val="24"/>
-                <w:szCs w:val="24"/>
+                <w:lang w:val="de-DE"/>
               </w:rPr>
               <w:t>Biomedizinisch, quantitativ</w:t>
             </w:r>
@@ -3141,43 +3402,47 @@
         <w:tc>
           <w:tcPr>
             <w:tcW w:w="0" w:type="auto"/>
+            <w:vAlign w:val="center"/>
+            <w:hideMark/>
           </w:tcPr>
           <w:p>
             <w:pPr>
-              <w:pStyle w:val="Compact"/>
+              <w:pStyle w:val="Textkrper"/>
               <w:spacing w:line="480" w:lineRule="auto"/>
               <w:jc w:val="both"/>
               <w:rPr>
                 <w:rFonts w:ascii="Arial" w:hAnsi="Arial" w:cs="Arial"/>
-                <w:sz w:val="24"/>
-                <w:szCs w:val="24"/>
+                <w:lang w:val="de-DE"/>
               </w:rPr>
             </w:pPr>
             <w:r>
               <w:rPr>
                 <w:rFonts w:ascii="Arial" w:hAnsi="Arial" w:cs="Arial"/>
-                <w:sz w:val="24"/>
-                <w:szCs w:val="24"/>
-              </w:rPr>
-              <w:t>Pragmatisch, erfahrungsbasiert</w:t>
+                <w:lang w:val="de-DE"/>
+              </w:rPr>
+              <w:t>Mensch als Datenträger/Fall</w:t>
             </w:r>
           </w:p>
         </w:tc>
       </w:tr>
       <w:tr>
+        <w:trPr>
+          <w:tblCellSpacing w:w="15" w:type="dxa"/>
+        </w:trPr>
         <w:tc>
           <w:tcPr>
             <w:tcW w:w="0" w:type="auto"/>
+            <w:vAlign w:val="center"/>
+            <w:hideMark/>
           </w:tcPr>
           <w:p>
             <w:pPr>
-              <w:pStyle w:val="Compact"/>
+              <w:pStyle w:val="Textkrper"/>
               <w:spacing w:line="480" w:lineRule="auto"/>
               <w:jc w:val="both"/>
               <w:rPr>
                 <w:rFonts w:ascii="Arial" w:hAnsi="Arial" w:cs="Arial"/>
-                <w:sz w:val="24"/>
-                <w:szCs w:val="24"/>
+                <w:lang w:val="de-DE"/>
               </w:rPr>
             </w:pPr>
             <w:r>
@@ -3185,58 +3450,107 @@
                 <w:rFonts w:ascii="Arial" w:hAnsi="Arial" w:cs="Arial"/>
                 <w:b/>
                 <w:bCs/>
-                <w:sz w:val="24"/>
-                <w:szCs w:val="24"/>
-              </w:rPr>
-              <w:t>Wahrnehmung</w:t>
+                <w:lang w:val="de-DE"/>
+              </w:rPr>
+              <w:t>Lebenswelt-Logik (Bottom-Up)</w:t>
             </w:r>
           </w:p>
         </w:tc>
         <w:tc>
           <w:tcPr>
             <w:tcW w:w="0" w:type="auto"/>
+            <w:vAlign w:val="center"/>
+            <w:hideMark/>
           </w:tcPr>
           <w:p>
             <w:pPr>
-              <w:pStyle w:val="Compact"/>
+              <w:pStyle w:val="Textkrper"/>
               <w:spacing w:line="480" w:lineRule="auto"/>
               <w:jc w:val="both"/>
               <w:rPr>
                 <w:rFonts w:ascii="Arial" w:hAnsi="Arial" w:cs="Arial"/>
-                <w:sz w:val="24"/>
-                <w:szCs w:val="24"/>
+                <w:lang w:val="de-DE"/>
               </w:rPr>
             </w:pPr>
             <w:r>
               <w:rPr>
                 <w:rFonts w:ascii="Arial" w:hAnsi="Arial" w:cs="Arial"/>
-                <w:sz w:val="24"/>
-                <w:szCs w:val="24"/>
-              </w:rPr>
-              <w:t>Mensch als Datenträger</w:t>
+                <w:lang w:val="de-DE"/>
+              </w:rPr>
+              <w:t>Akute Existenzsicherung (Hunger)</w:t>
             </w:r>
           </w:p>
         </w:tc>
         <w:tc>
           <w:tcPr>
             <w:tcW w:w="0" w:type="auto"/>
+            <w:vAlign w:val="center"/>
+            <w:hideMark/>
           </w:tcPr>
           <w:p>
             <w:pPr>
-              <w:pStyle w:val="Compact"/>
+              <w:pStyle w:val="Textkrper"/>
               <w:spacing w:line="480" w:lineRule="auto"/>
               <w:jc w:val="both"/>
               <w:rPr>
                 <w:rFonts w:ascii="Arial" w:hAnsi="Arial" w:cs="Arial"/>
-                <w:sz w:val="24"/>
-                <w:szCs w:val="24"/>
+                <w:lang w:val="de-DE"/>
               </w:rPr>
             </w:pPr>
             <w:r>
               <w:rPr>
                 <w:rFonts w:ascii="Arial" w:hAnsi="Arial" w:cs="Arial"/>
-                <w:sz w:val="24"/>
-                <w:szCs w:val="24"/>
+                <w:lang w:val="de-DE"/>
+              </w:rPr>
+              <w:t>Gegenwart (Überleben heute)</w:t>
+            </w:r>
+          </w:p>
+        </w:tc>
+        <w:tc>
+          <w:tcPr>
+            <w:tcW w:w="0" w:type="auto"/>
+            <w:vAlign w:val="center"/>
+            <w:hideMark/>
+          </w:tcPr>
+          <w:p>
+            <w:pPr>
+              <w:pStyle w:val="Textkrper"/>
+              <w:spacing w:line="480" w:lineRule="auto"/>
+              <w:jc w:val="both"/>
+              <w:rPr>
+                <w:rFonts w:ascii="Arial" w:hAnsi="Arial" w:cs="Arial"/>
+                <w:lang w:val="de-DE"/>
+              </w:rPr>
+            </w:pPr>
+            <w:r>
+              <w:rPr>
+                <w:rFonts w:ascii="Arial" w:hAnsi="Arial" w:cs="Arial"/>
+                <w:lang w:val="de-DE"/>
+              </w:rPr>
+              <w:t>Pragmatisch, kontextuell</w:t>
+            </w:r>
+          </w:p>
+        </w:tc>
+        <w:tc>
+          <w:tcPr>
+            <w:tcW w:w="0" w:type="auto"/>
+            <w:vAlign w:val="center"/>
+            <w:hideMark/>
+          </w:tcPr>
+          <w:p>
+            <w:pPr>
+              <w:pStyle w:val="Textkrper"/>
+              <w:spacing w:line="480" w:lineRule="auto"/>
+              <w:jc w:val="both"/>
+              <w:rPr>
+                <w:rFonts w:ascii="Arial" w:hAnsi="Arial" w:cs="Arial"/>
+                <w:lang w:val="de-DE"/>
+              </w:rPr>
+            </w:pPr>
+            <w:r>
+              <w:rPr>
+                <w:rFonts w:ascii="Arial" w:hAnsi="Arial" w:cs="Arial"/>
+                <w:lang w:val="de-DE"/>
               </w:rPr>
               <w:t>Mensch als handelndes Subjekt</w:t>
             </w:r>
@@ -3259,61 +3573,71 @@
           <w:rFonts w:ascii="Arial" w:hAnsi="Arial" w:cs="Arial"/>
           <w:lang w:val="de-DE"/>
         </w:rPr>
-        <w:t xml:space="preserve">Ein „Lack of Fit“ entsteht, wenn Systemimperative die Lebenswelt kolonialisieren (Habermas). Psychologisch reagiert die Bevölkerung mit </w:t>
-      </w:r>
-      <w:r>
-        <w:rPr>
-          <w:rFonts w:ascii="Arial" w:hAnsi="Arial" w:cs="Arial"/>
-          <w:b/>
-          <w:bCs/>
-          <w:lang w:val="de-DE"/>
-        </w:rPr>
-        <w:t>Reaktanz</w:t>
-      </w:r>
+        <w:t xml:space="preserve">Ein „Lack </w:t>
+      </w:r>
+      <w:proofErr w:type="spellStart"/>
       <w:r>
         <w:rPr>
           <w:rFonts w:ascii="Arial" w:hAnsi="Arial" w:cs="Arial"/>
           <w:lang w:val="de-DE"/>
         </w:rPr>
-        <w:t>: Die bedrohte Handlungsautonomie wird durch Widerstand verteidigt, was das Scheitern der Systemlogik signalisiert, lokale Komplexitäten zu integrieren.</w:t>
-      </w:r>
-    </w:p>
-    <w:p>
-      <w:pPr>
-        <w:spacing w:line="480" w:lineRule="auto"/>
+        <w:t>of</w:t>
+      </w:r>
+      <w:proofErr w:type="spellEnd"/>
+      <w:r>
         <w:rPr>
           <w:rFonts w:ascii="Arial" w:hAnsi="Arial" w:cs="Arial"/>
-        </w:rPr>
-      </w:pPr>
-      <w:r>
-        <w:rPr>
-          <w:rFonts w:ascii="Arial" w:hAnsi="Arial" w:cs="Arial"/>
-        </w:rPr>
-        <w:pict w14:anchorId="5C282B97">
-          <v:rect id="_x0000_i1026" style="width:0;height:1.5pt" o:hralign="center" o:hrstd="t" o:hr="t"/>
-        </w:pict>
+          <w:lang w:val="de-DE"/>
+        </w:rPr>
+        <w:t xml:space="preserve"> Fit“ entsteht, wenn Systemimperative die Lebenswelt kolonialisieren. Psychologische Reaktanz ist die Folge: Die Verteidigung der Handlungsautonomie gegen eine Intervention, die lokale Komplexität (z.B. Nahrungsknappheit) ignoriert.</w:t>
       </w:r>
     </w:p>
     <w:p>
       <w:pPr>
         <w:pStyle w:val="berschrift1"/>
+        <w:rPr>
+          <w:lang w:val="en-US"/>
+        </w:rPr>
       </w:pPr>
       <w:bookmarkStart w:id="16" w:name="machtasymmetrien-in-chs"/>
-      <w:bookmarkStart w:id="17" w:name="_Toc221111859"/>
+      <w:bookmarkStart w:id="17" w:name="_Toc221120195"/>
       <w:bookmarkEnd w:id="8"/>
       <w:bookmarkEnd w:id="14"/>
       <w:r>
-        <w:t>3. Machtasymmetrien in CHS</w:t>
+        <w:rPr>
+          <w:lang w:val="en-US"/>
+        </w:rPr>
+        <w:t xml:space="preserve">3. </w:t>
+      </w:r>
+      <w:proofErr w:type="spellStart"/>
+      <w:r>
+        <w:rPr>
+          <w:lang w:val="en-US"/>
+        </w:rPr>
+        <w:t>Machtasymmetrien</w:t>
+      </w:r>
+      <w:proofErr w:type="spellEnd"/>
+      <w:r>
+        <w:rPr>
+          <w:lang w:val="en-US"/>
+        </w:rPr>
+        <w:t xml:space="preserve"> in CHS</w:t>
       </w:r>
       <w:bookmarkEnd w:id="17"/>
     </w:p>
     <w:p>
       <w:pPr>
         <w:pStyle w:val="berschrift2"/>
+        <w:rPr>
+          <w:lang w:val="en-US"/>
+        </w:rPr>
       </w:pPr>
       <w:bookmarkStart w:id="18" w:name="agents-of-care-vs.-agents-of-the-state"/>
-      <w:bookmarkStart w:id="19" w:name="_Toc221111860"/>
-      <w:r>
+      <w:bookmarkStart w:id="19" w:name="_Toc221120196"/>
+      <w:r>
+        <w:rPr>
+          <w:lang w:val="en-US"/>
+        </w:rPr>
         <w:t>3.1 Agents of Care vs. Agents of the State</w:t>
       </w:r>
       <w:bookmarkEnd w:id="19"/>
@@ -3333,39 +3657,70 @@
           <w:rFonts w:ascii="Arial" w:hAnsi="Arial" w:cs="Arial"/>
           <w:lang w:val="de-DE"/>
         </w:rPr>
-        <w:t xml:space="preserve">In der Global-Health-Rhetorik werden CHWs als „Health Heroes“ gefeiert. Aus der Perspektive von Perron et al. (2005) offenbart sich jedoch eine Rollenambivalenz: Der intendierte </w:t>
-      </w:r>
-      <w:r>
-        <w:rPr>
-          <w:rFonts w:ascii="Arial" w:hAnsi="Arial" w:cs="Arial"/>
-          <w:b/>
-          <w:bCs/>
-          <w:lang w:val="de-DE"/>
-        </w:rPr>
-        <w:t>Agent of Care</w:t>
+        <w:t xml:space="preserve">In </w:t>
       </w:r>
       <w:r>
         <w:rPr>
           <w:rFonts w:ascii="Arial" w:hAnsi="Arial" w:cs="Arial"/>
           <w:lang w:val="de-DE"/>
         </w:rPr>
-        <w:t xml:space="preserve"> transformiert sich für die Bevölkerung oft in einen </w:t>
-      </w:r>
-      <w:r>
-        <w:rPr>
-          <w:rFonts w:ascii="Arial" w:hAnsi="Arial" w:cs="Arial"/>
-          <w:b/>
-          <w:bCs/>
-          <w:lang w:val="de-DE"/>
-        </w:rPr>
-        <w:t>Agent of the State</w:t>
-      </w:r>
+        <w:t xml:space="preserve">Das Selbstbild des CHW als „Health Hero“ kollidiert oft mit der Wahrnehmung der Bevölkerung. Perron et al. (2005) identifizieren eine kritische Rollenambivalenz: Der intendierte *Agent </w:t>
+      </w:r>
+      <w:proofErr w:type="spellStart"/>
       <w:r>
         <w:rPr>
           <w:rFonts w:ascii="Arial" w:hAnsi="Arial" w:cs="Arial"/>
           <w:lang w:val="de-DE"/>
         </w:rPr>
-        <w:t>. Wo der Staat ansonsten durch Abwesenheit glänzt, wird der CHW zum Symbol staatlicher Übergriffigkeit und Disziplinierung.</w:t>
+        <w:t>of</w:t>
+      </w:r>
+      <w:proofErr w:type="spellEnd"/>
+      <w:r>
+        <w:rPr>
+          <w:rFonts w:ascii="Arial" w:hAnsi="Arial" w:cs="Arial"/>
+          <w:lang w:val="de-DE"/>
+        </w:rPr>
+        <w:t xml:space="preserve"> Care* transformiert sich in den Augen der Community zum *Agent </w:t>
+      </w:r>
+      <w:proofErr w:type="spellStart"/>
+      <w:r>
+        <w:rPr>
+          <w:rFonts w:ascii="Arial" w:hAnsi="Arial" w:cs="Arial"/>
+          <w:lang w:val="de-DE"/>
+        </w:rPr>
+        <w:t>of</w:t>
+      </w:r>
+      <w:proofErr w:type="spellEnd"/>
+      <w:r>
+        <w:rPr>
+          <w:rFonts w:ascii="Arial" w:hAnsi="Arial" w:cs="Arial"/>
+          <w:lang w:val="de-DE"/>
+        </w:rPr>
+        <w:t xml:space="preserve"> </w:t>
+      </w:r>
+      <w:proofErr w:type="spellStart"/>
+      <w:r>
+        <w:rPr>
+          <w:rFonts w:ascii="Arial" w:hAnsi="Arial" w:cs="Arial"/>
+          <w:lang w:val="de-DE"/>
+        </w:rPr>
+        <w:t>the</w:t>
+      </w:r>
+      <w:proofErr w:type="spellEnd"/>
+      <w:r>
+        <w:rPr>
+          <w:rFonts w:ascii="Arial" w:hAnsi="Arial" w:cs="Arial"/>
+          <w:lang w:val="de-DE"/>
+        </w:rPr>
+        <w:t xml:space="preserve"> State*. In Regionen, wo der Staat </w:t>
+      </w:r>
+      <w:r>
+        <w:rPr>
+          <w:rFonts w:ascii="Arial" w:hAnsi="Arial" w:cs="Arial"/>
+          <w:lang w:val="de-DE"/>
+        </w:rPr>
+        <w:lastRenderedPageBreak/>
+        <w:t>primär durch Vernachlässigung oder Repression präsent ist, wird der CHW – ausgestattet mit Uniform und Tablet – zum Symbol staatlicher Übergriffigkeit. Er bringt nicht nur Medikamente, sondern auch die „Blicke des Staates“ in die Privatsphäre.</w:t>
       </w:r>
     </w:p>
     <w:p>
@@ -3392,6 +3747,14 @@
       <w:tblPr>
         <w:tblStyle w:val="Table"/>
         <w:tblW w:w="0" w:type="auto"/>
+        <w:tblBorders>
+          <w:top w:val="double" w:sz="4" w:space="0" w:color="auto"/>
+          <w:left w:val="double" w:sz="4" w:space="0" w:color="auto"/>
+          <w:bottom w:val="double" w:sz="4" w:space="0" w:color="auto"/>
+          <w:right w:val="double" w:sz="4" w:space="0" w:color="auto"/>
+          <w:insideH w:val="double" w:sz="4" w:space="0" w:color="auto"/>
+          <w:insideV w:val="double" w:sz="4" w:space="0" w:color="auto"/>
+        </w:tblBorders>
         <w:tblLook w:val="0020" w:firstRow="1" w:lastRow="0" w:firstColumn="0" w:lastColumn="0" w:noHBand="0" w:noVBand="0"/>
       </w:tblPr>
       <w:tblGrid>
@@ -3407,42 +3770,56 @@
         <w:tc>
           <w:tcPr>
             <w:tcW w:w="0" w:type="auto"/>
+            <w:tcBorders>
+              <w:bottom w:val="none" w:sz="0" w:space="0" w:color="auto"/>
+            </w:tcBorders>
           </w:tcPr>
           <w:p>
             <w:pPr>
-              <w:pStyle w:val="Compact"/>
+              <w:pStyle w:val="Textkrper"/>
               <w:spacing w:line="480" w:lineRule="auto"/>
               <w:jc w:val="both"/>
               <w:rPr>
                 <w:rFonts w:ascii="Arial" w:hAnsi="Arial" w:cs="Arial"/>
+                <w:b/>
+                <w:bCs/>
                 <w:sz w:val="24"/>
                 <w:szCs w:val="24"/>
+                <w:lang w:val="de-DE"/>
               </w:rPr>
             </w:pPr>
+            <w:proofErr w:type="spellStart"/>
             <w:r>
               <w:rPr>
                 <w:rFonts w:ascii="Arial" w:hAnsi="Arial" w:cs="Arial"/>
+                <w:b/>
+                <w:bCs/>
                 <w:sz w:val="24"/>
                 <w:szCs w:val="24"/>
-              </w:rPr>
-              <w:lastRenderedPageBreak/>
+                <w:lang w:val="de-DE"/>
+              </w:rPr>
               <w:t>Merkmal</w:t>
             </w:r>
+            <w:proofErr w:type="spellEnd"/>
           </w:p>
         </w:tc>
         <w:tc>
           <w:tcPr>
             <w:tcW w:w="0" w:type="auto"/>
+            <w:tcBorders>
+              <w:bottom w:val="none" w:sz="0" w:space="0" w:color="auto"/>
+            </w:tcBorders>
           </w:tcPr>
           <w:p>
             <w:pPr>
-              <w:pStyle w:val="Compact"/>
+              <w:pStyle w:val="Textkrper"/>
               <w:spacing w:line="480" w:lineRule="auto"/>
               <w:jc w:val="both"/>
               <w:rPr>
                 <w:rFonts w:ascii="Arial" w:hAnsi="Arial" w:cs="Arial"/>
                 <w:sz w:val="24"/>
                 <w:szCs w:val="24"/>
+                <w:lang w:val="de-DE"/>
               </w:rPr>
             </w:pPr>
             <w:r>
@@ -3450,24 +3827,49 @@
                 <w:rFonts w:ascii="Arial" w:hAnsi="Arial" w:cs="Arial"/>
                 <w:sz w:val="24"/>
                 <w:szCs w:val="24"/>
-              </w:rPr>
-              <w:t>Agent of Care (Selbstbild)</w:t>
+                <w:lang w:val="de-DE"/>
+              </w:rPr>
+              <w:t>Agent of Care (</w:t>
+            </w:r>
+            <w:proofErr w:type="spellStart"/>
+            <w:r>
+              <w:rPr>
+                <w:rFonts w:ascii="Arial" w:hAnsi="Arial" w:cs="Arial"/>
+                <w:sz w:val="24"/>
+                <w:szCs w:val="24"/>
+                <w:lang w:val="de-DE"/>
+              </w:rPr>
+              <w:t>Selbstbild</w:t>
+            </w:r>
+            <w:proofErr w:type="spellEnd"/>
+            <w:r>
+              <w:rPr>
+                <w:rFonts w:ascii="Arial" w:hAnsi="Arial" w:cs="Arial"/>
+                <w:sz w:val="24"/>
+                <w:szCs w:val="24"/>
+                <w:lang w:val="de-DE"/>
+              </w:rPr>
+              <w:t>)</w:t>
             </w:r>
           </w:p>
         </w:tc>
         <w:tc>
           <w:tcPr>
             <w:tcW w:w="0" w:type="auto"/>
+            <w:tcBorders>
+              <w:bottom w:val="none" w:sz="0" w:space="0" w:color="auto"/>
+            </w:tcBorders>
           </w:tcPr>
           <w:p>
             <w:pPr>
-              <w:pStyle w:val="Compact"/>
+              <w:pStyle w:val="Textkrper"/>
               <w:spacing w:line="480" w:lineRule="auto"/>
               <w:jc w:val="both"/>
               <w:rPr>
                 <w:rFonts w:ascii="Arial" w:hAnsi="Arial" w:cs="Arial"/>
                 <w:sz w:val="24"/>
                 <w:szCs w:val="24"/>
+                <w:lang w:val="de-DE"/>
               </w:rPr>
             </w:pPr>
             <w:r>
@@ -3475,8 +3877,29 @@
                 <w:rFonts w:ascii="Arial" w:hAnsi="Arial" w:cs="Arial"/>
                 <w:sz w:val="24"/>
                 <w:szCs w:val="24"/>
-              </w:rPr>
-              <w:t>Agent of the State (Fremdbild)</w:t>
+                <w:lang w:val="de-DE"/>
+              </w:rPr>
+              <w:t>Agent of the State (</w:t>
+            </w:r>
+            <w:proofErr w:type="spellStart"/>
+            <w:r>
+              <w:rPr>
+                <w:rFonts w:ascii="Arial" w:hAnsi="Arial" w:cs="Arial"/>
+                <w:sz w:val="24"/>
+                <w:szCs w:val="24"/>
+                <w:lang w:val="de-DE"/>
+              </w:rPr>
+              <w:t>Fremdbild</w:t>
+            </w:r>
+            <w:proofErr w:type="spellEnd"/>
+            <w:r>
+              <w:rPr>
+                <w:rFonts w:ascii="Arial" w:hAnsi="Arial" w:cs="Arial"/>
+                <w:sz w:val="24"/>
+                <w:szCs w:val="24"/>
+                <w:lang w:val="de-DE"/>
+              </w:rPr>
+              <w:t>)</w:t>
             </w:r>
           </w:p>
         </w:tc>
@@ -3488,25 +3911,31 @@
           </w:tcPr>
           <w:p>
             <w:pPr>
-              <w:pStyle w:val="Compact"/>
+              <w:pStyle w:val="Textkrper"/>
               <w:spacing w:line="480" w:lineRule="auto"/>
               <w:jc w:val="both"/>
-              <w:rPr>
-                <w:rFonts w:ascii="Arial" w:hAnsi="Arial" w:cs="Arial"/>
-                <w:sz w:val="24"/>
-                <w:szCs w:val="24"/>
-              </w:rPr>
-            </w:pPr>
-            <w:r>
               <w:rPr>
                 <w:rFonts w:ascii="Arial" w:hAnsi="Arial" w:cs="Arial"/>
                 <w:b/>
                 <w:bCs/>
                 <w:sz w:val="24"/>
                 <w:szCs w:val="24"/>
+                <w:lang w:val="de-DE"/>
+              </w:rPr>
+            </w:pPr>
+            <w:proofErr w:type="spellStart"/>
+            <w:r>
+              <w:rPr>
+                <w:rFonts w:ascii="Arial" w:hAnsi="Arial" w:cs="Arial"/>
+                <w:b/>
+                <w:bCs/>
+                <w:sz w:val="24"/>
+                <w:szCs w:val="24"/>
+                <w:lang w:val="de-DE"/>
               </w:rPr>
               <w:t>Funktion</w:t>
             </w:r>
+            <w:proofErr w:type="spellEnd"/>
           </w:p>
         </w:tc>
         <w:tc>
@@ -3515,23 +3944,47 @@
           </w:tcPr>
           <w:p>
             <w:pPr>
-              <w:pStyle w:val="Compact"/>
+              <w:pStyle w:val="Textkrper"/>
               <w:spacing w:line="480" w:lineRule="auto"/>
               <w:jc w:val="both"/>
               <w:rPr>
                 <w:rFonts w:ascii="Arial" w:hAnsi="Arial" w:cs="Arial"/>
                 <w:sz w:val="24"/>
                 <w:szCs w:val="24"/>
+                <w:lang w:val="de-DE"/>
               </w:rPr>
             </w:pPr>
+            <w:proofErr w:type="spellStart"/>
             <w:r>
               <w:rPr>
                 <w:rFonts w:ascii="Arial" w:hAnsi="Arial" w:cs="Arial"/>
                 <w:sz w:val="24"/>
                 <w:szCs w:val="24"/>
-              </w:rPr>
-              <w:t>Unterstützung, Heilung</w:t>
-            </w:r>
+                <w:lang w:val="de-DE"/>
+              </w:rPr>
+              <w:t>Unterstützung</w:t>
+            </w:r>
+            <w:proofErr w:type="spellEnd"/>
+            <w:r>
+              <w:rPr>
+                <w:rFonts w:ascii="Arial" w:hAnsi="Arial" w:cs="Arial"/>
+                <w:sz w:val="24"/>
+                <w:szCs w:val="24"/>
+                <w:lang w:val="de-DE"/>
+              </w:rPr>
+              <w:t xml:space="preserve">, </w:t>
+            </w:r>
+            <w:proofErr w:type="spellStart"/>
+            <w:r>
+              <w:rPr>
+                <w:rFonts w:ascii="Arial" w:hAnsi="Arial" w:cs="Arial"/>
+                <w:sz w:val="24"/>
+                <w:szCs w:val="24"/>
+                <w:lang w:val="de-DE"/>
+              </w:rPr>
+              <w:t>Heilung</w:t>
+            </w:r>
+            <w:proofErr w:type="spellEnd"/>
           </w:p>
         </w:tc>
         <w:tc>
@@ -3540,23 +3993,47 @@
           </w:tcPr>
           <w:p>
             <w:pPr>
-              <w:pStyle w:val="Compact"/>
+              <w:pStyle w:val="Textkrper"/>
               <w:spacing w:line="480" w:lineRule="auto"/>
               <w:jc w:val="both"/>
               <w:rPr>
                 <w:rFonts w:ascii="Arial" w:hAnsi="Arial" w:cs="Arial"/>
                 <w:sz w:val="24"/>
                 <w:szCs w:val="24"/>
+                <w:lang w:val="de-DE"/>
               </w:rPr>
             </w:pPr>
+            <w:proofErr w:type="spellStart"/>
             <w:r>
               <w:rPr>
                 <w:rFonts w:ascii="Arial" w:hAnsi="Arial" w:cs="Arial"/>
                 <w:sz w:val="24"/>
                 <w:szCs w:val="24"/>
-              </w:rPr>
-              <w:t>Überwachung, Disziplinierung</w:t>
-            </w:r>
+                <w:lang w:val="de-DE"/>
+              </w:rPr>
+              <w:t>Überwachung</w:t>
+            </w:r>
+            <w:proofErr w:type="spellEnd"/>
+            <w:r>
+              <w:rPr>
+                <w:rFonts w:ascii="Arial" w:hAnsi="Arial" w:cs="Arial"/>
+                <w:sz w:val="24"/>
+                <w:szCs w:val="24"/>
+                <w:lang w:val="de-DE"/>
+              </w:rPr>
+              <w:t xml:space="preserve">, </w:t>
+            </w:r>
+            <w:proofErr w:type="spellStart"/>
+            <w:r>
+              <w:rPr>
+                <w:rFonts w:ascii="Arial" w:hAnsi="Arial" w:cs="Arial"/>
+                <w:sz w:val="24"/>
+                <w:szCs w:val="24"/>
+                <w:lang w:val="de-DE"/>
+              </w:rPr>
+              <w:t>Disziplinierung</w:t>
+            </w:r>
+            <w:proofErr w:type="spellEnd"/>
           </w:p>
         </w:tc>
       </w:tr>
@@ -3567,25 +4044,31 @@
           </w:tcPr>
           <w:p>
             <w:pPr>
-              <w:pStyle w:val="Compact"/>
+              <w:pStyle w:val="Textkrper"/>
               <w:spacing w:line="480" w:lineRule="auto"/>
               <w:jc w:val="both"/>
-              <w:rPr>
-                <w:rFonts w:ascii="Arial" w:hAnsi="Arial" w:cs="Arial"/>
-                <w:sz w:val="24"/>
-                <w:szCs w:val="24"/>
-              </w:rPr>
-            </w:pPr>
-            <w:r>
               <w:rPr>
                 <w:rFonts w:ascii="Arial" w:hAnsi="Arial" w:cs="Arial"/>
                 <w:b/>
                 <w:bCs/>
                 <w:sz w:val="24"/>
                 <w:szCs w:val="24"/>
+                <w:lang w:val="de-DE"/>
+              </w:rPr>
+            </w:pPr>
+            <w:proofErr w:type="spellStart"/>
+            <w:r>
+              <w:rPr>
+                <w:rFonts w:ascii="Arial" w:hAnsi="Arial" w:cs="Arial"/>
+                <w:b/>
+                <w:bCs/>
+                <w:sz w:val="24"/>
+                <w:szCs w:val="24"/>
+                <w:lang w:val="de-DE"/>
               </w:rPr>
               <w:t>Werkzeug</w:t>
             </w:r>
+            <w:proofErr w:type="spellEnd"/>
           </w:p>
         </w:tc>
         <w:tc>
@@ -3594,23 +4077,47 @@
           </w:tcPr>
           <w:p>
             <w:pPr>
-              <w:pStyle w:val="Compact"/>
+              <w:pStyle w:val="Textkrper"/>
               <w:spacing w:line="480" w:lineRule="auto"/>
               <w:jc w:val="both"/>
               <w:rPr>
                 <w:rFonts w:ascii="Arial" w:hAnsi="Arial" w:cs="Arial"/>
                 <w:sz w:val="24"/>
                 <w:szCs w:val="24"/>
+                <w:lang w:val="de-DE"/>
               </w:rPr>
             </w:pPr>
+            <w:proofErr w:type="spellStart"/>
             <w:r>
               <w:rPr>
                 <w:rFonts w:ascii="Arial" w:hAnsi="Arial" w:cs="Arial"/>
                 <w:sz w:val="24"/>
                 <w:szCs w:val="24"/>
-              </w:rPr>
-              <w:t>Beratung, Behandlung</w:t>
-            </w:r>
+                <w:lang w:val="de-DE"/>
+              </w:rPr>
+              <w:t>Beratung</w:t>
+            </w:r>
+            <w:proofErr w:type="spellEnd"/>
+            <w:r>
+              <w:rPr>
+                <w:rFonts w:ascii="Arial" w:hAnsi="Arial" w:cs="Arial"/>
+                <w:sz w:val="24"/>
+                <w:szCs w:val="24"/>
+                <w:lang w:val="de-DE"/>
+              </w:rPr>
+              <w:t xml:space="preserve">, </w:t>
+            </w:r>
+            <w:proofErr w:type="spellStart"/>
+            <w:r>
+              <w:rPr>
+                <w:rFonts w:ascii="Arial" w:hAnsi="Arial" w:cs="Arial"/>
+                <w:sz w:val="24"/>
+                <w:szCs w:val="24"/>
+                <w:lang w:val="de-DE"/>
+              </w:rPr>
+              <w:t>Behandlung</w:t>
+            </w:r>
+            <w:proofErr w:type="spellEnd"/>
           </w:p>
         </w:tc>
         <w:tc>
@@ -3619,13 +4126,14 @@
           </w:tcPr>
           <w:p>
             <w:pPr>
-              <w:pStyle w:val="Compact"/>
+              <w:pStyle w:val="Textkrper"/>
               <w:spacing w:line="480" w:lineRule="auto"/>
               <w:jc w:val="both"/>
               <w:rPr>
                 <w:rFonts w:ascii="Arial" w:hAnsi="Arial" w:cs="Arial"/>
                 <w:sz w:val="24"/>
                 <w:szCs w:val="24"/>
+                <w:lang w:val="de-DE"/>
               </w:rPr>
             </w:pPr>
             <w:r>
@@ -3633,9 +4141,21 @@
                 <w:rFonts w:ascii="Arial" w:hAnsi="Arial" w:cs="Arial"/>
                 <w:sz w:val="24"/>
                 <w:szCs w:val="24"/>
-              </w:rPr>
-              <w:t>Tablets, Uniform, Datenerfassung</w:t>
-            </w:r>
+                <w:lang w:val="de-DE"/>
+              </w:rPr>
+              <w:t xml:space="preserve">Tablets, Uniform, </w:t>
+            </w:r>
+            <w:proofErr w:type="spellStart"/>
+            <w:r>
+              <w:rPr>
+                <w:rFonts w:ascii="Arial" w:hAnsi="Arial" w:cs="Arial"/>
+                <w:sz w:val="24"/>
+                <w:szCs w:val="24"/>
+                <w:lang w:val="de-DE"/>
+              </w:rPr>
+              <w:t>Datenerfassung</w:t>
+            </w:r>
+            <w:proofErr w:type="spellEnd"/>
           </w:p>
         </w:tc>
       </w:tr>
@@ -3646,25 +4166,31 @@
           </w:tcPr>
           <w:p>
             <w:pPr>
-              <w:pStyle w:val="Compact"/>
+              <w:pStyle w:val="Textkrper"/>
               <w:spacing w:line="480" w:lineRule="auto"/>
               <w:jc w:val="both"/>
-              <w:rPr>
-                <w:rFonts w:ascii="Arial" w:hAnsi="Arial" w:cs="Arial"/>
-                <w:sz w:val="24"/>
-                <w:szCs w:val="24"/>
-              </w:rPr>
-            </w:pPr>
-            <w:r>
               <w:rPr>
                 <w:rFonts w:ascii="Arial" w:hAnsi="Arial" w:cs="Arial"/>
                 <w:b/>
                 <w:bCs/>
                 <w:sz w:val="24"/>
                 <w:szCs w:val="24"/>
+                <w:lang w:val="de-DE"/>
+              </w:rPr>
+            </w:pPr>
+            <w:proofErr w:type="spellStart"/>
+            <w:r>
+              <w:rPr>
+                <w:rFonts w:ascii="Arial" w:hAnsi="Arial" w:cs="Arial"/>
+                <w:b/>
+                <w:bCs/>
+                <w:sz w:val="24"/>
+                <w:szCs w:val="24"/>
+                <w:lang w:val="de-DE"/>
               </w:rPr>
               <w:t>Machtform</w:t>
             </w:r>
+            <w:proofErr w:type="spellEnd"/>
           </w:p>
         </w:tc>
         <w:tc>
@@ -3673,13 +4199,14 @@
           </w:tcPr>
           <w:p>
             <w:pPr>
-              <w:pStyle w:val="Compact"/>
+              <w:pStyle w:val="Textkrper"/>
               <w:spacing w:line="480" w:lineRule="auto"/>
               <w:jc w:val="both"/>
               <w:rPr>
                 <w:rFonts w:ascii="Arial" w:hAnsi="Arial" w:cs="Arial"/>
                 <w:sz w:val="24"/>
                 <w:szCs w:val="24"/>
+                <w:lang w:val="de-DE"/>
               </w:rPr>
             </w:pPr>
             <w:r>
@@ -3687,8 +4214,29 @@
                 <w:rFonts w:ascii="Arial" w:hAnsi="Arial" w:cs="Arial"/>
                 <w:sz w:val="24"/>
                 <w:szCs w:val="24"/>
-              </w:rPr>
-              <w:t>Pastorale Macht (Fürsorge)</w:t>
+                <w:lang w:val="de-DE"/>
+              </w:rPr>
+              <w:t>Pastorale Macht (</w:t>
+            </w:r>
+            <w:proofErr w:type="spellStart"/>
+            <w:r>
+              <w:rPr>
+                <w:rFonts w:ascii="Arial" w:hAnsi="Arial" w:cs="Arial"/>
+                <w:sz w:val="24"/>
+                <w:szCs w:val="24"/>
+                <w:lang w:val="de-DE"/>
+              </w:rPr>
+              <w:t>Fürsorge</w:t>
+            </w:r>
+            <w:proofErr w:type="spellEnd"/>
+            <w:r>
+              <w:rPr>
+                <w:rFonts w:ascii="Arial" w:hAnsi="Arial" w:cs="Arial"/>
+                <w:sz w:val="24"/>
+                <w:szCs w:val="24"/>
+                <w:lang w:val="de-DE"/>
+              </w:rPr>
+              <w:t>)</w:t>
             </w:r>
           </w:p>
         </w:tc>
@@ -3698,22 +4246,55 @@
           </w:tcPr>
           <w:p>
             <w:pPr>
-              <w:pStyle w:val="Compact"/>
+              <w:pStyle w:val="Textkrper"/>
               <w:spacing w:line="480" w:lineRule="auto"/>
               <w:jc w:val="both"/>
               <w:rPr>
                 <w:rFonts w:ascii="Arial" w:hAnsi="Arial" w:cs="Arial"/>
                 <w:sz w:val="24"/>
                 <w:szCs w:val="24"/>
+                <w:lang w:val="de-DE"/>
               </w:rPr>
             </w:pPr>
+            <w:proofErr w:type="spellStart"/>
             <w:r>
               <w:rPr>
                 <w:rFonts w:ascii="Arial" w:hAnsi="Arial" w:cs="Arial"/>
                 <w:sz w:val="24"/>
                 <w:szCs w:val="24"/>
-              </w:rPr>
-              <w:t>Biomacht (Normalisierung)</w:t>
+                <w:lang w:val="de-DE"/>
+              </w:rPr>
+              <w:t>Biomacht</w:t>
+            </w:r>
+            <w:proofErr w:type="spellEnd"/>
+            <w:r>
+              <w:rPr>
+                <w:rFonts w:ascii="Arial" w:hAnsi="Arial" w:cs="Arial"/>
+                <w:sz w:val="24"/>
+                <w:szCs w:val="24"/>
+                <w:lang w:val="de-DE"/>
+              </w:rPr>
+              <w:t xml:space="preserve"> (</w:t>
+            </w:r>
+            <w:proofErr w:type="spellStart"/>
+            <w:r>
+              <w:rPr>
+                <w:rFonts w:ascii="Arial" w:hAnsi="Arial" w:cs="Arial"/>
+                <w:sz w:val="24"/>
+                <w:szCs w:val="24"/>
+                <w:lang w:val="de-DE"/>
+              </w:rPr>
+              <w:t>Normalisierung</w:t>
+            </w:r>
+            <w:proofErr w:type="spellEnd"/>
+            <w:r>
+              <w:rPr>
+                <w:rFonts w:ascii="Arial" w:hAnsi="Arial" w:cs="Arial"/>
+                <w:sz w:val="24"/>
+                <w:szCs w:val="24"/>
+                <w:lang w:val="de-DE"/>
+              </w:rPr>
+              <w:t>)</w:t>
             </w:r>
           </w:p>
         </w:tc>
@@ -3724,7 +4305,7 @@
         <w:pStyle w:val="berschrift2"/>
       </w:pPr>
       <w:bookmarkStart w:id="20" w:name="epistemische-ungerechtigkeit"/>
-      <w:bookmarkStart w:id="21" w:name="_Toc221111861"/>
+      <w:bookmarkStart w:id="21" w:name="_Toc221120197"/>
       <w:bookmarkEnd w:id="18"/>
       <w:r>
         <w:t>3.2 Epistemische Ungerechtigkeit</w:t>
@@ -3746,7 +4327,30 @@
           <w:rFonts w:ascii="Arial" w:hAnsi="Arial" w:cs="Arial"/>
           <w:lang w:val="de-DE"/>
         </w:rPr>
-        <w:t>Ein subtiler Machtfaktor ist die Abwertung lokalen Wissens gegenüber der biomedizinischen Epistemologie. Dieser „Epistemizid“ marginalisiert erfahrungsbasierte Deutungsmuster als „unwissenschaftlich“. Widerstand fungiert hier als Abwehrmechanismus, um die kulturelle Identität und Deutungshoheit über das eigene Leben zu wahren.</w:t>
+        <w:t xml:space="preserve">Ein </w:t>
+      </w:r>
+      <w:r>
+        <w:rPr>
+          <w:rFonts w:ascii="Arial" w:hAnsi="Arial" w:cs="Arial"/>
+          <w:lang w:val="de-DE"/>
+        </w:rPr>
+        <w:t>subtiler, aber wirkmächtiger Faktor ist die Hierarchisierung von Wissen. Lokales Erfahrungswissen wird systematisch als „unwissenschaftlich“ abgewertet („</w:t>
+      </w:r>
+      <w:proofErr w:type="spellStart"/>
+      <w:r>
+        <w:rPr>
+          <w:rFonts w:ascii="Arial" w:hAnsi="Arial" w:cs="Arial"/>
+          <w:lang w:val="de-DE"/>
+        </w:rPr>
+        <w:t>Epistemizid</w:t>
+      </w:r>
+      <w:proofErr w:type="spellEnd"/>
+      <w:r>
+        <w:rPr>
+          <w:rFonts w:ascii="Arial" w:hAnsi="Arial" w:cs="Arial"/>
+          <w:lang w:val="de-DE"/>
+        </w:rPr>
+        <w:t>“). Wenn biomedizinische Protokolle traditionelle Praktiken ohne Dialog ersetzen, fungiert Widerstand als Schutzmechanismus kultureller Identität und Deutungshoheit.</w:t>
       </w:r>
     </w:p>
     <w:p>
@@ -3754,7 +4358,7 @@
         <w:pStyle w:val="berschrift2"/>
       </w:pPr>
       <w:bookmarkStart w:id="22" w:name="digitale-überwachung-und-mortifikation"/>
-      <w:bookmarkStart w:id="23" w:name="_Toc221111862"/>
+      <w:bookmarkStart w:id="23" w:name="_Toc221120198"/>
       <w:bookmarkEnd w:id="20"/>
       <w:r>
         <w:t>3.3 Digitale Überwachung und Mortifikation</w:t>
@@ -3776,43 +4380,33 @@
           <w:rFonts w:ascii="Arial" w:hAnsi="Arial" w:cs="Arial"/>
           <w:lang w:val="de-DE"/>
         </w:rPr>
-        <w:t xml:space="preserve">Die technologische Aufrüstung der CHS durch mHealth-Lösungen verschärft diese Asymmetrie. Wenn der CHW den privaten Wohnraum betritt und Lebensdaten in ein Tablet einspeist, findet eine Form der </w:t>
-      </w:r>
-      <w:r>
-        <w:rPr>
-          <w:rFonts w:ascii="Arial" w:hAnsi="Arial" w:cs="Arial"/>
-          <w:b/>
-          <w:bCs/>
-          <w:lang w:val="de-DE"/>
-        </w:rPr>
-        <w:t>Daten-Mortifikation</w:t>
+        <w:t xml:space="preserve">Die </w:t>
       </w:r>
       <w:r>
         <w:rPr>
           <w:rFonts w:ascii="Arial" w:hAnsi="Arial" w:cs="Arial"/>
           <w:lang w:val="de-DE"/>
         </w:rPr>
-        <w:t xml:space="preserve"> (in Anlehnung an Goffman) statt. Das Individuum wird seiner biografischen Einzigartigkeit beraubt und in standardisierte Datenpunkte transformiert. Die digitale Erfassung fungiert als disziplinierende Technologie, die den Haushalt in eine quasi-totale Institution verwandelt: Der Bewohner wird zum Objekt der Überwachung, dessen Agency hinter der statistischen Norm verschwindet.</w:t>
-      </w:r>
-    </w:p>
-    <w:p>
-      <w:pPr>
-        <w:spacing w:line="480" w:lineRule="auto"/>
+        <w:t xml:space="preserve">Digitalisierung von CHS (mHealth) verschärft diese Asymmetrie. Das Erfassen sensibler Haushaltsdaten auf Tablets bewirkt eine Form der *Mortifikation* (in Anlehnung an Goffman): Das Individuum wird seiner biografischen Einzigartigkeit beraubt und in einen standardisierten Datensatz </w:t>
+      </w:r>
+      <w:r>
         <w:rPr>
           <w:rFonts w:ascii="Arial" w:hAnsi="Arial" w:cs="Arial"/>
-        </w:rPr>
-      </w:pPr>
+          <w:lang w:val="de-DE"/>
+        </w:rPr>
+        <w:lastRenderedPageBreak/>
+        <w:t>transformiert. Zwar wird der private Haushalt nicht zur „totalen Institution“ im strengen Sinne, doch nähern sich die Mechanismen funktional an: Der Wohnraum wird transparenter, das Verhalten überwachbar, und die Bewohner werden zu Objekten einer externen Verwaltung, deren Regeln sie nicht mitbestimmt haben.</w:t>
+      </w:r>
     </w:p>
     <w:p>
       <w:pPr>
         <w:pStyle w:val="berschrift1"/>
       </w:pPr>
       <w:bookmarkStart w:id="24" w:name="X335da26512fc1efc7b917fb4108ebda6b92ad26"/>
-      <w:bookmarkStart w:id="25" w:name="_Toc221111863"/>
+      <w:bookmarkStart w:id="25" w:name="_Toc221120199"/>
       <w:bookmarkEnd w:id="16"/>
       <w:bookmarkEnd w:id="22"/>
       <w:r>
-        <w:lastRenderedPageBreak/>
         <w:t>4. Widerstand als diagnostisches Feedback-Instrument</w:t>
       </w:r>
       <w:bookmarkEnd w:id="25"/>
@@ -3822,7 +4416,7 @@
         <w:pStyle w:val="berschrift2"/>
       </w:pPr>
       <w:bookmarkStart w:id="26" w:name="dekonstruktion-der-non-compliance"/>
-      <w:bookmarkStart w:id="27" w:name="_Toc221111864"/>
+      <w:bookmarkStart w:id="27" w:name="_Toc221120200"/>
       <w:r>
         <w:t>4.1 Dekonstruktion der „Non-Compliance“</w:t>
       </w:r>
@@ -3843,23 +4437,14 @@
           <w:rFonts w:ascii="Arial" w:hAnsi="Arial" w:cs="Arial"/>
           <w:lang w:val="de-DE"/>
         </w:rPr>
-        <w:t xml:space="preserve">Der Begriff der „Non-Compliance“ ist eine analytische Sackgasse. Er pathologisiert Verhalten und entlastet Programmentwickler von Selbstkritik. Widerstand sollte stattdessen als Ausdruck von </w:t>
-      </w:r>
-      <w:r>
-        <w:rPr>
-          <w:rFonts w:ascii="Arial" w:hAnsi="Arial" w:cs="Arial"/>
-          <w:b/>
-          <w:bCs/>
-          <w:lang w:val="de-DE"/>
-        </w:rPr>
-        <w:t>Agency</w:t>
+        <w:t xml:space="preserve">Der </w:t>
       </w:r>
       <w:r>
         <w:rPr>
           <w:rFonts w:ascii="Arial" w:hAnsi="Arial" w:cs="Arial"/>
           <w:lang w:val="de-DE"/>
         </w:rPr>
-        <w:t xml:space="preserve"> begriffen werden – die Fähigkeit, innerhalb prekärer Strukturen Entscheidungen zu treffen, die der eigenen Lebensweltlogik dienen.</w:t>
+        <w:t>Begriff „Non-Compliance“ ist analytisch wertlos, da er ein relationales Problem einseitig dem schwächeren Akteur anlastet. Widerstand muss stattdessen als *Agency* begriffen werden – als Fähigkeit, innerhalb prekärer Strukturen rationale Entscheidungen zu treffen, die der eigenen Lebensweltlogik (oft schlicht dem Überleben) dienen.</w:t>
       </w:r>
     </w:p>
     <w:p>
@@ -3867,10 +4452,18 @@
         <w:pStyle w:val="berschrift2"/>
       </w:pPr>
       <w:bookmarkStart w:id="28" w:name="X6608f103b7269b53c277fb2462532ecada7a292"/>
-      <w:bookmarkStart w:id="29" w:name="_Toc221111865"/>
+      <w:bookmarkStart w:id="29" w:name="_Toc221120201"/>
       <w:bookmarkEnd w:id="26"/>
       <w:r>
-        <w:t>4.2 Widerstand als Indikator für den „Lack of Fit“</w:t>
+        <w:t xml:space="preserve">4.2 Widerstand als Indikator für den „Lack </w:t>
+      </w:r>
+      <w:proofErr w:type="spellStart"/>
+      <w:r>
+        <w:t>of</w:t>
+      </w:r>
+      <w:proofErr w:type="spellEnd"/>
+      <w:r>
+        <w:t xml:space="preserve"> Fit“</w:t>
       </w:r>
       <w:bookmarkEnd w:id="29"/>
     </w:p>
@@ -3884,12 +4477,28 @@
           <w:lang w:val="de-DE"/>
         </w:rPr>
       </w:pPr>
+      <w:proofErr w:type="spellStart"/>
       <w:r>
         <w:rPr>
           <w:rFonts w:ascii="Arial" w:hAnsi="Arial" w:cs="Arial"/>
           <w:lang w:val="de-DE"/>
         </w:rPr>
-        <w:t>Entpathologisiert transformiert sich Widerstand in ein präzises Datensignal für einen „Lack of Fit“. Er zeigt an, wo die Systemlogik die Verbindung zur Realität verloren hat (ökonomisch, soziokulturell oder machtpolitisch).</w:t>
+        <w:t>Entpathologisiert</w:t>
+      </w:r>
+      <w:proofErr w:type="spellEnd"/>
+      <w:r>
+        <w:rPr>
+          <w:rFonts w:ascii="Arial" w:hAnsi="Arial" w:cs="Arial"/>
+          <w:lang w:val="de-DE"/>
+        </w:rPr>
+        <w:t xml:space="preserve"> </w:t>
+      </w:r>
+      <w:r>
+        <w:rPr>
+          <w:rFonts w:ascii="Arial" w:hAnsi="Arial" w:cs="Arial"/>
+          <w:lang w:val="de-DE"/>
+        </w:rPr>
+        <w:t>man Widerstand, wird er zu einer wertvollen Datenquelle. Er zeigt präzise an, wo die Intervention die Realität der Zielgruppe verfehlt.</w:t>
       </w:r>
     </w:p>
     <w:p>
@@ -3899,6 +4508,8 @@
         <w:jc w:val="both"/>
         <w:rPr>
           <w:rFonts w:ascii="Arial" w:hAnsi="Arial" w:cs="Arial"/>
+          <w:b/>
+          <w:bCs/>
           <w:lang w:val="de-DE"/>
         </w:rPr>
       </w:pPr>
@@ -3914,112 +4525,41 @@
     </w:p>
     <w:p>
       <w:pPr>
-        <w:pStyle w:val="SourceCode"/>
+        <w:pStyle w:val="Textkrper"/>
         <w:spacing w:line="480" w:lineRule="auto"/>
         <w:jc w:val="both"/>
         <w:rPr>
           <w:rFonts w:ascii="Arial" w:hAnsi="Arial" w:cs="Arial"/>
-          <w:sz w:val="24"/>
+          <w:lang w:val="de-DE"/>
         </w:rPr>
       </w:pPr>
-      <w:r>
+    </w:p>
+    <w:p>
+      <w:pPr>
         <w:rPr>
           <w:rStyle w:val="VerbatimChar"/>
           <w:rFonts w:ascii="Arial" w:hAnsi="Arial" w:cs="Arial"/>
           <w:sz w:val="24"/>
         </w:rPr>
-        <w:t xml:space="preserve">       </w:t>
-      </w:r>
+      </w:pPr>
       <w:r>
         <w:rPr>
           <w:rStyle w:val="VerbatimChar"/>
           <w:rFonts w:ascii="Arial" w:hAnsi="Arial" w:cs="Arial"/>
           <w:sz w:val="24"/>
-          <w:lang w:val="en-US"/>
-        </w:rPr>
-        <w:t xml:space="preserve">[ 1. INTERVENTION ] -&gt; [ 2. </w:t>
-      </w:r>
-      <w:r>
-        <w:rPr>
-          <w:rStyle w:val="VerbatimChar"/>
-          <w:rFonts w:ascii="Arial" w:hAnsi="Arial" w:cs="Arial"/>
-          <w:sz w:val="24"/>
-          <w:lang w:val="en-US"/>
-        </w:rPr>
-        <w:t>LACK OF FIT ] -&gt; [ 3. WIDERSTAND ]</w:t>
-      </w:r>
-      <w:r>
-        <w:rPr>
-          <w:rFonts w:ascii="Arial" w:hAnsi="Arial" w:cs="Arial"/>
-          <w:sz w:val="24"/>
-          <w:lang w:val="en-US"/>
-        </w:rPr>
-        <w:br/>
-      </w:r>
-      <w:r>
-        <w:rPr>
-          <w:rStyle w:val="VerbatimChar"/>
-          <w:rFonts w:ascii="Arial" w:hAnsi="Arial" w:cs="Arial"/>
-          <w:sz w:val="24"/>
-          <w:lang w:val="en-US"/>
-        </w:rPr>
-        <w:t xml:space="preserve">                                                        |</w:t>
-      </w:r>
-      <w:r>
-        <w:rPr>
-          <w:rFonts w:ascii="Arial" w:hAnsi="Arial" w:cs="Arial"/>
-          <w:sz w:val="24"/>
-          <w:lang w:val="en-US"/>
-        </w:rPr>
-        <w:br/>
-      </w:r>
-      <w:r>
-        <w:rPr>
-          <w:rStyle w:val="VerbatimChar"/>
-          <w:rFonts w:ascii="Arial" w:hAnsi="Arial" w:cs="Arial"/>
-          <w:sz w:val="24"/>
-          <w:lang w:val="en-US"/>
-        </w:rPr>
-        <w:t xml:space="preserve">       [ 5. </w:t>
-      </w:r>
-      <w:r>
-        <w:rPr>
-          <w:rStyle w:val="VerbatimChar"/>
-          <w:rFonts w:ascii="Arial" w:hAnsi="Arial" w:cs="Arial"/>
-          <w:sz w:val="24"/>
-          <w:lang w:val="de-DE"/>
-        </w:rPr>
-        <w:t xml:space="preserve">ADAPTATION ]   &lt;- [ 4. </w:t>
-      </w:r>
-      <w:r>
-        <w:rPr>
-          <w:rStyle w:val="VerbatimChar"/>
-          <w:rFonts w:ascii="Arial" w:hAnsi="Arial" w:cs="Arial"/>
-          <w:sz w:val="24"/>
-        </w:rPr>
-        <w:t xml:space="preserve">SIGNAL-ANALYSE ] &lt;--- </w:t>
+        </w:rPr>
+        <w:br w:type="page"/>
       </w:r>
     </w:p>
     <w:p>
       <w:pPr>
         <w:pStyle w:val="berschrift2"/>
-        <w:spacing w:line="480" w:lineRule="auto"/>
-        <w:jc w:val="both"/>
-        <w:rPr>
-          <w:rFonts w:ascii="Arial" w:hAnsi="Arial" w:cs="Arial"/>
-          <w:sz w:val="24"/>
-          <w:szCs w:val="24"/>
-        </w:rPr>
       </w:pPr>
       <w:bookmarkStart w:id="30" w:name="X3b11497e54e33a94de7d4cc890bc16cce621925"/>
-      <w:bookmarkStart w:id="31" w:name="_Toc221111866"/>
+      <w:bookmarkStart w:id="31" w:name="_Toc221120202"/>
       <w:bookmarkEnd w:id="28"/>
       <w:r>
-        <w:rPr>
-          <w:rFonts w:ascii="Arial" w:hAnsi="Arial" w:cs="Arial"/>
-          <w:sz w:val="24"/>
-          <w:szCs w:val="24"/>
-        </w:rPr>
+        <w:lastRenderedPageBreak/>
         <w:t>4.3 Statistische Evidenz (Mahmoodi et al. 2023)</w:t>
       </w:r>
       <w:bookmarkEnd w:id="31"/>
@@ -4031,470 +4571,10 @@
         <w:jc w:val="both"/>
         <w:rPr>
           <w:rFonts w:ascii="Arial" w:hAnsi="Arial" w:cs="Arial"/>
-        </w:rPr>
-      </w:pPr>
-      <w:r>
-        <w:rPr>
-          <w:rFonts w:ascii="Arial" w:hAnsi="Arial" w:cs="Arial"/>
-          <w:lang w:val="de-DE"/>
-        </w:rPr>
-        <w:t xml:space="preserve">Mahmoodi et al. belegen, dass Widerstand primär strukturell bedingt ist. </w:t>
-      </w:r>
-      <w:r>
-        <w:rPr>
-          <w:rFonts w:ascii="Arial" w:hAnsi="Arial" w:cs="Arial"/>
-        </w:rPr>
-        <w:t>Ihr Faktorenmodell erklärt 57% der Gesamtvarianz:</w:t>
-      </w:r>
-    </w:p>
-    <w:tbl>
-      <w:tblPr>
-        <w:tblStyle w:val="Table"/>
-        <w:tblW w:w="0" w:type="auto"/>
-        <w:tblLook w:val="0020" w:firstRow="1" w:lastRow="0" w:firstColumn="0" w:lastColumn="0" w:noHBand="0" w:noVBand="0"/>
-      </w:tblPr>
-      <w:tblGrid>
-        <w:gridCol w:w="790"/>
-        <w:gridCol w:w="2675"/>
-        <w:gridCol w:w="1549"/>
-        <w:gridCol w:w="3490"/>
-      </w:tblGrid>
-      <w:tr>
-        <w:trPr>
-          <w:cnfStyle w:val="100000000000" w:firstRow="1" w:lastRow="0" w:firstColumn="0" w:lastColumn="0" w:oddVBand="0" w:evenVBand="0" w:oddHBand="0" w:evenHBand="0" w:firstRowFirstColumn="0" w:firstRowLastColumn="0" w:lastRowFirstColumn="0" w:lastRowLastColumn="0"/>
-          <w:tblHeader/>
-        </w:trPr>
-        <w:tc>
-          <w:tcPr>
-            <w:tcW w:w="0" w:type="auto"/>
-          </w:tcPr>
-          <w:p>
-            <w:pPr>
-              <w:pStyle w:val="Compact"/>
-              <w:spacing w:line="480" w:lineRule="auto"/>
-              <w:jc w:val="both"/>
-              <w:rPr>
-                <w:rFonts w:ascii="Arial" w:hAnsi="Arial" w:cs="Arial"/>
-                <w:sz w:val="24"/>
-                <w:szCs w:val="24"/>
-              </w:rPr>
-            </w:pPr>
-            <w:r>
-              <w:rPr>
-                <w:rFonts w:ascii="Arial" w:hAnsi="Arial" w:cs="Arial"/>
-                <w:sz w:val="24"/>
-                <w:szCs w:val="24"/>
-              </w:rPr>
-              <w:t>Rang</w:t>
-            </w:r>
-          </w:p>
-        </w:tc>
-        <w:tc>
-          <w:tcPr>
-            <w:tcW w:w="0" w:type="auto"/>
-          </w:tcPr>
-          <w:p>
-            <w:pPr>
-              <w:pStyle w:val="Compact"/>
-              <w:spacing w:line="480" w:lineRule="auto"/>
-              <w:jc w:val="both"/>
-              <w:rPr>
-                <w:rFonts w:ascii="Arial" w:hAnsi="Arial" w:cs="Arial"/>
-                <w:sz w:val="24"/>
-                <w:szCs w:val="24"/>
-              </w:rPr>
-            </w:pPr>
-            <w:r>
-              <w:rPr>
-                <w:rFonts w:ascii="Arial" w:hAnsi="Arial" w:cs="Arial"/>
-                <w:sz w:val="24"/>
-                <w:szCs w:val="24"/>
-              </w:rPr>
-              <w:t>Faktor</w:t>
-            </w:r>
-          </w:p>
-        </w:tc>
-        <w:tc>
-          <w:tcPr>
-            <w:tcW w:w="0" w:type="auto"/>
-          </w:tcPr>
-          <w:p>
-            <w:pPr>
-              <w:pStyle w:val="Compact"/>
-              <w:spacing w:line="480" w:lineRule="auto"/>
-              <w:jc w:val="both"/>
-              <w:rPr>
-                <w:rFonts w:ascii="Arial" w:hAnsi="Arial" w:cs="Arial"/>
-                <w:sz w:val="24"/>
-                <w:szCs w:val="24"/>
-              </w:rPr>
-            </w:pPr>
-            <w:r>
-              <w:rPr>
-                <w:rFonts w:ascii="Arial" w:hAnsi="Arial" w:cs="Arial"/>
-                <w:sz w:val="24"/>
-                <w:szCs w:val="24"/>
-              </w:rPr>
-              <w:t>Erklärte Varianz</w:t>
-            </w:r>
-          </w:p>
-        </w:tc>
-        <w:tc>
-          <w:tcPr>
-            <w:tcW w:w="0" w:type="auto"/>
-          </w:tcPr>
-          <w:p>
-            <w:pPr>
-              <w:pStyle w:val="Compact"/>
-              <w:spacing w:line="480" w:lineRule="auto"/>
-              <w:jc w:val="both"/>
-              <w:rPr>
-                <w:rFonts w:ascii="Arial" w:hAnsi="Arial" w:cs="Arial"/>
-                <w:sz w:val="24"/>
-                <w:szCs w:val="24"/>
-              </w:rPr>
-            </w:pPr>
-            <w:r>
-              <w:rPr>
-                <w:rFonts w:ascii="Arial" w:hAnsi="Arial" w:cs="Arial"/>
-                <w:sz w:val="24"/>
-                <w:szCs w:val="24"/>
-              </w:rPr>
-              <w:t>Kern-Aussage</w:t>
-            </w:r>
-          </w:p>
-        </w:tc>
-      </w:tr>
-      <w:tr>
-        <w:tc>
-          <w:tcPr>
-            <w:tcW w:w="0" w:type="auto"/>
-          </w:tcPr>
-          <w:p>
-            <w:pPr>
-              <w:pStyle w:val="Compact"/>
-              <w:spacing w:line="480" w:lineRule="auto"/>
-              <w:jc w:val="both"/>
-              <w:rPr>
-                <w:rFonts w:ascii="Arial" w:hAnsi="Arial" w:cs="Arial"/>
-                <w:sz w:val="24"/>
-                <w:szCs w:val="24"/>
-              </w:rPr>
-            </w:pPr>
-            <w:r>
-              <w:rPr>
-                <w:rFonts w:ascii="Arial" w:hAnsi="Arial" w:cs="Arial"/>
-                <w:b/>
-                <w:bCs/>
-                <w:sz w:val="24"/>
-                <w:szCs w:val="24"/>
-              </w:rPr>
-              <w:t>1</w:t>
-            </w:r>
-          </w:p>
-        </w:tc>
-        <w:tc>
-          <w:tcPr>
-            <w:tcW w:w="0" w:type="auto"/>
-          </w:tcPr>
-          <w:p>
-            <w:pPr>
-              <w:pStyle w:val="Compact"/>
-              <w:spacing w:line="480" w:lineRule="auto"/>
-              <w:jc w:val="both"/>
-              <w:rPr>
-                <w:rFonts w:ascii="Arial" w:hAnsi="Arial" w:cs="Arial"/>
-                <w:sz w:val="24"/>
-                <w:szCs w:val="24"/>
-              </w:rPr>
-            </w:pPr>
-            <w:r>
-              <w:rPr>
-                <w:rFonts w:ascii="Arial" w:hAnsi="Arial" w:cs="Arial"/>
-                <w:b/>
-                <w:bCs/>
-                <w:sz w:val="24"/>
-                <w:szCs w:val="24"/>
-              </w:rPr>
-              <w:t>Institutionelles Misstrauen</w:t>
-            </w:r>
-          </w:p>
-        </w:tc>
-        <w:tc>
-          <w:tcPr>
-            <w:tcW w:w="0" w:type="auto"/>
-          </w:tcPr>
-          <w:p>
-            <w:pPr>
-              <w:pStyle w:val="Compact"/>
-              <w:spacing w:line="480" w:lineRule="auto"/>
-              <w:jc w:val="both"/>
-              <w:rPr>
-                <w:rFonts w:ascii="Arial" w:hAnsi="Arial" w:cs="Arial"/>
-                <w:sz w:val="24"/>
-                <w:szCs w:val="24"/>
-              </w:rPr>
-            </w:pPr>
-            <w:r>
-              <w:rPr>
-                <w:rFonts w:ascii="Arial" w:hAnsi="Arial" w:cs="Arial"/>
-                <w:b/>
-                <w:bCs/>
-                <w:sz w:val="24"/>
-                <w:szCs w:val="24"/>
-              </w:rPr>
-              <w:t>28%</w:t>
-            </w:r>
-          </w:p>
-        </w:tc>
-        <w:tc>
-          <w:tcPr>
-            <w:tcW w:w="0" w:type="auto"/>
-          </w:tcPr>
-          <w:p>
-            <w:pPr>
-              <w:pStyle w:val="Compact"/>
-              <w:spacing w:line="480" w:lineRule="auto"/>
-              <w:jc w:val="both"/>
-              <w:rPr>
-                <w:rFonts w:ascii="Arial" w:hAnsi="Arial" w:cs="Arial"/>
-                <w:sz w:val="24"/>
-                <w:szCs w:val="24"/>
-                <w:lang w:val="de-DE"/>
-              </w:rPr>
-            </w:pPr>
-            <w:r>
-              <w:rPr>
-                <w:rFonts w:ascii="Arial" w:hAnsi="Arial" w:cs="Arial"/>
-                <w:sz w:val="24"/>
-                <w:szCs w:val="24"/>
-                <w:lang w:val="de-DE"/>
-              </w:rPr>
-              <w:t>Staatliches Handeln ist das Hauptproblem.</w:t>
-            </w:r>
-          </w:p>
-        </w:tc>
-      </w:tr>
-      <w:tr>
-        <w:tc>
-          <w:tcPr>
-            <w:tcW w:w="0" w:type="auto"/>
-          </w:tcPr>
-          <w:p>
-            <w:pPr>
-              <w:pStyle w:val="Compact"/>
-              <w:spacing w:line="480" w:lineRule="auto"/>
-              <w:jc w:val="both"/>
-              <w:rPr>
-                <w:rFonts w:ascii="Arial" w:hAnsi="Arial" w:cs="Arial"/>
-                <w:sz w:val="24"/>
-                <w:szCs w:val="24"/>
-              </w:rPr>
-            </w:pPr>
-            <w:r>
-              <w:rPr>
-                <w:rFonts w:ascii="Arial" w:hAnsi="Arial" w:cs="Arial"/>
-                <w:b/>
-                <w:bCs/>
-                <w:sz w:val="24"/>
-                <w:szCs w:val="24"/>
-              </w:rPr>
-              <w:lastRenderedPageBreak/>
-              <w:t>2</w:t>
-            </w:r>
-          </w:p>
-        </w:tc>
-        <w:tc>
-          <w:tcPr>
-            <w:tcW w:w="0" w:type="auto"/>
-          </w:tcPr>
-          <w:p>
-            <w:pPr>
-              <w:pStyle w:val="Compact"/>
-              <w:spacing w:line="480" w:lineRule="auto"/>
-              <w:jc w:val="both"/>
-              <w:rPr>
-                <w:rFonts w:ascii="Arial" w:hAnsi="Arial" w:cs="Arial"/>
-                <w:sz w:val="24"/>
-                <w:szCs w:val="24"/>
-              </w:rPr>
-            </w:pPr>
-            <w:r>
-              <w:rPr>
-                <w:rFonts w:ascii="Arial" w:hAnsi="Arial" w:cs="Arial"/>
-                <w:sz w:val="24"/>
-                <w:szCs w:val="24"/>
-              </w:rPr>
-              <w:t>Programm-Design / Anreize</w:t>
-            </w:r>
-          </w:p>
-        </w:tc>
-        <w:tc>
-          <w:tcPr>
-            <w:tcW w:w="0" w:type="auto"/>
-          </w:tcPr>
-          <w:p>
-            <w:pPr>
-              <w:pStyle w:val="Compact"/>
-              <w:spacing w:line="480" w:lineRule="auto"/>
-              <w:jc w:val="both"/>
-              <w:rPr>
-                <w:rFonts w:ascii="Arial" w:hAnsi="Arial" w:cs="Arial"/>
-                <w:sz w:val="24"/>
-                <w:szCs w:val="24"/>
-              </w:rPr>
-            </w:pPr>
-            <w:r>
-              <w:rPr>
-                <w:rFonts w:ascii="Arial" w:hAnsi="Arial" w:cs="Arial"/>
-                <w:sz w:val="24"/>
-                <w:szCs w:val="24"/>
-              </w:rPr>
-              <w:t>8%</w:t>
-            </w:r>
-          </w:p>
-        </w:tc>
-        <w:tc>
-          <w:tcPr>
-            <w:tcW w:w="0" w:type="auto"/>
-          </w:tcPr>
-          <w:p>
-            <w:pPr>
-              <w:pStyle w:val="Compact"/>
-              <w:spacing w:line="480" w:lineRule="auto"/>
-              <w:jc w:val="both"/>
-              <w:rPr>
-                <w:rFonts w:ascii="Arial" w:hAnsi="Arial" w:cs="Arial"/>
-                <w:sz w:val="24"/>
-                <w:szCs w:val="24"/>
-              </w:rPr>
-            </w:pPr>
-            <w:r>
-              <w:rPr>
-                <w:rFonts w:ascii="Arial" w:hAnsi="Arial" w:cs="Arial"/>
-                <w:sz w:val="24"/>
-                <w:szCs w:val="24"/>
-              </w:rPr>
-              <w:t>Mangelnder ökonomischer Nutzen.</w:t>
-            </w:r>
-          </w:p>
-        </w:tc>
-      </w:tr>
-      <w:tr>
-        <w:tc>
-          <w:tcPr>
-            <w:tcW w:w="0" w:type="auto"/>
-          </w:tcPr>
-          <w:p>
-            <w:pPr>
-              <w:pStyle w:val="Compact"/>
-              <w:spacing w:line="480" w:lineRule="auto"/>
-              <w:jc w:val="both"/>
-              <w:rPr>
-                <w:rFonts w:ascii="Arial" w:hAnsi="Arial" w:cs="Arial"/>
-                <w:sz w:val="24"/>
-                <w:szCs w:val="24"/>
-              </w:rPr>
-            </w:pPr>
-            <w:r>
-              <w:rPr>
-                <w:rFonts w:ascii="Arial" w:hAnsi="Arial" w:cs="Arial"/>
-                <w:b/>
-                <w:bCs/>
-                <w:sz w:val="24"/>
-                <w:szCs w:val="24"/>
-              </w:rPr>
-              <w:t>3</w:t>
-            </w:r>
-          </w:p>
-        </w:tc>
-        <w:tc>
-          <w:tcPr>
-            <w:tcW w:w="0" w:type="auto"/>
-          </w:tcPr>
-          <w:p>
-            <w:pPr>
-              <w:pStyle w:val="Compact"/>
-              <w:spacing w:line="480" w:lineRule="auto"/>
-              <w:jc w:val="both"/>
-              <w:rPr>
-                <w:rFonts w:ascii="Arial" w:hAnsi="Arial" w:cs="Arial"/>
-                <w:sz w:val="24"/>
-                <w:szCs w:val="24"/>
-              </w:rPr>
-            </w:pPr>
-            <w:r>
-              <w:rPr>
-                <w:rFonts w:ascii="Arial" w:hAnsi="Arial" w:cs="Arial"/>
-                <w:sz w:val="24"/>
-                <w:szCs w:val="24"/>
-              </w:rPr>
-              <w:t>Management-Skills</w:t>
-            </w:r>
-          </w:p>
-        </w:tc>
-        <w:tc>
-          <w:tcPr>
-            <w:tcW w:w="0" w:type="auto"/>
-          </w:tcPr>
-          <w:p>
-            <w:pPr>
-              <w:pStyle w:val="Compact"/>
-              <w:spacing w:line="480" w:lineRule="auto"/>
-              <w:jc w:val="both"/>
-              <w:rPr>
-                <w:rFonts w:ascii="Arial" w:hAnsi="Arial" w:cs="Arial"/>
-                <w:sz w:val="24"/>
-                <w:szCs w:val="24"/>
-              </w:rPr>
-            </w:pPr>
-            <w:r>
-              <w:rPr>
-                <w:rFonts w:ascii="Arial" w:hAnsi="Arial" w:cs="Arial"/>
-                <w:sz w:val="24"/>
-                <w:szCs w:val="24"/>
-              </w:rPr>
-              <w:t>8%</w:t>
-            </w:r>
-          </w:p>
-        </w:tc>
-        <w:tc>
-          <w:tcPr>
-            <w:tcW w:w="0" w:type="auto"/>
-          </w:tcPr>
-          <w:p>
-            <w:pPr>
-              <w:pStyle w:val="Compact"/>
-              <w:spacing w:line="480" w:lineRule="auto"/>
-              <w:jc w:val="both"/>
-              <w:rPr>
-                <w:rFonts w:ascii="Arial" w:hAnsi="Arial" w:cs="Arial"/>
-                <w:sz w:val="24"/>
-                <w:szCs w:val="24"/>
-              </w:rPr>
-            </w:pPr>
-            <w:r>
-              <w:rPr>
-                <w:rFonts w:ascii="Arial" w:hAnsi="Arial" w:cs="Arial"/>
-                <w:sz w:val="24"/>
-                <w:szCs w:val="24"/>
-              </w:rPr>
-              <w:t>Fehlende Koordination.</w:t>
-            </w:r>
-          </w:p>
-        </w:tc>
-      </w:tr>
-    </w:tbl>
-    <w:p>
-      <w:pPr>
-        <w:pStyle w:val="Textkrper"/>
-        <w:spacing w:line="480" w:lineRule="auto"/>
-        <w:jc w:val="both"/>
-        <w:rPr>
-          <w:rFonts w:ascii="Arial" w:hAnsi="Arial" w:cs="Arial"/>
           <w:b/>
           <w:bCs/>
           <w:color w:val="000000"/>
+          <w:lang w:val="de-DE"/>
         </w:rPr>
       </w:pPr>
       <w:r>
@@ -4502,7 +4582,7 @@
           <w:rFonts w:ascii="Arial" w:hAnsi="Arial" w:cs="Arial"/>
           <w:lang w:val="de-DE"/>
         </w:rPr>
-        <w:t>Dass 28% der Barrieren auf Misstrauen basieren, zeigt: Widerstand ist eine rationale politische Reaktion auf ein unzuverlässiges System.</w:t>
+        <w:t>Mahmoodi et al. (2023) liefern die quantitative Untermauerung für diese These. Ihr Modell erklärt 57% der Barrieren-Varianz, wobei „Institutionelles Misstrauen“ mit 28% den stärksten Einzelfaktor bildet. Dies belegt: Widerstand ist selten ein Wissensproblem, sondern eine politische Reaktion auf ein als unzuverlässig oder übergriffig wahrgenommenes System.</w:t>
       </w:r>
       <w:bookmarkStart w:id="32" w:name="fallstudie-itn-distribution-in-uganda"/>
       <w:bookmarkEnd w:id="24"/>
@@ -4510,6 +4590,7 @@
       <w:r>
         <w:rPr>
           <w:rFonts w:ascii="Arial" w:hAnsi="Arial" w:cs="Arial"/>
+          <w:lang w:val="de-DE"/>
         </w:rPr>
         <w:br w:type="page"/>
       </w:r>
@@ -4518,7 +4599,7 @@
       <w:pPr>
         <w:pStyle w:val="berschrift1"/>
       </w:pPr>
-      <w:bookmarkStart w:id="33" w:name="_Toc221111867"/>
+      <w:bookmarkStart w:id="33" w:name="_Toc221120203"/>
       <w:r>
         <w:lastRenderedPageBreak/>
         <w:t>5. Fallstudie: ITN-Distribution in Uganda</w:t>
@@ -4530,7 +4611,7 @@
         <w:pStyle w:val="berschrift2"/>
       </w:pPr>
       <w:bookmarkStart w:id="34" w:name="die-ökonomische-realität-am-victoriasee"/>
-      <w:bookmarkStart w:id="35" w:name="_Toc221111868"/>
+      <w:bookmarkStart w:id="35" w:name="_Toc221120204"/>
       <w:r>
         <w:t>5.1 Die ökonomische Realität am Victoriasee</w:t>
       </w:r>
@@ -4551,8 +4632,32 @@
           <w:rFonts w:ascii="Arial" w:hAnsi="Arial" w:cs="Arial"/>
           <w:lang w:val="de-DE"/>
         </w:rPr>
-        <w:t xml:space="preserve">Am Victoriasee kollidiert die </w:t>
-      </w:r>
+        <w:t xml:space="preserve">Die ITN-Kampagnen in den Fischergemeinden am Victoriasee illustrieren den Zusammenprall von </w:t>
+      </w:r>
+      <w:proofErr w:type="spellStart"/>
+      <w:r>
+        <w:rPr>
+          <w:rFonts w:ascii="Arial" w:hAnsi="Arial" w:cs="Arial"/>
+          <w:lang w:val="de-DE"/>
+        </w:rPr>
+        <w:t>Anatomo</w:t>
+      </w:r>
+      <w:proofErr w:type="spellEnd"/>
+      <w:r>
+        <w:rPr>
+          <w:rFonts w:ascii="Arial" w:hAnsi="Arial" w:cs="Arial"/>
+          <w:lang w:val="de-DE"/>
+        </w:rPr>
+        <w:t>-Politik und Überlebensökonomie drastisch. Für die Geber ist das Netz ein medizinisches Gerät zum Schutz eines schlafenden Körpers. Für den Fischer ist es ein hochwertiges Produktionsmittel in einem Kontext extremer Ressourcenknappheit.</w:t>
+      </w:r>
+    </w:p>
+    <w:p>
+      <w:pPr>
+        <w:pStyle w:val="Textkrper"/>
+        <w:rPr>
+          <w:lang w:val="de-DE"/>
+        </w:rPr>
+      </w:pPr>
       <w:r>
         <w:rPr>
           <w:rFonts w:ascii="Arial" w:hAnsi="Arial" w:cs="Arial"/>
@@ -4560,88 +4665,55 @@
           <w:bCs/>
           <w:lang w:val="de-DE"/>
         </w:rPr>
-        <w:t>anatomo-politische Zielsetzung</w:t>
-      </w:r>
-      <w:r>
-        <w:rPr>
-          <w:rFonts w:ascii="Arial" w:hAnsi="Arial" w:cs="Arial"/>
-          <w:lang w:val="de-DE"/>
-        </w:rPr>
-        <w:t xml:space="preserve"> der Geber (der disziplinierte, unter dem Netz schlafende Körper) frontal mit der </w:t>
-      </w:r>
-      <w:r>
-        <w:rPr>
-          <w:rFonts w:ascii="Arial" w:hAnsi="Arial" w:cs="Arial"/>
-          <w:b/>
-          <w:bCs/>
-          <w:lang w:val="de-DE"/>
-        </w:rPr>
-        <w:t>lebensweltlichen Überlebensrationalität</w:t>
-      </w:r>
-      <w:r>
-        <w:rPr>
-          <w:rFonts w:ascii="Arial" w:hAnsi="Arial" w:cs="Arial"/>
-          <w:lang w:val="de-DE"/>
-        </w:rPr>
-        <w:t>.</w:t>
-      </w:r>
-    </w:p>
-    <w:p>
-      <w:pPr>
-        <w:pStyle w:val="Textkrper"/>
-        <w:spacing w:line="480" w:lineRule="auto"/>
-        <w:jc w:val="both"/>
-        <w:rPr>
-          <w:rFonts w:ascii="Arial" w:hAnsi="Arial" w:cs="Arial"/>
-          <w:lang w:val="de-DE"/>
-        </w:rPr>
-      </w:pPr>
-      <w:r>
-        <w:rPr>
-          <w:rFonts w:ascii="Arial" w:hAnsi="Arial" w:cs="Arial"/>
-          <w:b/>
-          <w:bCs/>
-          <w:lang w:val="de-DE"/>
-        </w:rPr>
         <w:t>Tabelle 3: Kosten-Nutzen-Analyse des Fischers (Uganda)</w:t>
       </w:r>
     </w:p>
     <w:tbl>
       <w:tblPr>
-        <w:tblStyle w:val="Table"/>
         <w:tblW w:w="0" w:type="auto"/>
-        <w:tblLook w:val="0020" w:firstRow="1" w:lastRow="0" w:firstColumn="0" w:lastColumn="0" w:noHBand="0" w:noVBand="0"/>
+        <w:tblCellSpacing w:w="15" w:type="dxa"/>
+        <w:tblCellMar>
+          <w:top w:w="15" w:type="dxa"/>
+          <w:left w:w="15" w:type="dxa"/>
+          <w:bottom w:w="15" w:type="dxa"/>
+          <w:right w:w="15" w:type="dxa"/>
+        </w:tblCellMar>
+        <w:tblLook w:val="04A0" w:firstRow="1" w:lastRow="0" w:firstColumn="1" w:lastColumn="0" w:noHBand="0" w:noVBand="1"/>
       </w:tblPr>
       <w:tblGrid>
-        <w:gridCol w:w="1496"/>
-        <w:gridCol w:w="3111"/>
-        <w:gridCol w:w="3564"/>
+        <w:gridCol w:w="1635"/>
+        <w:gridCol w:w="3316"/>
+        <w:gridCol w:w="3537"/>
       </w:tblGrid>
       <w:tr>
         <w:trPr>
-          <w:cnfStyle w:val="100000000000" w:firstRow="1" w:lastRow="0" w:firstColumn="0" w:lastColumn="0" w:oddVBand="0" w:evenVBand="0" w:oddHBand="0" w:evenHBand="0" w:firstRowFirstColumn="0" w:firstRowLastColumn="0" w:lastRowFirstColumn="0" w:lastRowLastColumn="0"/>
           <w:tblHeader/>
+          <w:tblCellSpacing w:w="15" w:type="dxa"/>
         </w:trPr>
         <w:tc>
           <w:tcPr>
             <w:tcW w:w="0" w:type="auto"/>
+            <w:tcBorders>
+              <w:top w:val="single" w:sz="6" w:space="0" w:color="auto"/>
+              <w:left w:val="single" w:sz="6" w:space="0" w:color="auto"/>
+              <w:bottom w:val="single" w:sz="6" w:space="0" w:color="auto"/>
+              <w:right w:val="single" w:sz="6" w:space="0" w:color="auto"/>
+            </w:tcBorders>
+            <w:vAlign w:val="center"/>
+            <w:hideMark/>
           </w:tcPr>
           <w:p>
             <w:pPr>
-              <w:pStyle w:val="Compact"/>
-              <w:spacing w:line="480" w:lineRule="auto"/>
-              <w:jc w:val="both"/>
-              <w:rPr>
-                <w:rFonts w:ascii="Arial" w:hAnsi="Arial" w:cs="Arial"/>
-                <w:sz w:val="24"/>
-                <w:szCs w:val="24"/>
+              <w:pStyle w:val="Textkrper"/>
+              <w:rPr>
+                <w:lang w:val="de-DE"/>
               </w:rPr>
             </w:pPr>
             <w:r>
               <w:rPr>
-                <w:rFonts w:ascii="Arial" w:hAnsi="Arial" w:cs="Arial"/>
-                <w:sz w:val="24"/>
-                <w:szCs w:val="24"/>
+                <w:b/>
+                <w:bCs/>
+                <w:lang w:val="de-DE"/>
               </w:rPr>
               <w:t>Faktor</w:t>
             </w:r>
@@ -4650,48 +4722,56 @@
         <w:tc>
           <w:tcPr>
             <w:tcW w:w="0" w:type="auto"/>
+            <w:tcBorders>
+              <w:top w:val="single" w:sz="6" w:space="0" w:color="auto"/>
+              <w:left w:val="single" w:sz="6" w:space="0" w:color="auto"/>
+              <w:bottom w:val="single" w:sz="6" w:space="0" w:color="auto"/>
+              <w:right w:val="single" w:sz="6" w:space="0" w:color="auto"/>
+            </w:tcBorders>
+            <w:vAlign w:val="center"/>
+            <w:hideMark/>
           </w:tcPr>
           <w:p>
             <w:pPr>
-              <w:pStyle w:val="Compact"/>
-              <w:spacing w:line="480" w:lineRule="auto"/>
-              <w:jc w:val="both"/>
-              <w:rPr>
-                <w:rFonts w:ascii="Arial" w:hAnsi="Arial" w:cs="Arial"/>
-                <w:sz w:val="24"/>
-                <w:szCs w:val="24"/>
+              <w:pStyle w:val="Textkrper"/>
+              <w:rPr>
+                <w:lang w:val="de-DE"/>
               </w:rPr>
             </w:pPr>
             <w:r>
               <w:rPr>
-                <w:rFonts w:ascii="Arial" w:hAnsi="Arial" w:cs="Arial"/>
-                <w:sz w:val="24"/>
-                <w:szCs w:val="24"/>
-              </w:rPr>
-              <w:t>Perspektive Global Health</w:t>
+                <w:b/>
+                <w:bCs/>
+                <w:lang w:val="de-DE"/>
+              </w:rPr>
+              <w:t>Perspektive Global Health (Geber)</w:t>
             </w:r>
           </w:p>
         </w:tc>
         <w:tc>
           <w:tcPr>
             <w:tcW w:w="0" w:type="auto"/>
+            <w:tcBorders>
+              <w:top w:val="single" w:sz="6" w:space="0" w:color="auto"/>
+              <w:left w:val="single" w:sz="6" w:space="0" w:color="auto"/>
+              <w:bottom w:val="single" w:sz="6" w:space="0" w:color="auto"/>
+              <w:right w:val="single" w:sz="6" w:space="0" w:color="auto"/>
+            </w:tcBorders>
+            <w:vAlign w:val="center"/>
+            <w:hideMark/>
           </w:tcPr>
           <w:p>
             <w:pPr>
-              <w:pStyle w:val="Compact"/>
-              <w:spacing w:line="480" w:lineRule="auto"/>
-              <w:jc w:val="both"/>
-              <w:rPr>
-                <w:rFonts w:ascii="Arial" w:hAnsi="Arial" w:cs="Arial"/>
-                <w:sz w:val="24"/>
-                <w:szCs w:val="24"/>
+              <w:pStyle w:val="Textkrper"/>
+              <w:rPr>
+                <w:lang w:val="de-DE"/>
               </w:rPr>
             </w:pPr>
             <w:r>
               <w:rPr>
-                <w:rFonts w:ascii="Arial" w:hAnsi="Arial" w:cs="Arial"/>
-                <w:sz w:val="24"/>
-                <w:szCs w:val="24"/>
+                <w:b/>
+                <w:bCs/>
+                <w:lang w:val="de-DE"/>
               </w:rPr>
               <w:t>Perspektive Fischer (Uganda)</w:t>
             </w:r>
@@ -4699,28 +4779,33 @@
         </w:tc>
       </w:tr>
       <w:tr>
+        <w:trPr>
+          <w:tblCellSpacing w:w="15" w:type="dxa"/>
+        </w:trPr>
         <w:tc>
           <w:tcPr>
             <w:tcW w:w="0" w:type="auto"/>
+            <w:tcBorders>
+              <w:top w:val="single" w:sz="6" w:space="0" w:color="auto"/>
+              <w:left w:val="single" w:sz="6" w:space="0" w:color="auto"/>
+              <w:bottom w:val="single" w:sz="6" w:space="0" w:color="auto"/>
+              <w:right w:val="single" w:sz="6" w:space="0" w:color="auto"/>
+            </w:tcBorders>
+            <w:vAlign w:val="center"/>
+            <w:hideMark/>
           </w:tcPr>
           <w:p>
             <w:pPr>
-              <w:pStyle w:val="Compact"/>
-              <w:spacing w:line="480" w:lineRule="auto"/>
-              <w:jc w:val="both"/>
-              <w:rPr>
-                <w:rFonts w:ascii="Arial" w:hAnsi="Arial" w:cs="Arial"/>
-                <w:sz w:val="24"/>
-                <w:szCs w:val="24"/>
+              <w:pStyle w:val="Textkrper"/>
+              <w:rPr>
+                <w:lang w:val="de-DE"/>
               </w:rPr>
             </w:pPr>
             <w:r>
               <w:rPr>
-                <w:rFonts w:ascii="Arial" w:hAnsi="Arial" w:cs="Arial"/>
                 <w:b/>
                 <w:bCs/>
-                <w:sz w:val="24"/>
-                <w:szCs w:val="24"/>
+                <w:lang w:val="de-DE"/>
               </w:rPr>
               <w:t>Ressource</w:t>
             </w:r>
@@ -4729,23 +4814,25 @@
         <w:tc>
           <w:tcPr>
             <w:tcW w:w="0" w:type="auto"/>
+            <w:tcBorders>
+              <w:top w:val="single" w:sz="6" w:space="0" w:color="auto"/>
+              <w:left w:val="single" w:sz="6" w:space="0" w:color="auto"/>
+              <w:bottom w:val="single" w:sz="6" w:space="0" w:color="auto"/>
+              <w:right w:val="single" w:sz="6" w:space="0" w:color="auto"/>
+            </w:tcBorders>
+            <w:vAlign w:val="center"/>
+            <w:hideMark/>
           </w:tcPr>
           <w:p>
             <w:pPr>
-              <w:pStyle w:val="Compact"/>
-              <w:spacing w:line="480" w:lineRule="auto"/>
-              <w:jc w:val="both"/>
-              <w:rPr>
-                <w:rFonts w:ascii="Arial" w:hAnsi="Arial" w:cs="Arial"/>
-                <w:sz w:val="24"/>
-                <w:szCs w:val="24"/>
+              <w:pStyle w:val="Textkrper"/>
+              <w:rPr>
+                <w:lang w:val="de-DE"/>
               </w:rPr>
             </w:pPr>
             <w:r>
               <w:rPr>
-                <w:rFonts w:ascii="Arial" w:hAnsi="Arial" w:cs="Arial"/>
-                <w:sz w:val="24"/>
-                <w:szCs w:val="24"/>
+                <w:lang w:val="de-DE"/>
               </w:rPr>
               <w:t>Moskitonetz (Prävention)</w:t>
             </w:r>
@@ -4754,23 +4841,25 @@
         <w:tc>
           <w:tcPr>
             <w:tcW w:w="0" w:type="auto"/>
+            <w:tcBorders>
+              <w:top w:val="single" w:sz="6" w:space="0" w:color="auto"/>
+              <w:left w:val="single" w:sz="6" w:space="0" w:color="auto"/>
+              <w:bottom w:val="single" w:sz="6" w:space="0" w:color="auto"/>
+              <w:right w:val="single" w:sz="6" w:space="0" w:color="auto"/>
+            </w:tcBorders>
+            <w:vAlign w:val="center"/>
+            <w:hideMark/>
           </w:tcPr>
           <w:p>
             <w:pPr>
-              <w:pStyle w:val="Compact"/>
-              <w:spacing w:line="480" w:lineRule="auto"/>
-              <w:jc w:val="both"/>
-              <w:rPr>
-                <w:rFonts w:ascii="Arial" w:hAnsi="Arial" w:cs="Arial"/>
-                <w:sz w:val="24"/>
-                <w:szCs w:val="24"/>
+              <w:pStyle w:val="Textkrper"/>
+              <w:rPr>
+                <w:lang w:val="de-DE"/>
               </w:rPr>
             </w:pPr>
             <w:r>
               <w:rPr>
-                <w:rFonts w:ascii="Arial" w:hAnsi="Arial" w:cs="Arial"/>
-                <w:sz w:val="24"/>
-                <w:szCs w:val="24"/>
+                <w:lang w:val="de-DE"/>
               </w:rPr>
               <w:t>Moskitonetz (Produktionsmittel)</w:t>
             </w:r>
@@ -4778,28 +4867,33 @@
         </w:tc>
       </w:tr>
       <w:tr>
+        <w:trPr>
+          <w:tblCellSpacing w:w="15" w:type="dxa"/>
+        </w:trPr>
         <w:tc>
           <w:tcPr>
             <w:tcW w:w="0" w:type="auto"/>
+            <w:tcBorders>
+              <w:top w:val="single" w:sz="6" w:space="0" w:color="auto"/>
+              <w:left w:val="single" w:sz="6" w:space="0" w:color="auto"/>
+              <w:bottom w:val="single" w:sz="6" w:space="0" w:color="auto"/>
+              <w:right w:val="single" w:sz="6" w:space="0" w:color="auto"/>
+            </w:tcBorders>
+            <w:vAlign w:val="center"/>
+            <w:hideMark/>
           </w:tcPr>
           <w:p>
             <w:pPr>
-              <w:pStyle w:val="Compact"/>
-              <w:spacing w:line="480" w:lineRule="auto"/>
-              <w:jc w:val="both"/>
-              <w:rPr>
-                <w:rFonts w:ascii="Arial" w:hAnsi="Arial" w:cs="Arial"/>
-                <w:sz w:val="24"/>
-                <w:szCs w:val="24"/>
+              <w:pStyle w:val="Textkrper"/>
+              <w:rPr>
+                <w:lang w:val="de-DE"/>
               </w:rPr>
             </w:pPr>
             <w:r>
               <w:rPr>
-                <w:rFonts w:ascii="Arial" w:hAnsi="Arial" w:cs="Arial"/>
                 <w:b/>
                 <w:bCs/>
-                <w:sz w:val="24"/>
-                <w:szCs w:val="24"/>
+                <w:lang w:val="de-DE"/>
               </w:rPr>
               <w:t>Bedrohung</w:t>
             </w:r>
@@ -4808,23 +4902,25 @@
         <w:tc>
           <w:tcPr>
             <w:tcW w:w="0" w:type="auto"/>
+            <w:tcBorders>
+              <w:top w:val="single" w:sz="6" w:space="0" w:color="auto"/>
+              <w:left w:val="single" w:sz="6" w:space="0" w:color="auto"/>
+              <w:bottom w:val="single" w:sz="6" w:space="0" w:color="auto"/>
+              <w:right w:val="single" w:sz="6" w:space="0" w:color="auto"/>
+            </w:tcBorders>
+            <w:vAlign w:val="center"/>
+            <w:hideMark/>
           </w:tcPr>
           <w:p>
             <w:pPr>
-              <w:pStyle w:val="Compact"/>
-              <w:spacing w:line="480" w:lineRule="auto"/>
-              <w:jc w:val="both"/>
-              <w:rPr>
-                <w:rFonts w:ascii="Arial" w:hAnsi="Arial" w:cs="Arial"/>
-                <w:sz w:val="24"/>
-                <w:szCs w:val="24"/>
+              <w:pStyle w:val="Textkrper"/>
+              <w:rPr>
+                <w:lang w:val="de-DE"/>
               </w:rPr>
             </w:pPr>
             <w:r>
               <w:rPr>
-                <w:rFonts w:ascii="Arial" w:hAnsi="Arial" w:cs="Arial"/>
-                <w:sz w:val="24"/>
-                <w:szCs w:val="24"/>
+                <w:lang w:val="de-DE"/>
               </w:rPr>
               <w:t>Malaria (abstrakt/zukünftig)</w:t>
             </w:r>
@@ -4833,104 +4929,123 @@
         <w:tc>
           <w:tcPr>
             <w:tcW w:w="0" w:type="auto"/>
+            <w:tcBorders>
+              <w:top w:val="single" w:sz="6" w:space="0" w:color="auto"/>
+              <w:left w:val="single" w:sz="6" w:space="0" w:color="auto"/>
+              <w:bottom w:val="single" w:sz="6" w:space="0" w:color="auto"/>
+              <w:right w:val="single" w:sz="6" w:space="0" w:color="auto"/>
+            </w:tcBorders>
+            <w:vAlign w:val="center"/>
+            <w:hideMark/>
           </w:tcPr>
           <w:p>
             <w:pPr>
-              <w:pStyle w:val="Compact"/>
-              <w:spacing w:line="480" w:lineRule="auto"/>
-              <w:jc w:val="both"/>
-              <w:rPr>
-                <w:rFonts w:ascii="Arial" w:hAnsi="Arial" w:cs="Arial"/>
-                <w:sz w:val="24"/>
-                <w:szCs w:val="24"/>
+              <w:pStyle w:val="Textkrper"/>
+              <w:rPr>
+                <w:lang w:val="de-DE"/>
               </w:rPr>
             </w:pPr>
             <w:r>
               <w:rPr>
-                <w:rFonts w:ascii="Arial" w:hAnsi="Arial" w:cs="Arial"/>
-                <w:sz w:val="24"/>
-                <w:szCs w:val="24"/>
-              </w:rPr>
-              <w:t>Hunger (konkret/unmittelbar)</w:t>
+                <w:b/>
+                <w:bCs/>
+                <w:lang w:val="de-DE"/>
+              </w:rPr>
+              <w:t>Hunger</w:t>
+            </w:r>
+            <w:r>
+              <w:rPr>
+                <w:lang w:val="de-DE"/>
+              </w:rPr>
+              <w:t xml:space="preserve"> (konkret/unmittelbar)</w:t>
             </w:r>
           </w:p>
         </w:tc>
       </w:tr>
       <w:tr>
+        <w:trPr>
+          <w:tblCellSpacing w:w="15" w:type="dxa"/>
+        </w:trPr>
         <w:tc>
           <w:tcPr>
             <w:tcW w:w="0" w:type="auto"/>
+            <w:tcBorders>
+              <w:top w:val="single" w:sz="6" w:space="0" w:color="auto"/>
+              <w:left w:val="single" w:sz="6" w:space="0" w:color="auto"/>
+              <w:bottom w:val="single" w:sz="6" w:space="0" w:color="auto"/>
+              <w:right w:val="single" w:sz="6" w:space="0" w:color="auto"/>
+            </w:tcBorders>
+            <w:vAlign w:val="center"/>
+            <w:hideMark/>
           </w:tcPr>
           <w:p>
             <w:pPr>
-              <w:pStyle w:val="Compact"/>
-              <w:spacing w:line="480" w:lineRule="auto"/>
-              <w:jc w:val="both"/>
-              <w:rPr>
-                <w:rFonts w:ascii="Arial" w:hAnsi="Arial" w:cs="Arial"/>
-                <w:sz w:val="24"/>
-                <w:szCs w:val="24"/>
+              <w:pStyle w:val="Textkrper"/>
+              <w:rPr>
+                <w:lang w:val="de-DE"/>
               </w:rPr>
             </w:pPr>
             <w:r>
               <w:rPr>
-                <w:rFonts w:ascii="Arial" w:hAnsi="Arial" w:cs="Arial"/>
                 <w:b/>
                 <w:bCs/>
-                <w:sz w:val="24"/>
-                <w:szCs w:val="24"/>
-              </w:rPr>
-              <w:t>Bewertung</w:t>
+                <w:lang w:val="de-DE"/>
+              </w:rPr>
+              <w:t>Handlungslogik</w:t>
             </w:r>
           </w:p>
         </w:tc>
         <w:tc>
           <w:tcPr>
             <w:tcW w:w="0" w:type="auto"/>
+            <w:tcBorders>
+              <w:top w:val="single" w:sz="6" w:space="0" w:color="auto"/>
+              <w:left w:val="single" w:sz="6" w:space="0" w:color="auto"/>
+              <w:bottom w:val="single" w:sz="6" w:space="0" w:color="auto"/>
+              <w:right w:val="single" w:sz="6" w:space="0" w:color="auto"/>
+            </w:tcBorders>
+            <w:vAlign w:val="center"/>
+            <w:hideMark/>
           </w:tcPr>
           <w:p>
             <w:pPr>
-              <w:pStyle w:val="Compact"/>
-              <w:spacing w:line="480" w:lineRule="auto"/>
-              <w:jc w:val="both"/>
-              <w:rPr>
-                <w:rFonts w:ascii="Arial" w:hAnsi="Arial" w:cs="Arial"/>
-                <w:sz w:val="24"/>
-                <w:szCs w:val="24"/>
+              <w:pStyle w:val="Textkrper"/>
+              <w:rPr>
+                <w:lang w:val="de-DE"/>
               </w:rPr>
             </w:pPr>
             <w:r>
               <w:rPr>
-                <w:rFonts w:ascii="Arial" w:hAnsi="Arial" w:cs="Arial"/>
-                <w:sz w:val="24"/>
-                <w:szCs w:val="24"/>
-              </w:rPr>
-              <w:t>Irrationales Verhalten</w:t>
+                <w:lang w:val="de-DE"/>
+              </w:rPr>
+              <w:t>Biomedizinische Rationalität</w:t>
             </w:r>
           </w:p>
         </w:tc>
         <w:tc>
           <w:tcPr>
             <w:tcW w:w="0" w:type="auto"/>
+            <w:tcBorders>
+              <w:top w:val="single" w:sz="6" w:space="0" w:color="auto"/>
+              <w:left w:val="single" w:sz="6" w:space="0" w:color="auto"/>
+              <w:bottom w:val="single" w:sz="6" w:space="0" w:color="auto"/>
+              <w:right w:val="single" w:sz="6" w:space="0" w:color="auto"/>
+            </w:tcBorders>
+            <w:vAlign w:val="center"/>
+            <w:hideMark/>
           </w:tcPr>
           <w:p>
             <w:pPr>
-              <w:pStyle w:val="Compact"/>
-              <w:spacing w:line="480" w:lineRule="auto"/>
-              <w:jc w:val="both"/>
-              <w:rPr>
-                <w:rFonts w:ascii="Arial" w:hAnsi="Arial" w:cs="Arial"/>
-                <w:sz w:val="24"/>
-                <w:szCs w:val="24"/>
+              <w:pStyle w:val="Textkrper"/>
+              <w:rPr>
+                <w:lang w:val="de-DE"/>
               </w:rPr>
             </w:pPr>
             <w:r>
               <w:rPr>
-                <w:rFonts w:ascii="Arial" w:hAnsi="Arial" w:cs="Arial"/>
-                <w:sz w:val="24"/>
-                <w:szCs w:val="24"/>
-              </w:rPr>
-              <w:t>Rationale Überlebensstrategie</w:t>
+                <w:lang w:val="de-DE"/>
+              </w:rPr>
+              <w:t>Ökonomische Überlebensrationalität</w:t>
             </w:r>
           </w:p>
         </w:tc>
@@ -4939,24 +5054,37 @@
     <w:p>
       <w:pPr>
         <w:pStyle w:val="berschrift2"/>
-        <w:spacing w:line="480" w:lineRule="auto"/>
-        <w:jc w:val="both"/>
-        <w:rPr>
-          <w:rFonts w:ascii="Arial" w:hAnsi="Arial" w:cs="Arial"/>
+        <w:rPr>
           <w:sz w:val="24"/>
           <w:szCs w:val="24"/>
         </w:rPr>
       </w:pPr>
       <w:bookmarkStart w:id="36" w:name="X3fd6d9e6d645c54f437d83b5eca9b75a2f58ee1"/>
-      <w:bookmarkStart w:id="37" w:name="_Toc221111869"/>
+      <w:bookmarkStart w:id="37" w:name="_Toc221120205"/>
       <w:bookmarkEnd w:id="34"/>
-      <w:r>
-        <w:rPr>
-          <w:rFonts w:ascii="Arial" w:hAnsi="Arial" w:cs="Arial"/>
-          <w:sz w:val="24"/>
-          <w:szCs w:val="24"/>
-        </w:rPr>
-        <w:t>5.2 Der „Lack of Fit“: Taktische Repolitisierung von Ressourcen</w:t>
+    </w:p>
+    <w:p>
+      <w:pPr>
+        <w:pStyle w:val="berschrift2"/>
+      </w:pPr>
+      <w:r>
+        <w:t xml:space="preserve">5.2 Der „Lack </w:t>
+      </w:r>
+      <w:proofErr w:type="spellStart"/>
+      <w:r>
+        <w:t>of</w:t>
+      </w:r>
+      <w:proofErr w:type="spellEnd"/>
+      <w:r>
+        <w:t xml:space="preserve"> Fit“: Taktische </w:t>
+      </w:r>
+      <w:proofErr w:type="spellStart"/>
+      <w:r>
+        <w:t>Repolitisierung</w:t>
+      </w:r>
+      <w:proofErr w:type="spellEnd"/>
+      <w:r>
+        <w:t xml:space="preserve"> von Ressourcen</w:t>
       </w:r>
       <w:bookmarkEnd w:id="37"/>
     </w:p>
@@ -4964,6 +5092,49 @@
       <w:pPr>
         <w:pStyle w:val="FirstParagraph"/>
         <w:spacing w:line="480" w:lineRule="auto"/>
+        <w:rPr>
+          <w:rFonts w:ascii="Arial" w:hAnsi="Arial" w:cs="Arial"/>
+          <w:lang w:val="de-DE"/>
+        </w:rPr>
+      </w:pPr>
+      <w:r>
+        <w:rPr>
+          <w:rFonts w:ascii="Arial" w:hAnsi="Arial" w:cs="Arial"/>
+          <w:lang w:val="de-DE"/>
+        </w:rPr>
+        <w:t xml:space="preserve">Die </w:t>
+      </w:r>
+      <w:bookmarkStart w:id="38" w:name="diskussion-und-handlungsempfehlungen"/>
+      <w:bookmarkEnd w:id="32"/>
+      <w:bookmarkEnd w:id="36"/>
+      <w:r>
+        <w:rPr>
+          <w:rFonts w:ascii="Arial" w:hAnsi="Arial" w:cs="Arial"/>
+          <w:lang w:val="de-DE"/>
+        </w:rPr>
+        <w:t xml:space="preserve">Verwendung der Netze zum Fischfang ist kein „Missbrauch“, sondern eine *taktische </w:t>
+      </w:r>
+      <w:proofErr w:type="spellStart"/>
+      <w:r>
+        <w:rPr>
+          <w:rFonts w:ascii="Arial" w:hAnsi="Arial" w:cs="Arial"/>
+          <w:lang w:val="de-DE"/>
+        </w:rPr>
+        <w:t>Repolitisierung</w:t>
+      </w:r>
+      <w:proofErr w:type="spellEnd"/>
+      <w:r>
+        <w:rPr>
+          <w:rFonts w:ascii="Arial" w:hAnsi="Arial" w:cs="Arial"/>
+          <w:lang w:val="de-DE"/>
+        </w:rPr>
+        <w:t>* der Ressource. Der Fischer entzieht das Objekt der biopolitischen Codierung (Gesundheitsschutz) und führt es einer ökonomischen Verwertung zu.</w:t>
+      </w:r>
+    </w:p>
+    <w:p>
+      <w:pPr>
+        <w:pStyle w:val="FirstParagraph"/>
+        <w:spacing w:line="480" w:lineRule="auto"/>
         <w:jc w:val="both"/>
         <w:rPr>
           <w:rFonts w:ascii="Arial" w:hAnsi="Arial" w:cs="Arial"/>
@@ -4978,33 +5149,31 @@
           <w:rFonts w:ascii="Arial" w:hAnsi="Arial" w:cs="Arial"/>
           <w:lang w:val="de-DE"/>
         </w:rPr>
-        <w:t xml:space="preserve">Die Zweckentfremdung des Netzes zum Fischfang ist kein technisches Versagen, sondern eine </w:t>
-      </w:r>
-      <w:r>
-        <w:rPr>
-          <w:rFonts w:ascii="Arial" w:hAnsi="Arial" w:cs="Arial"/>
-          <w:b/>
-          <w:bCs/>
-          <w:lang w:val="de-DE"/>
-        </w:rPr>
-        <w:t>taktische Repolitisierung</w:t>
+        <w:t xml:space="preserve">Die Logik ist zwingend: Ein Malariarisiko ist probabilistisch und liegt in der Zukunft; Hunger ist deterministisch und akut. Wer das Netz zum Fischen nutzt, handelt im Sinne seiner unmittelbaren Selbsterhaltung hochgradig rational. Der </w:t>
       </w:r>
       <w:r>
         <w:rPr>
           <w:rFonts w:ascii="Arial" w:hAnsi="Arial" w:cs="Arial"/>
           <w:lang w:val="de-DE"/>
         </w:rPr>
-        <w:t xml:space="preserve"> der Ressource. Indem der Fischer das Netz umwidmet, entzieht er seinen Körper der biopolitischen Zugriffsgewalt und nutzt das Systeminstrument zur Deckung basaler Bedürfnisse. Der „Lack of Fit“ ist hier die Ignoranz des Systems gegenüber der Tatsache, dass Gesundheit ohne ökonomische Souveränität ein abstraktes Konstrukt bleibt. Widerstand ist das Fieberthermometer einer Politik, die Netze gegen Mücken gibt, wo Netze zum Überleben fehlen.</w:t>
-      </w:r>
-      <w:bookmarkStart w:id="38" w:name="diskussion-und-handlungsempfehlungen"/>
-      <w:bookmarkEnd w:id="32"/>
-      <w:bookmarkEnd w:id="36"/>
+        <w:lastRenderedPageBreak/>
+        <w:t xml:space="preserve">„Lack </w:t>
+      </w:r>
+      <w:proofErr w:type="spellStart"/>
       <w:r>
         <w:rPr>
           <w:rFonts w:ascii="Arial" w:hAnsi="Arial" w:cs="Arial"/>
           <w:lang w:val="de-DE"/>
         </w:rPr>
-        <w:t xml:space="preserve"> </w:t>
+        <w:t>of</w:t>
+      </w:r>
+      <w:proofErr w:type="spellEnd"/>
+      <w:r>
+        <w:rPr>
+          <w:rFonts w:ascii="Arial" w:hAnsi="Arial" w:cs="Arial"/>
+          <w:lang w:val="de-DE"/>
+        </w:rPr>
+        <w:t xml:space="preserve"> Fit“ besteht in der Ignoranz des Gesundheitsprogramms gegenüber der Tatsache, dass ohne ökonomische Sicherheit (Nahrung) kein Gesundheitsbewusstsein existieren kann. Widerstand fungiert hier als Indikator für eine Intervention, die biologisches Leben schützen will, aber die ökonomischen Bedingungen dieses Lebens ignoriert.</w:t>
       </w:r>
       <w:r>
         <w:rPr>
@@ -5018,7 +5187,7 @@
       <w:pPr>
         <w:pStyle w:val="berschrift1"/>
       </w:pPr>
-      <w:bookmarkStart w:id="39" w:name="_Toc221111870"/>
+      <w:bookmarkStart w:id="39" w:name="_Toc221120206"/>
       <w:r>
         <w:lastRenderedPageBreak/>
         <w:t>6. Diskussion und Handlungsempfehlungen</w:t>
@@ -5030,7 +5199,7 @@
         <w:pStyle w:val="berschrift2"/>
       </w:pPr>
       <w:bookmarkStart w:id="40" w:name="Xffec229f5fa28dbe401d6a6315295524220efbc"/>
-      <w:bookmarkStart w:id="41" w:name="_Toc221111871"/>
+      <w:bookmarkStart w:id="41" w:name="_Toc221120207"/>
       <w:r>
         <w:t>6.1 Von der Edukation zur systemischen Adaptation</w:t>
       </w:r>
@@ -5040,7 +5209,6 @@
       <w:pPr>
         <w:pStyle w:val="FirstParagraph"/>
         <w:spacing w:line="480" w:lineRule="auto"/>
-        <w:jc w:val="both"/>
         <w:rPr>
           <w:rFonts w:ascii="Arial" w:hAnsi="Arial" w:cs="Arial"/>
           <w:lang w:val="de-DE"/>
@@ -5051,34 +5219,98 @@
           <w:rFonts w:ascii="Arial" w:hAnsi="Arial" w:cs="Arial"/>
           <w:lang w:val="de-DE"/>
         </w:rPr>
-        <w:t xml:space="preserve">Ausschlaggebend ist hierbei: Wissen löst keine Strukturprobleme. Rein edukative Ansätze zielen oft nur auf Normalisierung ab. Die korrekte Antwort auf Widerstand ist nicht die Umkehr des Patienten, sondern die </w:t>
-      </w:r>
+        <w:t>Die</w:t>
+      </w:r>
+      <w:r>
+        <w:rPr>
+          <w:rFonts w:ascii="Arial" w:hAnsi="Arial" w:cs="Arial"/>
+          <w:lang w:val="de-DE"/>
+        </w:rPr>
+        <w:t xml:space="preserve"> </w:t>
+      </w:r>
+      <w:r>
+        <w:rPr>
+          <w:rFonts w:ascii="Arial" w:hAnsi="Arial" w:cs="Arial"/>
+          <w:lang w:val="de-DE"/>
+        </w:rPr>
+        <w:t>Analyse zeigt: Mehr „Aufklärung“ ist die falsche Antwort auf strukturellen Widerstand. Wenn Netze aus Hunger zum Fischen genutzt werden, muss die Intervention Ernährungssicherheit adressieren, nicht Malaria-Biologie.</w:t>
+      </w:r>
+    </w:p>
+    <w:p>
+      <w:pPr>
+        <w:pStyle w:val="FirstParagraph"/>
+        <w:spacing w:line="480" w:lineRule="auto"/>
+        <w:jc w:val="both"/>
+        <w:rPr>
+          <w:rFonts w:ascii="Arial" w:hAnsi="Arial" w:cs="Arial"/>
+          <w:lang w:val="de-DE"/>
+        </w:rPr>
+      </w:pPr>
       <w:r>
         <w:rPr>
           <w:rFonts w:ascii="Arial" w:hAnsi="Arial" w:cs="Arial"/>
           <w:b/>
-          <w:bCs/>
           <w:lang w:val="de-DE"/>
         </w:rPr>
-        <w:t>systemische Adaptation</w:t>
+        <w:t>Empfehlung</w:t>
+      </w:r>
+      <w:r>
+        <w:rPr>
+          <w:rFonts w:ascii="Arial" w:hAnsi="Arial" w:cs="Arial"/>
+          <w:b/>
+          <w:lang w:val="de-DE"/>
+        </w:rPr>
+        <w:t>:</w:t>
       </w:r>
       <w:r>
         <w:rPr>
           <w:rFonts w:ascii="Arial" w:hAnsi="Arial" w:cs="Arial"/>
           <w:lang w:val="de-DE"/>
         </w:rPr>
-        <w:t xml:space="preserve"> an die Social Determinants of Health.</w:t>
-      </w:r>
+        <w:t xml:space="preserve"> Global Health Initiativen müssen *</w:t>
+      </w:r>
+      <w:proofErr w:type="spellStart"/>
+      <w:r>
+        <w:rPr>
+          <w:rFonts w:ascii="Arial" w:hAnsi="Arial" w:cs="Arial"/>
+          <w:lang w:val="de-DE"/>
+        </w:rPr>
+        <w:t>Livelihood</w:t>
+      </w:r>
+      <w:proofErr w:type="spellEnd"/>
+      <w:r>
+        <w:rPr>
+          <w:rFonts w:ascii="Arial" w:hAnsi="Arial" w:cs="Arial"/>
+          <w:lang w:val="de-DE"/>
+        </w:rPr>
+        <w:t>-Ansätze* integrieren. Die Distribution von ITNs in Fischergemeinden muss mit Programmen zur nachhaltigen Nahrungssicherung oder der Bereitstellung adäquater Fischereiausrüstung gekoppelt werden. Nur wenn die ökonomische Notwendigkeit zur Zweckentfremdung entfällt, kann die gesundheitliche Nutzung greifen.</w:t>
+      </w:r>
+    </w:p>
+    <w:p>
+      <w:pPr>
+        <w:pStyle w:val="Textkrper"/>
+        <w:rPr>
+          <w:lang w:val="de-DE"/>
+        </w:rPr>
+      </w:pPr>
     </w:p>
     <w:p>
       <w:pPr>
         <w:pStyle w:val="berschrift2"/>
       </w:pPr>
       <w:bookmarkStart w:id="42" w:name="X54655af49197cf6088ab60fc3dd22b13c9186fd"/>
-      <w:bookmarkStart w:id="43" w:name="_Toc221111872"/>
+      <w:bookmarkStart w:id="43" w:name="_Toc221120208"/>
       <w:bookmarkEnd w:id="40"/>
       <w:r>
-        <w:t>6.2 Messbarkeit von Co-Creation jenseits quantitativer KPIs</w:t>
+        <w:t>6.2 Messbarkeit von Co-</w:t>
+      </w:r>
+      <w:proofErr w:type="spellStart"/>
+      <w:r>
+        <w:t>Creation</w:t>
+      </w:r>
+      <w:proofErr w:type="spellEnd"/>
+      <w:r>
+        <w:t xml:space="preserve"> jenseits quantitativer KPIs</w:t>
       </w:r>
       <w:bookmarkEnd w:id="43"/>
     </w:p>
@@ -5100,39 +5332,7 @@
           <w:rFonts w:ascii="Arial" w:hAnsi="Arial" w:cs="Arial"/>
           <w:lang w:val="de-DE"/>
         </w:rPr>
-        <w:t xml:space="preserve">Um den Erfolg von Co-Creation zu evaluieren, ohne in die kritisierte Logik von KPIs zurückzufallen, bedarf es einer Umorientierung hin zu </w:t>
-      </w:r>
-      <w:r>
-        <w:rPr>
-          <w:rFonts w:ascii="Arial" w:hAnsi="Arial" w:cs="Arial"/>
-          <w:b/>
-          <w:bCs/>
-          <w:lang w:val="de-DE"/>
-        </w:rPr>
-        <w:t>narrativen Impact-Indikatoren</w:t>
-      </w:r>
-      <w:r>
-        <w:rPr>
-          <w:rFonts w:ascii="Arial" w:hAnsi="Arial" w:cs="Arial"/>
-          <w:lang w:val="de-DE"/>
-        </w:rPr>
-        <w:t xml:space="preserve">. Statt Netze zu zählen, sollte die „Erhöhung der Entscheidungssouveränität“ mittels der </w:t>
-      </w:r>
-      <w:r>
-        <w:rPr>
-          <w:rFonts w:ascii="Arial" w:hAnsi="Arial" w:cs="Arial"/>
-          <w:i/>
-          <w:iCs/>
-          <w:lang w:val="de-DE"/>
-        </w:rPr>
-        <w:t>Most Significant Change (MSC) Method</w:t>
-      </w:r>
-      <w:r>
-        <w:rPr>
-          <w:rFonts w:ascii="Arial" w:hAnsi="Arial" w:cs="Arial"/>
-          <w:lang w:val="de-DE"/>
-        </w:rPr>
-        <w:t xml:space="preserve"> gemessen werden. Dabei werden qualitative Berichte der Community über Machtbalancen ausgewertet. Erfolg definiert sich dann über die Qualität des Dialogs und die Fähigkeit des Systems, auf Lebenswelt-Feedback mit strukturellen Anpassungen zu reagieren.</w:t>
+        <w:t xml:space="preserve">Um </w:t>
       </w:r>
       <w:bookmarkStart w:id="44" w:name="fazit"/>
       <w:bookmarkEnd w:id="38"/>
@@ -5142,7 +5342,39 @@
           <w:rFonts w:ascii="Arial" w:hAnsi="Arial" w:cs="Arial"/>
           <w:lang w:val="de-DE"/>
         </w:rPr>
-        <w:t xml:space="preserve"> </w:t>
+        <w:t>echte Co-</w:t>
+      </w:r>
+      <w:proofErr w:type="spellStart"/>
+      <w:r>
+        <w:rPr>
+          <w:rFonts w:ascii="Arial" w:hAnsi="Arial" w:cs="Arial"/>
+          <w:lang w:val="de-DE"/>
+        </w:rPr>
+        <w:t>Creation</w:t>
+      </w:r>
+      <w:proofErr w:type="spellEnd"/>
+      <w:r>
+        <w:rPr>
+          <w:rFonts w:ascii="Arial" w:hAnsi="Arial" w:cs="Arial"/>
+          <w:lang w:val="de-DE"/>
+        </w:rPr>
+        <w:t xml:space="preserve"> zu evaluieren, genügen quantitative Indikatoren (verteilte Netze) nicht. Es bedarf narrativer Metriken, wie der *Most </w:t>
+      </w:r>
+      <w:proofErr w:type="spellStart"/>
+      <w:r>
+        <w:rPr>
+          <w:rFonts w:ascii="Arial" w:hAnsi="Arial" w:cs="Arial"/>
+          <w:lang w:val="de-DE"/>
+        </w:rPr>
+        <w:t>Significant</w:t>
+      </w:r>
+      <w:proofErr w:type="spellEnd"/>
+      <w:r>
+        <w:rPr>
+          <w:rFonts w:ascii="Arial" w:hAnsi="Arial" w:cs="Arial"/>
+          <w:lang w:val="de-DE"/>
+        </w:rPr>
+        <w:t xml:space="preserve"> Change (MSC)* Methode. Hierbei wird Erfolg nicht an Compliance-Raten gemessen, sondern an der qualitativen Veränderung der Machtbalance und der Entscheidungssouveränität der Community. Ein erfolgreiches CHS ist eines, das Feedback-Schleifen institutionalisiert und Widerstand nicht sanktioniert, sondern als Anlass für strukturelle Anpassungen nutzt.</w:t>
       </w:r>
       <w:r>
         <w:rPr>
@@ -5156,7 +5388,7 @@
       <w:pPr>
         <w:pStyle w:val="berschrift1"/>
       </w:pPr>
-      <w:bookmarkStart w:id="45" w:name="_Toc221111873"/>
+      <w:bookmarkStart w:id="45" w:name="_Toc221120209"/>
       <w:r>
         <w:lastRenderedPageBreak/>
         <w:t>7. Fazit</w:t>
@@ -5167,7 +5399,6 @@
       <w:pPr>
         <w:pStyle w:val="FirstParagraph"/>
         <w:spacing w:line="480" w:lineRule="auto"/>
-        <w:jc w:val="both"/>
         <w:rPr>
           <w:rFonts w:ascii="Arial" w:hAnsi="Arial" w:cs="Arial"/>
           <w:lang w:val="de-DE"/>
@@ -5178,12 +5409,52 @@
           <w:rFonts w:ascii="Arial" w:hAnsi="Arial" w:cs="Arial"/>
           <w:lang w:val="de-DE"/>
         </w:rPr>
-        <w:t>Diese Untersuchung verdeutlicht, dass Widerstand in CHS kein Zeichen von Unwündigkeit, sondern ein valides diagnostisches Feedback-Signal ist. Durch die Theorie der Biomacht (Foucault) wurde die Zweckentfremdung in Uganda als rationale Reaktion auf einen strukturellen „Lack of Fit“ dekonstruiert. Die Daten von Mahmoodi et al. untermauern, dass institutionelles Misstrauen die größte Barriere darstellt.</w:t>
+        <w:t xml:space="preserve">Diese </w:t>
+      </w:r>
+      <w:bookmarkEnd w:id="44"/>
+      <w:r>
+        <w:rPr>
+          <w:rFonts w:ascii="Arial" w:hAnsi="Arial" w:cs="Arial"/>
+          <w:lang w:val="de-DE"/>
+        </w:rPr>
+        <w:t xml:space="preserve">Untersuchung der ITN-Distribution in Uganda verdeutlicht, dass Widerstand gegen CHS keine pathologische Abweichung, sondern ein valides diagnostisches Signal ist. Durch die Brille von Foucaults </w:t>
+      </w:r>
+      <w:proofErr w:type="spellStart"/>
+      <w:r>
+        <w:rPr>
+          <w:rFonts w:ascii="Arial" w:hAnsi="Arial" w:cs="Arial"/>
+          <w:lang w:val="de-DE"/>
+        </w:rPr>
+        <w:t>Biomacht</w:t>
+      </w:r>
+      <w:proofErr w:type="spellEnd"/>
+      <w:r>
+        <w:rPr>
+          <w:rFonts w:ascii="Arial" w:hAnsi="Arial" w:cs="Arial"/>
+          <w:lang w:val="de-DE"/>
+        </w:rPr>
+        <w:t xml:space="preserve"> wird erkennbar, dass die „Zweckentfremdung“ von Netzen eine rationale Überlebensstrategie gegen einen strukturellen „Lack </w:t>
+      </w:r>
+      <w:proofErr w:type="spellStart"/>
+      <w:r>
+        <w:rPr>
+          <w:rFonts w:ascii="Arial" w:hAnsi="Arial" w:cs="Arial"/>
+          <w:lang w:val="de-DE"/>
+        </w:rPr>
+        <w:t>of</w:t>
+      </w:r>
+      <w:proofErr w:type="spellEnd"/>
+      <w:r>
+        <w:rPr>
+          <w:rFonts w:ascii="Arial" w:hAnsi="Arial" w:cs="Arial"/>
+          <w:lang w:val="de-DE"/>
+        </w:rPr>
+        <w:t xml:space="preserve"> Fit“ darstellt. Wenn Gesundheitssysteme die ökonomischen Realitäten der Lebenswelt ignorieren, provoziert die Intervention ihre eigene Ablehnung.</w:t>
       </w:r>
     </w:p>
     <w:p>
       <w:pPr>
-        <w:pStyle w:val="Textkrper"/>
+        <w:pStyle w:val="FirstParagraph"/>
         <w:spacing w:line="480" w:lineRule="auto"/>
         <w:jc w:val="both"/>
         <w:rPr>
@@ -5192,6 +5463,7 @@
           <w:color w:val="000000"/>
           <w:sz w:val="32"/>
           <w:szCs w:val="32"/>
+          <w:lang w:val="de-DE"/>
         </w:rPr>
       </w:pPr>
       <w:r>
@@ -5199,10 +5471,44 @@
           <w:rFonts w:ascii="Arial" w:hAnsi="Arial" w:cs="Arial"/>
           <w:lang w:val="de-DE"/>
         </w:rPr>
-        <w:t>In der Gesamtschau wird deutlich: Widerstand signalisiert die Grenze zwischen Fürsorge und Bevormundung. Eine künftige Global Health Praxis muss den Weg von paternalistischen Top-Down-Modellen hin zu echter Co-Creation gehen. Wer Gesundheit nachhaltig fördern will, darf Widerstand nicht weg-edukieren, sondern muss ihn als Ressource für eine gerechtere Systemgestaltung ernst nehmen. Nur so kann Global Health Leben nicht nur verwalten, sondern in seiner Würde schützen.</w:t>
-      </w:r>
-      <w:bookmarkEnd w:id="44"/>
-      <w:r>
+        <w:t>Zukunftsfähige Global Health Praxis muss sich von der paternalistischen Verwaltung von Körpern verabschieden und echte Co-</w:t>
+      </w:r>
+      <w:proofErr w:type="spellStart"/>
+      <w:r>
+        <w:rPr>
+          <w:rFonts w:ascii="Arial" w:hAnsi="Arial" w:cs="Arial"/>
+          <w:lang w:val="de-DE"/>
+        </w:rPr>
+        <w:t>Creation</w:t>
+      </w:r>
+      <w:proofErr w:type="spellEnd"/>
+      <w:r>
+        <w:rPr>
+          <w:rFonts w:ascii="Arial" w:hAnsi="Arial" w:cs="Arial"/>
+          <w:lang w:val="de-DE"/>
+        </w:rPr>
+        <w:t xml:space="preserve"> wagen. Das bedeutet konkret: Ökonomische Sicherheit muss als integraler Bestandteil von Gesundheitsinterventionen begriffen werden. Wer Widerstand ernst nimmt, statt ihn weg-</w:t>
+      </w:r>
+      <w:proofErr w:type="spellStart"/>
+      <w:r>
+        <w:rPr>
+          <w:rFonts w:ascii="Arial" w:hAnsi="Arial" w:cs="Arial"/>
+          <w:lang w:val="de-DE"/>
+        </w:rPr>
+        <w:t>edukieren</w:t>
+      </w:r>
+      <w:proofErr w:type="spellEnd"/>
+      <w:r>
+        <w:rPr>
+          <w:rFonts w:ascii="Arial" w:hAnsi="Arial" w:cs="Arial"/>
+          <w:lang w:val="de-DE"/>
+        </w:rPr>
+        <w:t xml:space="preserve"> zu wollen, gewinnt den entscheidenden Partner für nachhaltige Gesundheit: die autonome Bevölkerung selbst.</w:t>
+      </w:r>
+      <w:r>
+        <w:rPr>
+          <w:lang w:val="de-DE"/>
+        </w:rPr>
         <w:br w:type="page"/>
       </w:r>
     </w:p>
@@ -5211,7 +5517,7 @@
         <w:pStyle w:val="berschrift1"/>
         <w:spacing w:line="480" w:lineRule="auto"/>
       </w:pPr>
-      <w:bookmarkStart w:id="46" w:name="_Toc221111874"/>
+      <w:bookmarkStart w:id="46" w:name="_Toc221120210"/>
       <w:r>
         <w:lastRenderedPageBreak/>
         <w:t>Literaturverzeichnis</w:t>
@@ -5231,6 +5537,7 @@
       <w:r>
         <w:rPr>
           <w:rFonts w:ascii="Arial" w:hAnsi="Arial" w:cs="Arial"/>
+          <w:lang w:val="de-DE"/>
         </w:rPr>
         <w:t xml:space="preserve">Dreyfus, H. L., &amp; Rabinow, P. (1982). </w:t>
       </w:r>
@@ -5253,7 +5560,23 @@
           <w:rFonts w:ascii="Arial" w:hAnsi="Arial" w:cs="Arial"/>
           <w:lang w:val="de-DE"/>
         </w:rPr>
-        <w:t>Chicago: University of Chicago Press.</w:t>
+        <w:t xml:space="preserve">Chicago: University </w:t>
+      </w:r>
+      <w:proofErr w:type="spellStart"/>
+      <w:r>
+        <w:rPr>
+          <w:rFonts w:ascii="Arial" w:hAnsi="Arial" w:cs="Arial"/>
+          <w:lang w:val="de-DE"/>
+        </w:rPr>
+        <w:t>of</w:t>
+      </w:r>
+      <w:proofErr w:type="spellEnd"/>
+      <w:r>
+        <w:rPr>
+          <w:rFonts w:ascii="Arial" w:hAnsi="Arial" w:cs="Arial"/>
+          <w:lang w:val="de-DE"/>
+        </w:rPr>
+        <w:t xml:space="preserve"> Chicago Press.</w:t>
       </w:r>
     </w:p>
     <w:p>
@@ -5468,7 +5791,7 @@
         <w:pStyle w:val="berschrift2"/>
       </w:pPr>
       <w:bookmarkStart w:id="47" w:name="_Toc212702681"/>
-      <w:bookmarkStart w:id="48" w:name="_Toc221111875"/>
+      <w:bookmarkStart w:id="48" w:name="_Toc221120211"/>
       <w:r>
         <w:lastRenderedPageBreak/>
         <w:t>A</w:t>
@@ -5762,9 +6085,11 @@
             <w:vAlign w:val="center"/>
           </w:tcPr>
           <w:p>
+            <w:proofErr w:type="spellStart"/>
             <w:r>
               <w:t>Zotero</w:t>
             </w:r>
+            <w:proofErr w:type="spellEnd"/>
           </w:p>
         </w:tc>
         <w:tc>
@@ -5934,7 +6259,15 @@
             </w:r>
             <w:r>
               <w:br/>
-              <w:t xml:space="preserve">• Dublettenprüfung </w:t>
+              <w:t xml:space="preserve">• </w:t>
+            </w:r>
+            <w:proofErr w:type="spellStart"/>
+            <w:r>
+              <w:t>Dublettenprüfung</w:t>
+            </w:r>
+            <w:proofErr w:type="spellEnd"/>
+            <w:r>
+              <w:t xml:space="preserve"> </w:t>
             </w:r>
             <w:r>
               <w:br/>
@@ -6035,7 +6368,7 @@
         <w:pStyle w:val="berschrift2"/>
       </w:pPr>
       <w:bookmarkStart w:id="49" w:name="_Toc212702682"/>
-      <w:bookmarkStart w:id="50" w:name="_Toc221111876"/>
+      <w:bookmarkStart w:id="50" w:name="_Toc221120212"/>
       <w:r>
         <w:lastRenderedPageBreak/>
         <w:t>A</w:t>
@@ -6051,7 +6384,13 @@
     </w:p>
     <w:p>
       <w:r>
-        <w:t xml:space="preserve">Hiermit versichere ich an Eides Statt, dass ich die vorliegende Bachelorarbeit selbständig und ohne Benutzung anderer als der angegebenen Hilfsmittel angefertigt habe. Alle Stellen, die wörtlich oder sinngemäß aus fremden Quellen übernommen wurden, sind als solche kenntlich gemacht. </w:t>
+        <w:t xml:space="preserve">Hiermit versichere ich an Eides Statt, dass ich die vorliegende </w:t>
+      </w:r>
+      <w:r>
+        <w:t>Modul-Ausarbeitung</w:t>
+      </w:r>
+      <w:r>
+        <w:t xml:space="preserve"> selbständig und ohne Benutzung anderer als der angegebenen Hilfsmittel angefertigt habe. Alle Stellen, die wörtlich oder sinngemäß aus fremden Quellen übernommen wurden, sind als solche kenntlich gemacht. </w:t>
       </w:r>
     </w:p>
     <w:p>
@@ -6100,50 +6439,31 @@
     <w:p>
       <w:pPr>
         <w:jc w:val="center"/>
+      </w:pPr>
+      <w:r>
         <w:rPr>
           <w:i/>
           <w:iCs/>
           <w:u w:val="single"/>
         </w:rPr>
-      </w:pPr>
+        <w:t>Ende der Arbei</w:t>
+      </w:r>
       <w:r>
         <w:rPr>
           <w:i/>
           <w:iCs/>
           <w:u w:val="single"/>
         </w:rPr>
-        <w:t>Ende der Arbeit</w:t>
+        <w:t>t</w:t>
       </w:r>
     </w:p>
-    <w:p>
-      <w:pPr>
-        <w:sectPr>
-          <w:footerReference w:type="default" r:id="rId10"/>
-          <w:pgSz w:w="11906" w:h="16838"/>
-          <w:pgMar w:top="1417" w:right="1701" w:bottom="1418" w:left="1701" w:header="709" w:footer="709" w:gutter="0"/>
-          <w:pgNumType w:start="1"/>
-          <w:cols w:space="720"/>
-        </w:sectPr>
-      </w:pPr>
-    </w:p>
-    <w:p>
-      <w:pPr>
-        <w:pStyle w:val="berschrift1"/>
-      </w:pPr>
-      <w:bookmarkStart w:id="51" w:name="_Toc221111877"/>
-      <w:r>
-        <w:lastRenderedPageBreak/>
-        <w:t>Anhang</w:t>
-      </w:r>
-      <w:bookmarkEnd w:id="51"/>
-    </w:p>
-    <w:p/>
     <w:sectPr>
-      <w:footerReference w:type="default" r:id="rId11"/>
-      <w:pgSz w:w="16838" w:h="11906" w:orient="landscape"/>
-      <w:pgMar w:top="1701" w:right="1417" w:bottom="1701" w:left="1418" w:header="709" w:footer="709" w:gutter="0"/>
+      <w:footerReference w:type="default" r:id="rId10"/>
+      <w:pgSz w:w="11906" w:h="16838"/>
+      <w:pgMar w:top="1417" w:right="1701" w:bottom="1418" w:left="1701" w:header="709" w:footer="709" w:gutter="0"/>
       <w:pgNumType w:start="1"/>
       <w:cols w:space="720"/>
+      <w:docGrid w:linePitch="326"/>
     </w:sectPr>
   </w:body>
 </w:document>
@@ -6175,30 +6495,6 @@
 </file>
 
 <file path=word/footer1.xml><?xml version="1.0" encoding="utf-8"?>
-<w:ftr xmlns:wpc="http://schemas.microsoft.com/office/word/2010/wordprocessingCanvas" xmlns:cx="http://schemas.microsoft.com/office/drawing/2014/chartex" xmlns:cx1="http://schemas.microsoft.com/office/drawing/2015/9/8/chartex" xmlns:cx2="http://schemas.microsoft.com/office/drawing/2015/10/21/chartex" xmlns:cx3="http://schemas.microsoft.com/office/drawing/2016/5/9/chartex" xmlns:cx4="http://schemas.microsoft.com/office/drawing/2016/5/10/chartex" xmlns:cx5="http://schemas.microsoft.com/office/drawing/2016/5/11/chartex" xmlns:cx6="http://schemas.microsoft.com/office/drawing/2016/5/12/chartex" xmlns:cx7="http://schemas.microsoft.com/office/drawing/2016/5/13/chartex" xmlns:cx8="http://schemas.microsoft.com/office/drawing/2016/5/14/chartex" xmlns:mc="http://schemas.openxmlformats.org/markup-compatibility/2006" xmlns:aink="http://schemas.microsoft.com/office/drawing/2016/ink" xmlns:am3d="http://schemas.microsoft.com/office/drawing/2017/model3d" xmlns:o="urn:schemas-microsoft-com:office:office" xmlns:oel="http://schemas.microsoft.com/office/2019/extlst" xmlns:r="http://schemas.openxmlformats.org/officeDocument/2006/relationships" xmlns:m="http://schemas.openxmlformats.org/officeDocument/2006/math" xmlns:v="urn:schemas-microsoft-com:vml" xmlns:wp14="http://schemas.microsoft.com/office/word/2010/wordprocessingDrawing" xmlns:wp="http://schemas.openxmlformats.org/drawingml/2006/wordprocessingDrawing" xmlns:w10="urn:schemas-microsoft-com:office:word" xmlns:w="http://schemas.openxmlformats.org/wordprocessingml/2006/main" xmlns:w14="http://schemas.microsoft.com/office/word/2010/wordml" xmlns:w15="http://schemas.microsoft.com/office/word/2012/wordml" xmlns:w16cex="http://schemas.microsoft.com/office/word/2018/wordml/cex" xmlns:w16cid="http://schemas.microsoft.com/office/word/2016/wordml/cid" xmlns:w16="http://schemas.microsoft.com/office/word/2018/wordml" xmlns:w16du="http://schemas.microsoft.com/office/word/2023/wordml/word16du" xmlns:w16sdtdh="http://schemas.microsoft.com/office/word/2020/wordml/sdtdatahash" xmlns:w16sdtfl="http://schemas.microsoft.com/office/word/2024/wordml/sdtformatlock" xmlns:w16se="http://schemas.microsoft.com/office/word/2015/wordml/symex" xmlns:wpg="http://schemas.microsoft.com/office/word/2010/wordprocessingGroup" xmlns:wpi="http://schemas.microsoft.com/office/word/2010/wordprocessingInk" xmlns:wne="http://schemas.microsoft.com/office/word/2006/wordml" xmlns:wps="http://schemas.microsoft.com/office/word/2010/wordprocessingShape" mc:Ignorable="w14 w15 w16se w16cid w16 w16cex w16sdtdh w16sdtfl w16du wp14">
-  <w:p>
-    <w:pPr>
-      <w:pBdr>
-        <w:top w:val="nil"/>
-        <w:left w:val="nil"/>
-        <w:bottom w:val="nil"/>
-        <w:right w:val="nil"/>
-        <w:between w:val="nil"/>
-      </w:pBdr>
-      <w:tabs>
-        <w:tab w:val="center" w:pos="4536"/>
-        <w:tab w:val="right" w:pos="9072"/>
-      </w:tabs>
-      <w:spacing w:after="0" w:line="240" w:lineRule="auto"/>
-      <w:rPr>
-        <w:color w:val="000000"/>
-      </w:rPr>
-    </w:pPr>
-  </w:p>
-</w:ftr>
-</file>
-
-<file path=word/footer2.xml><?xml version="1.0" encoding="utf-8"?>
 <w:ftr xmlns:wpc="http://schemas.microsoft.com/office/word/2010/wordprocessingCanvas" xmlns:cx="http://schemas.microsoft.com/office/drawing/2014/chartex" xmlns:cx1="http://schemas.microsoft.com/office/drawing/2015/9/8/chartex" xmlns:cx2="http://schemas.microsoft.com/office/drawing/2015/10/21/chartex" xmlns:cx3="http://schemas.microsoft.com/office/drawing/2016/5/9/chartex" xmlns:cx4="http://schemas.microsoft.com/office/drawing/2016/5/10/chartex" xmlns:cx5="http://schemas.microsoft.com/office/drawing/2016/5/11/chartex" xmlns:cx6="http://schemas.microsoft.com/office/drawing/2016/5/12/chartex" xmlns:cx7="http://schemas.microsoft.com/office/drawing/2016/5/13/chartex" xmlns:cx8="http://schemas.microsoft.com/office/drawing/2016/5/14/chartex" xmlns:mc="http://schemas.openxmlformats.org/markup-compatibility/2006" xmlns:aink="http://schemas.microsoft.com/office/drawing/2016/ink" xmlns:am3d="http://schemas.microsoft.com/office/drawing/2017/model3d" xmlns:o="urn:schemas-microsoft-com:office:office" xmlns:oel="http://schemas.microsoft.com/office/2019/extlst" xmlns:r="http://schemas.openxmlformats.org/officeDocument/2006/relationships" xmlns:m="http://schemas.openxmlformats.org/officeDocument/2006/math" xmlns:v="urn:schemas-microsoft-com:vml" xmlns:wp14="http://schemas.microsoft.com/office/word/2010/wordprocessingDrawing" xmlns:wp="http://schemas.openxmlformats.org/drawingml/2006/wordprocessingDrawing" xmlns:w10="urn:schemas-microsoft-com:office:word" xmlns:w="http://schemas.openxmlformats.org/wordprocessingml/2006/main" xmlns:w14="http://schemas.microsoft.com/office/word/2010/wordml" xmlns:w15="http://schemas.microsoft.com/office/word/2012/wordml" xmlns:w16cex="http://schemas.microsoft.com/office/word/2018/wordml/cex" xmlns:w16cid="http://schemas.microsoft.com/office/word/2016/wordml/cid" xmlns:w16="http://schemas.microsoft.com/office/word/2018/wordml" xmlns:w16du="http://schemas.microsoft.com/office/word/2023/wordml/word16du" xmlns:w16sdtdh="http://schemas.microsoft.com/office/word/2020/wordml/sdtdatahash" xmlns:w16sdtfl="http://schemas.microsoft.com/office/word/2024/wordml/sdtformatlock" xmlns:w16se="http://schemas.microsoft.com/office/word/2015/wordml/symex" xmlns:wpg="http://schemas.microsoft.com/office/word/2010/wordprocessingGroup" xmlns:wpi="http://schemas.microsoft.com/office/word/2010/wordprocessingInk" xmlns:wne="http://schemas.microsoft.com/office/word/2006/wordml" xmlns:wps="http://schemas.microsoft.com/office/word/2010/wordprocessingShape" mc:Ignorable="w14 w15 w16se w16cid w16 w16cex w16sdtdh w16sdtfl w16du wp14">
   <w:p>
     <w:pPr>
@@ -6453,6 +6749,95 @@
     </w:lvl>
   </w:abstractNum>
   <w:abstractNum w:abstractNumId="1" w15:restartNumberingAfterBreak="0">
+    <w:nsid w:val="124B76C0"/>
+    <w:multiLevelType w:val="hybridMultilevel"/>
+    <w:tmpl w:val="1E9C9C40"/>
+    <w:lvl w:ilvl="0" w:tplc="0407000F">
+      <w:start w:val="1"/>
+      <w:numFmt w:val="decimal"/>
+      <w:lvlText w:val="%1."/>
+      <w:lvlJc w:val="left"/>
+      <w:pPr>
+        <w:ind w:left="720" w:hanging="360"/>
+      </w:pPr>
+      <w:rPr>
+        <w:rFonts w:hint="default"/>
+      </w:rPr>
+    </w:lvl>
+    <w:lvl w:ilvl="1" w:tplc="04070019" w:tentative="1">
+      <w:start w:val="1"/>
+      <w:numFmt w:val="lowerLetter"/>
+      <w:lvlText w:val="%2."/>
+      <w:lvlJc w:val="left"/>
+      <w:pPr>
+        <w:ind w:left="1440" w:hanging="360"/>
+      </w:pPr>
+    </w:lvl>
+    <w:lvl w:ilvl="2" w:tplc="0407001B" w:tentative="1">
+      <w:start w:val="1"/>
+      <w:numFmt w:val="lowerRoman"/>
+      <w:lvlText w:val="%3."/>
+      <w:lvlJc w:val="right"/>
+      <w:pPr>
+        <w:ind w:left="2160" w:hanging="180"/>
+      </w:pPr>
+    </w:lvl>
+    <w:lvl w:ilvl="3" w:tplc="0407000F" w:tentative="1">
+      <w:start w:val="1"/>
+      <w:numFmt w:val="decimal"/>
+      <w:lvlText w:val="%4."/>
+      <w:lvlJc w:val="left"/>
+      <w:pPr>
+        <w:ind w:left="2880" w:hanging="360"/>
+      </w:pPr>
+    </w:lvl>
+    <w:lvl w:ilvl="4" w:tplc="04070019" w:tentative="1">
+      <w:start w:val="1"/>
+      <w:numFmt w:val="lowerLetter"/>
+      <w:lvlText w:val="%5."/>
+      <w:lvlJc w:val="left"/>
+      <w:pPr>
+        <w:ind w:left="3600" w:hanging="360"/>
+      </w:pPr>
+    </w:lvl>
+    <w:lvl w:ilvl="5" w:tplc="0407001B" w:tentative="1">
+      <w:start w:val="1"/>
+      <w:numFmt w:val="lowerRoman"/>
+      <w:lvlText w:val="%6."/>
+      <w:lvlJc w:val="right"/>
+      <w:pPr>
+        <w:ind w:left="4320" w:hanging="180"/>
+      </w:pPr>
+    </w:lvl>
+    <w:lvl w:ilvl="6" w:tplc="0407000F" w:tentative="1">
+      <w:start w:val="1"/>
+      <w:numFmt w:val="decimal"/>
+      <w:lvlText w:val="%7."/>
+      <w:lvlJc w:val="left"/>
+      <w:pPr>
+        <w:ind w:left="5040" w:hanging="360"/>
+      </w:pPr>
+    </w:lvl>
+    <w:lvl w:ilvl="7" w:tplc="04070019" w:tentative="1">
+      <w:start w:val="1"/>
+      <w:numFmt w:val="lowerLetter"/>
+      <w:lvlText w:val="%8."/>
+      <w:lvlJc w:val="left"/>
+      <w:pPr>
+        <w:ind w:left="5760" w:hanging="360"/>
+      </w:pPr>
+    </w:lvl>
+    <w:lvl w:ilvl="8" w:tplc="0407001B" w:tentative="1">
+      <w:start w:val="1"/>
+      <w:numFmt w:val="lowerRoman"/>
+      <w:lvlText w:val="%9."/>
+      <w:lvlJc w:val="right"/>
+      <w:pPr>
+        <w:ind w:left="6480" w:hanging="180"/>
+      </w:pPr>
+    </w:lvl>
+  </w:abstractNum>
+  <w:abstractNum w:abstractNumId="2" w15:restartNumberingAfterBreak="0">
     <w:nsid w:val="491E4044"/>
     <w:multiLevelType w:val="multilevel"/>
     <w:tmpl w:val="716CD810"/>
@@ -6538,8 +6923,94 @@
       </w:pPr>
     </w:lvl>
   </w:abstractNum>
+  <w:abstractNum w:abstractNumId="3" w15:restartNumberingAfterBreak="0">
+    <w:nsid w:val="586E389E"/>
+    <w:multiLevelType w:val="hybridMultilevel"/>
+    <w:tmpl w:val="967C81A4"/>
+    <w:lvl w:ilvl="0" w:tplc="0407000F">
+      <w:start w:val="1"/>
+      <w:numFmt w:val="decimal"/>
+      <w:lvlText w:val="%1."/>
+      <w:lvlJc w:val="left"/>
+      <w:pPr>
+        <w:ind w:left="720" w:hanging="360"/>
+      </w:pPr>
+    </w:lvl>
+    <w:lvl w:ilvl="1" w:tplc="04070019" w:tentative="1">
+      <w:start w:val="1"/>
+      <w:numFmt w:val="lowerLetter"/>
+      <w:lvlText w:val="%2."/>
+      <w:lvlJc w:val="left"/>
+      <w:pPr>
+        <w:ind w:left="1440" w:hanging="360"/>
+      </w:pPr>
+    </w:lvl>
+    <w:lvl w:ilvl="2" w:tplc="0407001B" w:tentative="1">
+      <w:start w:val="1"/>
+      <w:numFmt w:val="lowerRoman"/>
+      <w:lvlText w:val="%3."/>
+      <w:lvlJc w:val="right"/>
+      <w:pPr>
+        <w:ind w:left="2160" w:hanging="180"/>
+      </w:pPr>
+    </w:lvl>
+    <w:lvl w:ilvl="3" w:tplc="0407000F" w:tentative="1">
+      <w:start w:val="1"/>
+      <w:numFmt w:val="decimal"/>
+      <w:lvlText w:val="%4."/>
+      <w:lvlJc w:val="left"/>
+      <w:pPr>
+        <w:ind w:left="2880" w:hanging="360"/>
+      </w:pPr>
+    </w:lvl>
+    <w:lvl w:ilvl="4" w:tplc="04070019" w:tentative="1">
+      <w:start w:val="1"/>
+      <w:numFmt w:val="lowerLetter"/>
+      <w:lvlText w:val="%5."/>
+      <w:lvlJc w:val="left"/>
+      <w:pPr>
+        <w:ind w:left="3600" w:hanging="360"/>
+      </w:pPr>
+    </w:lvl>
+    <w:lvl w:ilvl="5" w:tplc="0407001B" w:tentative="1">
+      <w:start w:val="1"/>
+      <w:numFmt w:val="lowerRoman"/>
+      <w:lvlText w:val="%6."/>
+      <w:lvlJc w:val="right"/>
+      <w:pPr>
+        <w:ind w:left="4320" w:hanging="180"/>
+      </w:pPr>
+    </w:lvl>
+    <w:lvl w:ilvl="6" w:tplc="0407000F" w:tentative="1">
+      <w:start w:val="1"/>
+      <w:numFmt w:val="decimal"/>
+      <w:lvlText w:val="%7."/>
+      <w:lvlJc w:val="left"/>
+      <w:pPr>
+        <w:ind w:left="5040" w:hanging="360"/>
+      </w:pPr>
+    </w:lvl>
+    <w:lvl w:ilvl="7" w:tplc="04070019" w:tentative="1">
+      <w:start w:val="1"/>
+      <w:numFmt w:val="lowerLetter"/>
+      <w:lvlText w:val="%8."/>
+      <w:lvlJc w:val="left"/>
+      <w:pPr>
+        <w:ind w:left="5760" w:hanging="360"/>
+      </w:pPr>
+    </w:lvl>
+    <w:lvl w:ilvl="8" w:tplc="0407001B" w:tentative="1">
+      <w:start w:val="1"/>
+      <w:numFmt w:val="lowerRoman"/>
+      <w:lvlText w:val="%9."/>
+      <w:lvlJc w:val="right"/>
+      <w:pPr>
+        <w:ind w:left="6480" w:hanging="180"/>
+      </w:pPr>
+    </w:lvl>
+  </w:abstractNum>
   <w:num w:numId="1" w16cid:durableId="1108544732">
-    <w:abstractNumId w:val="1"/>
+    <w:abstractNumId w:val="2"/>
   </w:num>
   <w:num w:numId="2" w16cid:durableId="1600674842">
     <w:abstractNumId w:val="0"/>
@@ -6570,6 +7041,12 @@
     <w:lvlOverride w:ilvl="8">
       <w:startOverride w:val="1"/>
     </w:lvlOverride>
+  </w:num>
+  <w:num w:numId="3" w16cid:durableId="2091197844">
+    <w:abstractNumId w:val="3"/>
+  </w:num>
+  <w:num w:numId="4" w16cid:durableId="1711570569">
+    <w:abstractNumId w:val="1"/>
   </w:num>
 </w:numbering>
 </file>
@@ -7165,7 +7642,6 @@
   <w:style w:type="character" w:default="1" w:styleId="Absatz-Standardschriftart">
     <w:name w:val="Default Paragraph Font"/>
     <w:uiPriority w:val="1"/>
-    <w:semiHidden/>
     <w:unhideWhenUsed/>
   </w:style>
   <w:style w:type="table" w:default="1" w:styleId="NormaleTabelle">
@@ -19128,28 +19604,28 @@
 </file>
 
 <file path=customXml/item1.xml><?xml version="1.0" encoding="utf-8"?>
+<b:Sources xmlns:b="http://schemas.openxmlformats.org/officeDocument/2006/bibliography" xmlns="http://schemas.openxmlformats.org/officeDocument/2006/bibliography" SelectedStyle="\APASixthEditionOfficeOnline.xsl" StyleName="APA" Version="6"/>
+</file>
+
+<file path=customXml/item2.xml><?xml version="1.0" encoding="utf-8"?>
 <go:gDocsCustomXmlDataStorage xmlns:go="http://customooxmlschemas.google.com/" xmlns:r="http://schemas.openxmlformats.org/officeDocument/2006/relationships" uri="GoogleDocsCustomDataVersion2">
   <go:docsCustomData xmlns:go="http://customooxmlschemas.google.com/" roundtripDataSignature="AMtx7mg5dQNf+GrM5QqtiyvkGamQEiahOA==">CgMxLjAyDmguczluaWhzaHVodnBlMg5oLnByeTh4dzYxY3pwYTIOaC5yOGNzOG84M29mNzQyDWguZjVnZ2xoMG5iMWoyDmgueHZ2bmRraGwydTQ0Mg5oLmI5eXY2bzd2dDQ2dDIOaC51ZjN1MHgxN3AwMGEyDmguZDE0NGt0amFnbjRkMg1oLm9zZHFsdGQ2cDVkMg5oLjJ3cXA1amd0dDlpczIOaC5rYm1wem1jemtta284AHIhMVFoNGN6UGhIYVd2ZHF5UFh1dmhHVGNXMFZUSi0wYTkx</go:docsCustomData>
 </go:gDocsCustomXmlDataStorage>
 </file>
 
-<file path=customXml/item2.xml><?xml version="1.0" encoding="utf-8"?>
-<b:Sources xmlns:b="http://schemas.openxmlformats.org/officeDocument/2006/bibliography" xmlns="http://schemas.openxmlformats.org/officeDocument/2006/bibliography" SelectedStyle="\APASixthEditionOfficeOnline.xsl" StyleName="APA" Version="6"/>
+<file path=customXml/itemProps1.xml><?xml version="1.0" encoding="utf-8"?>
+<ds:datastoreItem xmlns:ds="http://schemas.openxmlformats.org/officeDocument/2006/customXml" ds:itemID="{07159F60-2AE0-440E-BF63-3A172B73330C}">
+  <ds:schemaRefs>
+    <ds:schemaRef ds:uri="http://schemas.openxmlformats.org/officeDocument/2006/bibliography"/>
+  </ds:schemaRefs>
+</ds:datastoreItem>
 </file>
 
-<file path=customXml/itemProps1.xml><?xml version="1.0" encoding="utf-8"?>
+<file path=customXml/itemProps2.xml><?xml version="1.0" encoding="utf-8"?>
 <ds:datastoreItem xmlns:ds="http://schemas.openxmlformats.org/officeDocument/2006/customXml" ds:itemID="{11111111-1234-1234-1234-123412341234}">
   <ds:schemaRefs>
     <ds:schemaRef ds:uri="http://customooxmlschemas.google.com/"/>
     <ds:schemaRef ds:uri="http://schemas.openxmlformats.org/officeDocument/2006/relationships"/>
   </ds:schemaRefs>
 </ds:datastoreItem>
-</file>
-
-<file path=customXml/itemProps2.xml><?xml version="1.0" encoding="utf-8"?>
-<ds:datastoreItem xmlns:ds="http://schemas.openxmlformats.org/officeDocument/2006/customXml" ds:itemID="{07159F60-2AE0-440E-BF63-3A172B73330C}">
-  <ds:schemaRefs>
-    <ds:schemaRef ds:uri="http://schemas.openxmlformats.org/officeDocument/2006/bibliography"/>
-  </ds:schemaRefs>
-</ds:datastoreItem>
 </file>
</xml_diff>